<commit_message>
Defence docs: authors, anti-AI text pass, screenshots; Gantt label and column width fixes
Co-Authored-By: Claude Sonnet 5.5 <noreply@anthropic.com>
</commit_message>
<xml_diff>
--- a/docs/Отчёт_Планировщик_экзаменов.docx
+++ b/docs/Отчёт_Планировщик_экзаменов.docx
@@ -50,7 +50,7 @@
     </w:p>
     <w:p>
       <w:pPr>
-        <w:spacing w:after="2400"/>
+        <w:spacing w:after="2000"/>
         <w:jc w:val="center"/>
       </w:pPr>
       <w:r>
@@ -73,7 +73,7 @@
           <w:sz w:val="28"/>
           <w:szCs w:val="28"/>
         </w:rPr>
-        <w:t xml:space="preserve">Выполнил: [ФИО]</w:t>
+        <w:t xml:space="preserve">Выполнили:</w:t>
       </w:r>
     </w:p>
     <w:p>
@@ -87,12 +87,26 @@
           <w:sz w:val="28"/>
           <w:szCs w:val="28"/>
         </w:rPr>
-        <w:t xml:space="preserve">Группа: [номер группы]</w:t>
-      </w:r>
-    </w:p>
-    <w:p>
-      <w:pPr>
-        <w:spacing w:after="1800"/>
+        <w:t xml:space="preserve">Дибривный Павел, группа ИСТ04</w:t>
+      </w:r>
+    </w:p>
+    <w:p>
+      <w:pPr>
+        <w:spacing w:after="240"/>
+        <w:jc w:val="right"/>
+      </w:pPr>
+      <w:r>
+        <w:rPr>
+          <w:rFonts w:ascii="Times New Roman" w:cs="Times New Roman" w:eastAsia="Times New Roman" w:hAnsi="Times New Roman"/>
+          <w:sz w:val="28"/>
+          <w:szCs w:val="28"/>
+        </w:rPr>
+        <w:t xml:space="preserve">Салазде Георгий, группа ИСТ03</w:t>
+      </w:r>
+    </w:p>
+    <w:p>
+      <w:pPr>
+        <w:spacing w:after="1500"/>
         <w:jc w:val="right"/>
       </w:pPr>
       <w:r>
@@ -688,7 +702,7 @@
           <w:sz w:val="28"/>
           <w:szCs w:val="28"/>
         </w:rPr>
-        <w:t xml:space="preserve">Цель проекта — разработать программу, которая помогает студенту подготовиться к экзаменам: пользователь вводит экзамены, их даты и темы с оценкой сложности, а программа распределяет, что нужно учить в каждый день, и пересчитывает план, если пользователь отстаёт. Результат должен быть показан наглядно — в виде диаграммы Ганта или календаря нагрузки.</w:t>
+        <w:t xml:space="preserve">Нужно было сделать программу для подготовки к экзаменам. Пользователь вводит экзамены, даты и темы с оценкой сложности. Программа сама решает, что учить в каждый день, а если человек отстаёт, пересчитывает план. Результат показывается в виде диаграммы Ганта или календаря нагрузки.</w:t>
       </w:r>
     </w:p>
     <w:p>
@@ -703,7 +717,7 @@
           <w:sz w:val="28"/>
           <w:szCs w:val="28"/>
         </w:rPr>
-        <w:t xml:space="preserve">Требования к проекту:</w:t>
+        <w:t xml:space="preserve">Требования из задания:</w:t>
       </w:r>
     </w:p>
     <w:p>
@@ -722,7 +736,7 @@
           <w:sz w:val="28"/>
           <w:szCs w:val="28"/>
         </w:rPr>
-        <w:t xml:space="preserve">язык Python, использование только материала, пройденного на курсе;</w:t>
+        <w:t xml:space="preserve">писать на Python и брать только то, что прошли на курсе;</w:t>
       </w:r>
     </w:p>
     <w:p>
@@ -741,7 +755,7 @@
           <w:sz w:val="28"/>
           <w:szCs w:val="28"/>
         </w:rPr>
-        <w:t xml:space="preserve">обязательные инструменты: обработка ошибок, словари, объектно-ориентированное программирование (ООП);</w:t>
+        <w:t xml:space="preserve">обязательно использовать обработку ошибок, словари и ООП;</w:t>
       </w:r>
     </w:p>
     <w:p>
@@ -760,7 +774,7 @@
           <w:sz w:val="28"/>
           <w:szCs w:val="28"/>
         </w:rPr>
-        <w:t xml:space="preserve">четвёртый критерий — визуализация (окно tkinter, график и т. п.);</w:t>
+        <w:t xml:space="preserve">четвёртым критерием добавить визуализацию (окно tkinter, график и т. п.);</w:t>
       </w:r>
     </w:p>
     <w:p>
@@ -779,7 +793,7 @@
           <w:sz w:val="28"/>
           <w:szCs w:val="28"/>
         </w:rPr>
-        <w:t xml:space="preserve">для хранения данных — база данных, а при её отсутствии — файлы CSV или словари.</w:t>
+        <w:t xml:space="preserve">хранить данные в базе, а если базы нет, то в CSV-файлах или словарях.</w:t>
       </w:r>
     </w:p>
     <w:p>
@@ -794,7 +808,7 @@
           <w:sz w:val="28"/>
           <w:szCs w:val="28"/>
         </w:rPr>
-        <w:t xml:space="preserve">Дополнительно к заданию реализованы контрольные работы (несколько тем на одну дату), автоматический подбор сложности темы, выпадающие списки типовых предметов и тем, а также автоматические тесты.</w:t>
+        <w:t xml:space="preserve">Сверх задания мы сделали контрольные работы (несколько тем на одну дату), автоподбор сложности по названию темы, выпадающие списки с типовыми предметами и темами и автотесты.</w:t>
       </w:r>
     </w:p>
     <w:p>
@@ -892,7 +906,7 @@
                 <w:sz w:val="24"/>
                 <w:szCs w:val="24"/>
               </w:rPr>
-              <w:t xml:space="preserve">Для чего использован</w:t>
+              <w:t xml:space="preserve">Для чего нужен</w:t>
             </w:r>
           </w:p>
         </w:tc>
@@ -952,7 +966,7 @@
                 <w:sz w:val="24"/>
                 <w:szCs w:val="24"/>
               </w:rPr>
-              <w:t xml:space="preserve">основной язык программирования; проект работает на версии 3.9 и новее</w:t>
+              <w:t xml:space="preserve">основной язык; проект работает на версии 3.9 и новее</w:t>
             </w:r>
           </w:p>
         </w:tc>
@@ -1192,7 +1206,7 @@
                 <w:sz w:val="24"/>
                 <w:szCs w:val="24"/>
               </w:rPr>
-              <w:t xml:space="preserve">работа с датами, построение сетки календаря на месяц</w:t>
+              <w:t xml:space="preserve">даты и сетка календаря на месяц</w:t>
             </w:r>
           </w:p>
         </w:tc>
@@ -1312,7 +1326,7 @@
                 <w:sz w:val="24"/>
                 <w:szCs w:val="24"/>
               </w:rPr>
-              <w:t xml:space="preserve">хранение истории изменений проекта</w:t>
+              <w:t xml:space="preserve">история изменений проекта</w:t>
             </w:r>
           </w:p>
         </w:tc>
@@ -1335,7 +1349,7 @@
           <w:sz w:val="28"/>
           <w:szCs w:val="28"/>
         </w:rPr>
-        <w:t xml:space="preserve">Сторонние пакеты для работы программы не нужны — используется только стандартная библиотека Python. Пакет pytest нужен только для запуска тестов.</w:t>
+        <w:t xml:space="preserve">Для запуска программы сторонние пакеты не нужны, хватает стандартной библиотеки Python. pytest ставится отдельно и нужен только для тестов.</w:t>
       </w:r>
     </w:p>
     <w:p>
@@ -1369,7 +1383,7 @@
           <w:sz w:val="28"/>
           <w:szCs w:val="28"/>
         </w:rPr>
-        <w:t xml:space="preserve">Программа разделена на логику (папка planner) и интерфейс (папка ui). Логика ничего не знает про окно, поэтому её можно проверять автоматическими тестами без запуска интерфейса.</w:t>
+        <w:t xml:space="preserve">Код мы разделили на две части: логика лежит в папке planner, окно в папке ui. Логика ничего не знает про окно, поэтому тесты проверяют её без запуска интерфейса.</w:t>
       </w:r>
     </w:p>
     <w:p>
@@ -1737,7 +1751,7 @@
           <w:sz w:val="28"/>
           <w:szCs w:val="28"/>
         </w:rPr>
-        <w:t xml:space="preserve">Пользователь выбирает предмет из выпадающего списка (или вводит своё название), указывает дату в формате ДД.ММ.ГГГГ и тип события — «Экзамен» или «Контрольная». У каждого события своя дата и свои темы. В списке событий показывается, сколько дней осталось. Дата должна быть в будущем, название не может быть пустым, одинаковые события не допускаются.</w:t>
+        <w:t xml:space="preserve">Предмет выбирается из выпадающего списка или вводится вручную. Дальше указываются дата в формате ДД.ММ.ГГГГ и тип: «Экзамен» или «Контрольная». У каждого события своя дата и свои темы. В списке видно, сколько дней осталось. Дата должна быть в будущем, название не может быть пустым, два одинаковых события добавить нельзя.</w:t>
       </w:r>
     </w:p>
     <w:p>
@@ -1771,7 +1785,7 @@
           <w:sz w:val="28"/>
           <w:szCs w:val="28"/>
         </w:rPr>
-        <w:t xml:space="preserve">После выбора события в списке тем появляются типовые темы этого предмета; уже добавленные в список не попадают. Тему можно ввести вручную, а кнопка «Несколько…» открывает окно, где можно отметить сразу много тем и дописать свои через запятую.</w:t>
+        <w:t xml:space="preserve">После выбора события в списке тем появляются типовые темы по этому предмету (те, что уже добавлены, из списка пропадают). Тему можно вписать самому. Кнопка «Несколько…» открывает окно, где отмечаются сразу много тем и дописываются свои через запятую.</w:t>
       </w:r>
     </w:p>
     <w:p>
@@ -1786,32 +1800,54 @@
           <w:sz w:val="28"/>
           <w:szCs w:val="28"/>
         </w:rPr>
-        <w:t xml:space="preserve">Сложность темы — число от 1 до 5, она же определяет число часов на тему. По умолчанию выбрано значение «авто»: программа определяет сложность по названию предмета и темы с помощью словарей (например, математика — 4, физкультура — 1, слово «введение» уменьшает сложность, слова «теорема» или «интеграл» увеличивают). Значение можно задать вручную или изменить у уже добавленной темы.</w:t>
+        <w:t xml:space="preserve">Сложность темы — число от 1 до 5, и она же задаёт число часов. По умолчанию стоит «авто»: программа оценивает сложность по названию предмета и темы с помощью словарей. Например, у математики базовая сложность 4, у физкультуры 1, слово «введение» её снижает, а «теорема» или «интеграл» повышают. Значение можно задать вручную или поменять у готовой темы.</w:t>
       </w:r>
     </w:p>
     <w:p>
       <w:pPr>
         <w:keepNext/>
-        <w:pBdr>
-          <w:top w:val="single" w:color="999999" w:sz="4"/>
-          <w:left w:val="single" w:color="999999" w:sz="4"/>
-          <w:bottom w:val="single" w:color="999999" w:sz="4"/>
-          <w:right w:val="single" w:color="999999" w:sz="4"/>
-        </w:pBdr>
-        <w:shd w:fill="F3F4F6" w:val="clear"/>
         <w:spacing w:after="60" w:before="120"/>
         <w:jc w:val="center"/>
       </w:pPr>
       <w:r>
-        <w:rPr>
-          <w:rFonts w:ascii="Times New Roman" w:cs="Times New Roman" w:eastAsia="Times New Roman" w:hAnsi="Times New Roman"/>
-          <w:i/>
-          <w:iCs/>
-          <w:color w:val="666666"/>
-          <w:sz w:val="24"/>
-          <w:szCs w:val="24"/>
-        </w:rPr>
-        <w:t xml:space="preserve">[Здесь будет скриншот: 03_dialog.png]</w:t>
+        <w:drawing>
+          <wp:inline distT="0" distB="0" distL="0" distR="0">
+            <wp:extent cx="3619500" cy="2419350"/>
+            <wp:effectExtent t="0" r="0" b="0" l="0"/>
+            <wp:docPr id="1" name="03_dialog.png" descr="Окно добавления нескольких тем" title="Окно добавления нескольких тем"/>
+            <wp:cNvGraphicFramePr>
+              <a:graphicFrameLocks xmlns:a="http://schemas.openxmlformats.org/drawingml/2006/main" noChangeAspect="1"/>
+            </wp:cNvGraphicFramePr>
+            <a:graphic xmlns:a="http://schemas.openxmlformats.org/drawingml/2006/main">
+              <a:graphicData uri="http://schemas.openxmlformats.org/drawingml/2006/picture">
+                <pic:pic xmlns:pic="http://schemas.openxmlformats.org/drawingml/2006/picture">
+                  <pic:nvPicPr>
+                    <pic:cNvPr id="0" name="" descr=""/>
+                    <pic:cNvPicPr>
+                      <a:picLocks noChangeAspect="1" noChangeArrowheads="1"/>
+                    </pic:cNvPicPr>
+                  </pic:nvPicPr>
+                  <pic:blipFill>
+                    <a:blip r:embed="rId8" cstate="none"/>
+                    <a:srcRect/>
+                    <a:stretch>
+                      <a:fillRect/>
+                    </a:stretch>
+                  </pic:blipFill>
+                  <pic:spPr bwMode="auto">
+                    <a:xfrm>
+                      <a:off x="0" y="0"/>
+                      <a:ext cx="3619500" cy="2419350"/>
+                    </a:xfrm>
+                    <a:prstGeom prst="rect">
+                      <a:avLst/>
+                    </a:prstGeom>
+                  </pic:spPr>
+                </pic:pic>
+              </a:graphicData>
+            </a:graphic>
+          </wp:inline>
+        </w:drawing>
       </w:r>
     </w:p>
     <w:p>
@@ -1859,7 +1895,7 @@
           <w:sz w:val="28"/>
           <w:szCs w:val="28"/>
         </w:rPr>
-        <w:t xml:space="preserve">План строится автоматически после каждого изменения. Правила распределения:</w:t>
+        <w:t xml:space="preserve">План пересобирается после каждого изменения. Правила такие:</w:t>
       </w:r>
     </w:p>
     <w:p>
@@ -1878,7 +1914,7 @@
           <w:sz w:val="28"/>
           <w:szCs w:val="28"/>
         </w:rPr>
-        <w:t xml:space="preserve">число часов на тему равно её сложности;</w:t>
+        <w:t xml:space="preserve">часов на тему столько же, какова её сложность;</w:t>
       </w:r>
     </w:p>
     <w:p>
@@ -1897,7 +1933,7 @@
           <w:sz w:val="28"/>
           <w:szCs w:val="28"/>
         </w:rPr>
-        <w:t xml:space="preserve">в один день планируется не больше заданного числа часов (по умолчанию 4) и не больше 2 часов одной темы — поэтому большая тема растягивается на несколько дней по 1–2 часа;</w:t>
+        <w:t xml:space="preserve">в день ставится не больше заданного числа часов (по умолчанию 4) и не больше 2 часов одной темы, поэтому большая тема растягивается на несколько дней по 1–2 часа;</w:t>
       </w:r>
     </w:p>
     <w:p>
@@ -1916,7 +1952,7 @@
           <w:sz w:val="28"/>
           <w:szCs w:val="28"/>
         </w:rPr>
-        <w:t xml:space="preserve">первыми планируются самые сложные темы ближайшего по дате события;</w:t>
+        <w:t xml:space="preserve">первыми идут самые сложные темы ближайшего события;</w:t>
       </w:r>
     </w:p>
     <w:p>
@@ -1935,7 +1971,7 @@
           <w:sz w:val="28"/>
           <w:szCs w:val="28"/>
         </w:rPr>
-        <w:t xml:space="preserve">день перед экзаменом отводится на повторение (2 часа), перед контрольной — 1 час; в день события занятия не планируются;</w:t>
+        <w:t xml:space="preserve">день перед экзаменом отдан под повторение (2 часа), перед контрольной ставится 1 час, в день самого события занятий нет;</w:t>
       </w:r>
     </w:p>
     <w:p>
@@ -1954,7 +1990,7 @@
           <w:sz w:val="28"/>
           <w:szCs w:val="28"/>
         </w:rPr>
-        <w:t xml:space="preserve">если темы не помещаются до срока, программа не перегружает дни, а предупреждает, какие темы под угрозой.</w:t>
+        <w:t xml:space="preserve">если темы не помещаются в срок, дни не перегружаются: программа показывает, какие темы под угрозой.</w:t>
       </w:r>
     </w:p>
     <w:p>
@@ -1988,7 +2024,7 @@
           <w:sz w:val="28"/>
           <w:szCs w:val="28"/>
         </w:rPr>
-        <w:t xml:space="preserve">Если пользователь отстаёт, он нажимает «Перепланировать». Для каждой темы запоминается день, на который она была запланирована. Невыполненные темы, день которых уже прошёл, планируются заново, начиная с сегодняшнего дня; программа показывает, что было перенесено, и предупреждает о темах, которые уже не помещаются. Выполненные темы отмечаются кнопкой «Готово» и в плане больше не участвуют.</w:t>
+        <w:t xml:space="preserve">Если вы отстали, нажмите «Перепланировать». Для каждой темы мы запоминаем день, на который её поставили. Невыполненные темы с прошедшим днём планируются заново с сегодняшнего дня. Программа пишет, что перенесла, и предупреждает о темах, которые уже не успеть. Выполненные темы отмечаются кнопкой «Готово» и в плане больше не участвуют.</w:t>
       </w:r>
     </w:p>
     <w:p>
@@ -2022,32 +2058,54 @@
           <w:sz w:val="28"/>
           <w:szCs w:val="28"/>
         </w:rPr>
-        <w:t xml:space="preserve">Календарь нагрузки показывает месяц; цвет клетки отражает загрузку дня (от серого — свободно до оранжевого — лимит часов), экзамены отмечены красным, контрольные — фиолетовым. По щелчку на день внизу показываются темы этого дня и часы.</w:t>
+        <w:t xml:space="preserve">Календарь показывает месяц. Цвет клетки зависит от загрузки: от серого (свободно) до оранжевого (дошли до лимита часов). Экзамены красные, контрольные фиолетовые. Если нажать на день, внизу появится список тем и часов на этот день.</w:t>
       </w:r>
     </w:p>
     <w:p>
       <w:pPr>
         <w:keepNext/>
-        <w:pBdr>
-          <w:top w:val="single" w:color="999999" w:sz="4"/>
-          <w:left w:val="single" w:color="999999" w:sz="4"/>
-          <w:bottom w:val="single" w:color="999999" w:sz="4"/>
-          <w:right w:val="single" w:color="999999" w:sz="4"/>
-        </w:pBdr>
-        <w:shd w:fill="F3F4F6" w:val="clear"/>
         <w:spacing w:after="60" w:before="120"/>
         <w:jc w:val="center"/>
       </w:pPr>
       <w:r>
-        <w:rPr>
-          <w:rFonts w:ascii="Times New Roman" w:cs="Times New Roman" w:eastAsia="Times New Roman" w:hAnsi="Times New Roman"/>
-          <w:i/>
-          <w:iCs/>
-          <w:color w:val="666666"/>
-          <w:sz w:val="24"/>
-          <w:szCs w:val="24"/>
-        </w:rPr>
-        <w:t xml:space="preserve">[Здесь будет скриншот: 01_calendar.png]</w:t>
+        <w:drawing>
+          <wp:inline distT="0" distB="0" distL="0" distR="0">
+            <wp:extent cx="5334000" cy="3467100"/>
+            <wp:effectExtent t="0" r="0" b="0" l="0"/>
+            <wp:docPr id="2" name="01_calendar.png" descr="Календарь нагрузки" title="Календарь нагрузки"/>
+            <wp:cNvGraphicFramePr>
+              <a:graphicFrameLocks xmlns:a="http://schemas.openxmlformats.org/drawingml/2006/main" noChangeAspect="1"/>
+            </wp:cNvGraphicFramePr>
+            <a:graphic xmlns:a="http://schemas.openxmlformats.org/drawingml/2006/main">
+              <a:graphicData uri="http://schemas.openxmlformats.org/drawingml/2006/picture">
+                <pic:pic xmlns:pic="http://schemas.openxmlformats.org/drawingml/2006/picture">
+                  <pic:nvPicPr>
+                    <pic:cNvPr id="0" name="" descr=""/>
+                    <pic:cNvPicPr>
+                      <a:picLocks noChangeAspect="1" noChangeArrowheads="1"/>
+                    </pic:cNvPicPr>
+                  </pic:nvPicPr>
+                  <pic:blipFill>
+                    <a:blip r:embed="rId9" cstate="none"/>
+                    <a:srcRect/>
+                    <a:stretch>
+                      <a:fillRect/>
+                    </a:stretch>
+                  </pic:blipFill>
+                  <pic:spPr bwMode="auto">
+                    <a:xfrm>
+                      <a:off x="0" y="0"/>
+                      <a:ext cx="5334000" cy="3467100"/>
+                    </a:xfrm>
+                    <a:prstGeom prst="rect">
+                      <a:avLst/>
+                    </a:prstGeom>
+                  </pic:spPr>
+                </pic:pic>
+              </a:graphicData>
+            </a:graphic>
+          </wp:inline>
+        </w:drawing>
       </w:r>
     </w:p>
     <w:p>
@@ -2076,32 +2134,54 @@
           <w:sz w:val="28"/>
           <w:szCs w:val="28"/>
         </w:rPr>
-        <w:t xml:space="preserve">Диаграмма Ганта нарисована на tkinter Canvas: каждая тема — полоска от первого до последнего дня занятий, полоски сгруппированы по событиям. Вертикальные линии отмечают даты экзаменов и контрольных, пунктирная линия — сегодняшний день. Выполненные темы и темы, которые не помещаются до срока, показаны отдельными строками.</w:t>
+        <w:t xml:space="preserve">Диаграмму Ганта мы нарисовали на tkinter Canvas. Каждая тема — полоска от первого до последнего дня занятий, полоски сгруппированы по событиям. Вертикальные линии отмечают даты экзаменов и контрольных, пунктирная — сегодняшний день. Выполненные темы и темы, которые не успеть, показаны отдельными строками.</w:t>
       </w:r>
     </w:p>
     <w:p>
       <w:pPr>
         <w:keepNext/>
-        <w:pBdr>
-          <w:top w:val="single" w:color="999999" w:sz="4"/>
-          <w:left w:val="single" w:color="999999" w:sz="4"/>
-          <w:bottom w:val="single" w:color="999999" w:sz="4"/>
-          <w:right w:val="single" w:color="999999" w:sz="4"/>
-        </w:pBdr>
-        <w:shd w:fill="F3F4F6" w:val="clear"/>
         <w:spacing w:after="60" w:before="120"/>
         <w:jc w:val="center"/>
       </w:pPr>
       <w:r>
-        <w:rPr>
-          <w:rFonts w:ascii="Times New Roman" w:cs="Times New Roman" w:eastAsia="Times New Roman" w:hAnsi="Times New Roman"/>
-          <w:i/>
-          <w:iCs/>
-          <w:color w:val="666666"/>
-          <w:sz w:val="24"/>
-          <w:szCs w:val="24"/>
-        </w:rPr>
-        <w:t xml:space="preserve">[Здесь будет скриншот: 02_gantt.png]</w:t>
+        <w:drawing>
+          <wp:inline distT="0" distB="0" distL="0" distR="0">
+            <wp:extent cx="5334000" cy="3467100"/>
+            <wp:effectExtent t="0" r="0" b="0" l="0"/>
+            <wp:docPr id="3" name="02_gantt.png" descr="Диаграмма Ганта" title="Диаграмма Ганта"/>
+            <wp:cNvGraphicFramePr>
+              <a:graphicFrameLocks xmlns:a="http://schemas.openxmlformats.org/drawingml/2006/main" noChangeAspect="1"/>
+            </wp:cNvGraphicFramePr>
+            <a:graphic xmlns:a="http://schemas.openxmlformats.org/drawingml/2006/main">
+              <a:graphicData uri="http://schemas.openxmlformats.org/drawingml/2006/picture">
+                <pic:pic xmlns:pic="http://schemas.openxmlformats.org/drawingml/2006/picture">
+                  <pic:nvPicPr>
+                    <pic:cNvPr id="0" name="" descr=""/>
+                    <pic:cNvPicPr>
+                      <a:picLocks noChangeAspect="1" noChangeArrowheads="1"/>
+                    </pic:cNvPicPr>
+                  </pic:nvPicPr>
+                  <pic:blipFill>
+                    <a:blip r:embed="rId10" cstate="none"/>
+                    <a:srcRect/>
+                    <a:stretch>
+                      <a:fillRect/>
+                    </a:stretch>
+                  </pic:blipFill>
+                  <pic:spPr bwMode="auto">
+                    <a:xfrm>
+                      <a:off x="0" y="0"/>
+                      <a:ext cx="5334000" cy="3467100"/>
+                    </a:xfrm>
+                    <a:prstGeom prst="rect">
+                      <a:avLst/>
+                    </a:prstGeom>
+                  </pic:spPr>
+                </pic:pic>
+              </a:graphicData>
+            </a:graphic>
+          </wp:inline>
+        </w:drawing>
       </w:r>
     </w:p>
     <w:p>
@@ -2149,7 +2229,7 @@
           <w:sz w:val="28"/>
           <w:szCs w:val="28"/>
         </w:rPr>
-        <w:t xml:space="preserve">Данные сохраняются автоматически после каждого изменения в три CSV-файла папки data: exams.csv (события), topics.csv (темы) и settings.csv (лимиты часов). Файлы записываются через временный файл, поэтому сбой не оставит наполовину записанный файл. Если файл повреждён, программа не падает: она переименовывает его в .bak, сообщает об этом пользователю и начинает с пустого плана.</w:t>
+        <w:t xml:space="preserve">Данные сохраняются после каждого изменения в три CSV-файла в папке data: exams.csv (события), topics.csv (темы) и settings.csv (лимиты часов). Файл сначала пишется во временный, а потом подменяет старый, поэтому сбой посреди записи не оставит половину файла. Если файл повреждён, программа не падает: она переименовывает его в .bak, сообщает об этом и начинает с пустого плана.</w:t>
       </w:r>
     </w:p>
     <w:p>
@@ -2266,7 +2346,7 @@
                 <w:sz w:val="24"/>
                 <w:szCs w:val="24"/>
               </w:rPr>
-              <w:t xml:space="preserve">Назначение</w:t>
+              <w:t xml:space="preserve">Что делает</w:t>
             </w:r>
           </w:p>
         </w:tc>
@@ -2326,7 +2406,7 @@
                 <w:sz w:val="24"/>
                 <w:szCs w:val="24"/>
               </w:rPr>
-              <w:t xml:space="preserve">экзамен или контрольная: название, дата, тип; проверяет корректность данных</w:t>
+              <w:t xml:space="preserve">экзамен или контрольная: название, дата, тип; проверяет данные при создании</w:t>
             </w:r>
           </w:p>
         </w:tc>
@@ -2386,7 +2466,7 @@
                 <w:sz w:val="24"/>
                 <w:szCs w:val="24"/>
               </w:rPr>
-              <w:t xml:space="preserve">тема: событие, название, сложность 1–5, статус, день планирования; свойство hours — часы</w:t>
+              <w:t xml:space="preserve">тема: событие, название, сложность 1–5, статус, день планирования; свойство hours даёт часы</w:t>
             </w:r>
           </w:p>
         </w:tc>
@@ -2446,7 +2526,7 @@
                 <w:sz w:val="24"/>
                 <w:szCs w:val="24"/>
               </w:rPr>
-              <w:t xml:space="preserve">проверка и преобразование введённых значений; при ошибке выбрасывают ValidationError</w:t>
+              <w:t xml:space="preserve">проверяют и преобразуют введённые значения; при ошибке выбрасывают ValidationError</w:t>
             </w:r>
           </w:p>
         </w:tc>
@@ -2506,7 +2586,7 @@
                 <w:sz w:val="24"/>
                 <w:szCs w:val="24"/>
               </w:rPr>
-              <w:t xml:space="preserve">добавление события и темы с проверками (дата в будущем, повторы, существование события)</w:t>
+              <w:t xml:space="preserve">добавляют событие и тему с проверками (дата в будущем, повторы, существует ли событие)</w:t>
             </w:r>
           </w:p>
         </w:tc>
@@ -2566,7 +2646,7 @@
                 <w:sz w:val="24"/>
                 <w:szCs w:val="24"/>
               </w:rPr>
-              <w:t xml:space="preserve">удаление события вместе с его темами / удаление темы</w:t>
+              <w:t xml:space="preserve">удаляют событие вместе с темами или одну тему</w:t>
             </w:r>
           </w:p>
         </w:tc>
@@ -2626,7 +2706,7 @@
                 <w:sz w:val="24"/>
                 <w:szCs w:val="24"/>
               </w:rPr>
-              <w:t xml:space="preserve">изменение сложности темы (в том числе «авто») и статуса «готово»</w:t>
+              <w:t xml:space="preserve">меняют сложность темы (в том числе на «авто») и статус «готово»</w:t>
             </w:r>
           </w:p>
         </w:tc>
@@ -2686,7 +2766,7 @@
                 <w:sz w:val="24"/>
                 <w:szCs w:val="24"/>
               </w:rPr>
-              <w:t xml:space="preserve">лимит часов в день и часов одной темы в день с проверкой диапазона</w:t>
+              <w:t xml:space="preserve">задают лимит часов в день и часов одной темы в день, проверяя диапазон</w:t>
             </w:r>
           </w:p>
         </w:tc>
@@ -2746,7 +2826,7 @@
                 <w:sz w:val="24"/>
                 <w:szCs w:val="24"/>
               </w:rPr>
-              <w:t xml:space="preserve">строит словарь плана {дата: [(событие, тема, часы)]}; возвращает темы, не поместившиеся в срок</w:t>
+              <w:t xml:space="preserve">строит словарь плана {дата: [(событие, тема, часы)]} и возвращает темы, не поместившиеся в срок</w:t>
             </w:r>
           </w:p>
         </w:tc>
@@ -2866,7 +2946,7 @@
                 <w:sz w:val="24"/>
                 <w:szCs w:val="24"/>
               </w:rPr>
-              <w:t xml:space="preserve">сумма часов за день — для цвета в календаре</w:t>
+              <w:t xml:space="preserve">считает сумму часов за день для цвета в календаре</w:t>
             </w:r>
           </w:p>
         </w:tc>
@@ -2926,7 +3006,7 @@
                 <w:sz w:val="24"/>
                 <w:szCs w:val="24"/>
               </w:rPr>
-              <w:t xml:space="preserve">сложность по названию предмета и темы с помощью словарей основ и поправок</w:t>
+              <w:t xml:space="preserve">оценивает сложность по названию предмета и темы с помощью словарей</w:t>
             </w:r>
           </w:p>
         </w:tc>
@@ -2986,7 +3066,7 @@
                 <w:sz w:val="24"/>
                 <w:szCs w:val="24"/>
               </w:rPr>
-              <w:t xml:space="preserve">списки предметов и типовых тем для выпадающих списков</w:t>
+              <w:t xml:space="preserve">отдают списки предметов и типовых тем для выпадающих списков</w:t>
             </w:r>
           </w:p>
         </w:tc>
@@ -3046,7 +3126,7 @@
                 <w:sz w:val="24"/>
                 <w:szCs w:val="24"/>
               </w:rPr>
-              <w:t xml:space="preserve">запись и чтение CSV; при повреждении файлов — копия .bak и пустой план</w:t>
+              <w:t xml:space="preserve">пишут и читают CSV; если файлы повреждены, делают копию .bak и начинают с пустого плана</w:t>
             </w:r>
           </w:p>
         </w:tc>
@@ -3106,7 +3186,7 @@
                 <w:sz w:val="24"/>
                 <w:szCs w:val="24"/>
               </w:rPr>
-              <w:t xml:space="preserve">готовит строки диаграммы Ганта: период каждой темы, выполненные и не поместившиеся темы</w:t>
+              <w:t xml:space="preserve">готовит строки диаграммы: период каждой темы, выполненные и не поместившиеся темы</w:t>
             </w:r>
           </w:p>
         </w:tc>
@@ -3166,7 +3246,7 @@
                 <w:sz w:val="24"/>
                 <w:szCs w:val="24"/>
               </w:rPr>
-              <w:t xml:space="preserve">сетка месяца, переход между месяцами, цвет клетки по нагрузке</w:t>
+              <w:t xml:space="preserve">дают сетку месяца, переход между месяцами и цвет клетки по нагрузке</w:t>
             </w:r>
           </w:p>
         </w:tc>
@@ -3226,7 +3306,7 @@
                 <w:sz w:val="24"/>
                 <w:szCs w:val="24"/>
               </w:rPr>
-              <w:t xml:space="preserve">главное окно, диаграмма Ганта на Canvas, диалог выбора нескольких тем</w:t>
+              <w:t xml:space="preserve">главное окно, диаграмма Ганта на Canvas и диалог выбора нескольких тем</w:t>
             </w:r>
           </w:p>
         </w:tc>
@@ -3286,7 +3366,7 @@
                 <w:sz w:val="24"/>
                 <w:szCs w:val="24"/>
               </w:rPr>
-              <w:t xml:space="preserve">собственные исключения: ошибки ввода и ошибки работы с файлами</w:t>
+              <w:t xml:space="preserve">наши исключения: ошибки ввода и ошибки работы с файлами</w:t>
             </w:r>
           </w:p>
         </w:tc>
@@ -3328,7 +3408,7 @@
           <w:sz w:val="28"/>
           <w:szCs w:val="28"/>
         </w:rPr>
-        <w:t xml:space="preserve">Метод build_plan работает по шагам. Сначала собирается множество закрытых дней — дни событий и дни перед ними. Затем на день перед каждым событием ставится повторение. После этого события обходятся по возрастанию даты, а темы каждого события — по убыванию сложности. Для каждой темы перебираются дни от сегодняшнего до последнего учебного дня (за два дня до события); в свободный день ставится порция часов, не больше свободного места в дне и не больше лимита на тему в день. Если часы кончились раньше срока, тема размещена; если нет — она добавляется в список «под угрозой».</w:t>
+        <w:t xml:space="preserve">Метод build_plan работает так. Сначала собираются закрытые для учёбы дни: дни событий и дни перед ними. На день перед каждым событием ставится повторение. Потом события обходятся по возрастанию даты, а темы внутри события по убыванию сложности. Для каждой темы перебираются дни от сегодняшнего до последнего учебного (за два дня до события). В свободный день ставится порция часов: не больше свободного места в дне и не больше лимита на одну тему. Хватило дней — тема размещена, не хватило — она попадает в список «под угрозой».</w:t>
       </w:r>
     </w:p>
     <w:p>
@@ -3493,7 +3573,7 @@
           <w:sz w:val="28"/>
           <w:szCs w:val="28"/>
         </w:rPr>
-        <w:t xml:space="preserve">План хранится в словаре: ключ — дата, значение — список кортежей (событие, тема, часы). Такая структура удобна и для календаря (сумма часов по ключу), и для диаграммы (первый и последний день темы).</w:t>
+        <w:t xml:space="preserve">План лежит в словаре: ключ — дата, значение — список кортежей (событие, тема, часы). Такая структура удобна и календарю (сумма часов по ключу), и диаграмме (первый и последний день темы).</w:t>
       </w:r>
     </w:p>
     <w:p>
@@ -3527,7 +3607,7 @@
           <w:sz w:val="28"/>
           <w:szCs w:val="28"/>
         </w:rPr>
-        <w:t xml:space="preserve">Функция estimate_difficulty использует два словаря. В первом хранится базовая сложность предмета по основе слова («математ» — 4, «литератур» — 2, «физкультур» — 1); для неизвестного предмета берётся 3. Во втором — поправки по словам в названии темы («введени» — минус 2, «основ» — минус 1, «теорем» — плюс 1). Результат ограничивается диапазоном от 1 до 5.</w:t>
+        <w:t xml:space="preserve">Функция estimate_difficulty использует два словаря. В первом лежит базовая сложность предмета по основе слова («математ» — 4, «литератур» — 2, «физкультур» — 1), для незнакомого предмета берётся 3. Во втором — поправки по словам в названии темы («введени» даёт минус 2, «основ» минус 1, «теорем» плюс 1). Итог ограничивается числами от 1 до 5.</w:t>
       </w:r>
     </w:p>
     <w:p>
@@ -3561,7 +3641,7 @@
           <w:sz w:val="28"/>
           <w:szCs w:val="28"/>
         </w:rPr>
-        <w:t xml:space="preserve">Все проверки ввода выбрасывают собственные исключения: ValidationError (неверная дата, пустое название, сложность вне диапазона, повтор) и StorageError (ошибка записи файла); оба наследуются от PlannerError. В окне действия пользователя выполняются в блоке try, а ошибка показывается понятным сообщением в диалоге — программа не завершается аварийно.</w:t>
+        <w:t xml:space="preserve">Проверки ввода выбрасывают наши собственные исключения: ValidationError (неверная дата, пустое название, сложность вне диапазона, повтор) и StorageError (не удалось записать файл). Оба наследуются от PlannerError. В окне действия выполняются внутри try, а ошибка показывается сообщением в диалоге, так что программа не вылетает.</w:t>
       </w:r>
     </w:p>
     <w:p>
@@ -3764,7 +3844,7 @@
                 <w:sz w:val="24"/>
                 <w:szCs w:val="24"/>
               </w:rPr>
-              <w:t xml:space="preserve">Как выполнено</w:t>
+              <w:t xml:space="preserve">Что сделано</w:t>
             </w:r>
           </w:p>
         </w:tc>
@@ -3824,7 +3904,7 @@
                 <w:sz w:val="24"/>
                 <w:szCs w:val="24"/>
               </w:rPr>
-              <w:t xml:space="preserve">собственные исключения, блоки try/except в окне и при работе с файлами, повреждённые файлы не ломают программу</w:t>
+              <w:t xml:space="preserve">собственные исключения, try/except в окне и при работе с файлами, битые файлы не ломают программу</w:t>
             </w:r>
           </w:p>
         </w:tc>
@@ -3944,7 +4024,7 @@
                 <w:sz w:val="24"/>
                 <w:szCs w:val="24"/>
               </w:rPr>
-              <w:t xml:space="preserve">классы Exam, Topic, Planner, Storage, App, GanttChart, MultiTopicDialog, иерархия исключений</w:t>
+              <w:t xml:space="preserve">классы Exam, Topic, Planner, Storage, App, GanttChart, MultiTopicDialog и иерархия исключений</w:t>
             </w:r>
           </w:p>
         </w:tc>
@@ -4064,7 +4144,7 @@
                 <w:sz w:val="24"/>
                 <w:szCs w:val="24"/>
               </w:rPr>
-              <w:t xml:space="preserve">файлы CSV (базы данных не использовались)</w:t>
+              <w:t xml:space="preserve">файлы CSV (базу данных не использовали)</w:t>
             </w:r>
           </w:p>
         </w:tc>
@@ -4095,7 +4175,7 @@
                 <w:sz w:val="24"/>
                 <w:szCs w:val="24"/>
               </w:rPr>
-              <w:t xml:space="preserve">Дополнительно</w:t>
+              <w:t xml:space="preserve">Сверх задания</w:t>
             </w:r>
           </w:p>
         </w:tc>
@@ -4124,7 +4204,7 @@
                 <w:sz w:val="24"/>
                 <w:szCs w:val="24"/>
               </w:rPr>
-              <w:t xml:space="preserve">автоматические тесты pytest, автоподбор сложности, контрольные работы, выпадающие списки</w:t>
+              <w:t xml:space="preserve">автотесты pytest, автоподбор сложности, контрольные работы, выпадающие списки</w:t>
             </w:r>
           </w:p>
         </w:tc>
@@ -4180,7 +4260,7 @@
           <w:sz w:val="28"/>
           <w:szCs w:val="28"/>
         </w:rPr>
-        <w:t xml:space="preserve">Логика проверена 70 автоматическими тестами pytest (папка tests). Они охватывают: неверные даты, сложность и лимиты; выполнение лимитов часов; день перед экзаменом только для повторения; распределение темы по дням; перепланирование; автоподбор сложности; списки предметов; чтение и запись CSV, в том числе повреждённых, неполных файлов и файлов с BOM. Запуск: pytest (результат — 70 passed).</w:t>
+        <w:t xml:space="preserve">Логику проверяют 70 автотестов на pytest (папка tests). Они смотрят, как программа реагирует на неверные даты, сложность и лимиты, не превышаются ли лимиты часов, остаётся ли день перед экзаменом только под повторение, как тема растягивается по дням, как работают перепланирование, автоподбор сложности и списки предметов. Отдельно проверено чтение и запись CSV: повреждённые и неполные файлы, файлы с BOM. Результат запуска: 70 passed.</w:t>
       </w:r>
     </w:p>
     <w:p>
@@ -4214,7 +4294,7 @@
           <w:sz w:val="28"/>
           <w:szCs w:val="28"/>
         </w:rPr>
-        <w:t xml:space="preserve">Ниже приведены реальные результаты работы программы (скрипт examples/io_demo.py с фиксированной датой «сегодня» — 01.10.2026).</w:t>
+        <w:t xml:space="preserve">Ниже реальный вывод программы: скрипт examples/io_demo.py с фиксированной датой «сегодня» 01.10.2026.</w:t>
       </w:r>
     </w:p>
     <w:tbl>
@@ -4916,7 +4996,7 @@
           <w:sz w:val="28"/>
           <w:szCs w:val="28"/>
         </w:rPr>
-        <w:t xml:space="preserve">Построенный план для двух событий (экзамен по математике 11.10 и контрольная по физике 06.10; лимит 4 часа в день, не более 2 часов одной темы в день):</w:t>
+        <w:t xml:space="preserve">Построенный план для двух событий: экзамен по математике 11.10 и контрольная по физике 06.10 (лимит 4 часа в день, не больше 2 часов одной темы):</w:t>
       </w:r>
     </w:p>
     <w:p>
@@ -5051,7 +5131,7 @@
           <w:sz w:val="28"/>
           <w:szCs w:val="28"/>
         </w:rPr>
-        <w:t xml:space="preserve">Перепланирование через 3 дня (пользователь отстал):</w:t>
+        <w:t xml:space="preserve">Перепланирование через 3 дня, когда пользователь отстал:</w:t>
       </w:r>
     </w:p>
     <w:p>
@@ -5087,26 +5167,48 @@
     <w:p>
       <w:pPr>
         <w:keepNext/>
-        <w:pBdr>
-          <w:top w:val="single" w:color="999999" w:sz="4"/>
-          <w:left w:val="single" w:color="999999" w:sz="4"/>
-          <w:bottom w:val="single" w:color="999999" w:sz="4"/>
-          <w:right w:val="single" w:color="999999" w:sz="4"/>
-        </w:pBdr>
-        <w:shd w:fill="F3F4F6" w:val="clear"/>
         <w:spacing w:after="60" w:before="120"/>
         <w:jc w:val="center"/>
       </w:pPr>
       <w:r>
-        <w:rPr>
-          <w:rFonts w:ascii="Times New Roman" w:cs="Times New Roman" w:eastAsia="Times New Roman" w:hAnsi="Times New Roman"/>
-          <w:i/>
-          <w:iCs/>
-          <w:color w:val="666666"/>
-          <w:sz w:val="24"/>
-          <w:szCs w:val="24"/>
-        </w:rPr>
-        <w:t xml:space="preserve">[Здесь будет скриншот: 04_error.png]</w:t>
+        <w:drawing>
+          <wp:inline distT="0" distB="0" distL="0" distR="0">
+            <wp:extent cx="4000500" cy="2390775"/>
+            <wp:effectExtent t="0" r="0" b="0" l="0"/>
+            <wp:docPr id="4" name="04_error.png" descr="Сообщение об ошибке при вводе неверной даты" title="Сообщение об ошибке при вводе неверной даты"/>
+            <wp:cNvGraphicFramePr>
+              <a:graphicFrameLocks xmlns:a="http://schemas.openxmlformats.org/drawingml/2006/main" noChangeAspect="1"/>
+            </wp:cNvGraphicFramePr>
+            <a:graphic xmlns:a="http://schemas.openxmlformats.org/drawingml/2006/main">
+              <a:graphicData uri="http://schemas.openxmlformats.org/drawingml/2006/picture">
+                <pic:pic xmlns:pic="http://schemas.openxmlformats.org/drawingml/2006/picture">
+                  <pic:nvPicPr>
+                    <pic:cNvPr id="0" name="" descr=""/>
+                    <pic:cNvPicPr>
+                      <a:picLocks noChangeAspect="1" noChangeArrowheads="1"/>
+                    </pic:cNvPicPr>
+                  </pic:nvPicPr>
+                  <pic:blipFill>
+                    <a:blip r:embed="rId11" cstate="none"/>
+                    <a:srcRect/>
+                    <a:stretch>
+                      <a:fillRect/>
+                    </a:stretch>
+                  </pic:blipFill>
+                  <pic:spPr bwMode="auto">
+                    <a:xfrm>
+                      <a:off x="0" y="0"/>
+                      <a:ext cx="4000500" cy="2390775"/>
+                    </a:xfrm>
+                    <a:prstGeom prst="rect">
+                      <a:avLst/>
+                    </a:prstGeom>
+                  </pic:spPr>
+                </pic:pic>
+              </a:graphicData>
+            </a:graphic>
+          </wp:inline>
+        </w:drawing>
       </w:r>
     </w:p>
     <w:p>
@@ -5184,7 +5286,7 @@
           <w:sz w:val="28"/>
           <w:szCs w:val="28"/>
         </w:rPr>
-        <w:t xml:space="preserve">Для запуска нужен Python 3.9 или новее с модулем tkinter (входит в стандартную установку). Для запуска тестов: создать виртуальное окружение, установить pytest и выполнить pytest. Окно с примерными данными для проверки: python3 demo.py.</w:t>
+        <w:t xml:space="preserve">Нужен Python 3.9 или новее с tkinter (он есть в стандартной установке). Для тестов создайте виртуальное окружение, поставьте pytest и запустите pytest. Окно с примерными данными открывает python3 demo.py.</w:t>
       </w:r>
     </w:p>
     <w:p>
@@ -5218,7 +5320,7 @@
           <w:sz w:val="28"/>
           <w:szCs w:val="28"/>
         </w:rPr>
-        <w:t xml:space="preserve">В ходе работы создан планировщик подготовки к экзаменам: программа принимает экзамены и контрольные с темами, автоматически подбирает сложность, распределяет темы по дням с учётом лимитов, пересчитывает план при отставании и показывает результат в календаре нагрузки и на диаграмме Ганта. Все обязательные требования курса (обработка ошибок, словари, ООП) и дополнительный критерий (визуализация) выполнены, данные хранятся в CSV-файлах, логика покрыта автоматическими тестами. Возможные направления развития: редактирование записей, уведомления о занятиях, экспорт плана в календарь.</w:t>
+        <w:t xml:space="preserve">Мы сделали планировщик подготовки к экзаменам. Он принимает экзамены и контрольные с темами, сам подбирает сложность, раскладывает темы по дням с учётом лимитов, пересчитывает план, когда человек отстаёт, и показывает результат в календаре и на диаграмме Ганта. Требования курса (ошибки, словари, ООП) и четвёртый критерий (визуализация) выполнены, данные лежат в CSV, а логику проверяют тесты. Что можно добавить дальше: редактирование записей, напоминания о занятиях и экспорт плана в календарь.</w:t>
       </w:r>
     </w:p>
     <w:p>

</xml_diff>

<commit_message>
Add repository link to README, presentation and report
Co-Authored-By: Claude Sonnet 5.5 <noreply@anthropic.com>
</commit_message>
<xml_diff>
--- a/docs/Отчёт_Планировщик_экзаменов.docx
+++ b/docs/Отчёт_Планировщик_экзаменов.docx
@@ -5304,6 +5304,21 @@
         <w:t xml:space="preserve">8. Запуск программы</w:t>
       </w:r>
       <w:bookmarkEnd w:id="20"/>
+    </w:p>
+    <w:p>
+      <w:pPr>
+        <w:spacing w:after="120" w:line="360"/>
+        <w:ind w:firstLine="709"/>
+        <w:jc w:val="both"/>
+      </w:pPr>
+      <w:r>
+        <w:rPr>
+          <w:rFonts w:ascii="Times New Roman" w:cs="Times New Roman" w:eastAsia="Times New Roman" w:hAnsi="Times New Roman"/>
+          <w:sz w:val="28"/>
+          <w:szCs w:val="28"/>
+        </w:rPr>
+        <w:t xml:space="preserve">Код проекта лежит в репозитории на GitHub: https://github.com/leywinkw/exam-planner (приватный, доступ по приглашению).</w:t>
+      </w:r>
     </w:p>
     <w:p>
       <w:pPr>

</xml_diff>

<commit_message>
Hints stay under focus, short dates (25, 25.11), date picker popup; docs updated (80 tests)
Co-Authored-By: Claude Sonnet 5.5 <noreply@anthropic.com>
</commit_message>
<xml_diff>
--- a/docs/Отчёт_Планировщик_экзаменов.docx
+++ b/docs/Отчёт_Планировщик_экзаменов.docx
@@ -156,6 +156,10 @@
     <w:sdt>
       <w:sdtPr>
         <w:alias w:val="Содержание"/>
+        <w:docPartObj>
+          <w:docPartGallery w:val="Table of Contents"/>
+          <w:docPartUnique/>
+        </w:docPartObj>
       </w:sdtPr>
       <w:sdtContent>
         <w:p>
@@ -257,7 +261,6 @@
             <w:tabs>
               <w:tab w:val="right" w:pos="9355" w:leader="dot"/>
             </w:tabs>
-            <w:ind w:left="220"/>
           </w:pPr>
           <w:hyperlink w:history="1" w:anchor="_Toc5">
             <w:r>
@@ -280,7 +283,6 @@
             <w:tabs>
               <w:tab w:val="right" w:pos="9355" w:leader="dot"/>
             </w:tabs>
-            <w:ind w:left="220"/>
           </w:pPr>
           <w:hyperlink w:history="1" w:anchor="_Toc6">
             <w:r>
@@ -303,7 +305,6 @@
             <w:tabs>
               <w:tab w:val="right" w:pos="9355" w:leader="dot"/>
             </w:tabs>
-            <w:ind w:left="220"/>
           </w:pPr>
           <w:hyperlink w:history="1" w:anchor="_Toc7">
             <w:r>
@@ -326,7 +327,6 @@
             <w:tabs>
               <w:tab w:val="right" w:pos="9355" w:leader="dot"/>
             </w:tabs>
-            <w:ind w:left="220"/>
           </w:pPr>
           <w:hyperlink w:history="1" w:anchor="_Toc8">
             <w:r>
@@ -349,7 +349,6 @@
             <w:tabs>
               <w:tab w:val="right" w:pos="9355" w:leader="dot"/>
             </w:tabs>
-            <w:ind w:left="220"/>
           </w:pPr>
           <w:hyperlink w:history="1" w:anchor="_Toc9">
             <w:r>
@@ -372,7 +371,6 @@
             <w:tabs>
               <w:tab w:val="right" w:pos="9355" w:leader="dot"/>
             </w:tabs>
-            <w:ind w:left="220"/>
           </w:pPr>
           <w:hyperlink w:history="1" w:anchor="_Toc10">
             <w:r>
@@ -417,7 +415,6 @@
             <w:tabs>
               <w:tab w:val="right" w:pos="9355" w:leader="dot"/>
             </w:tabs>
-            <w:ind w:left="220"/>
           </w:pPr>
           <w:hyperlink w:history="1" w:anchor="_Toc12">
             <w:r>
@@ -440,7 +437,6 @@
             <w:tabs>
               <w:tab w:val="right" w:pos="9355" w:leader="dot"/>
             </w:tabs>
-            <w:ind w:left="220"/>
           </w:pPr>
           <w:hyperlink w:history="1" w:anchor="_Toc13">
             <w:r>
@@ -463,7 +459,6 @@
             <w:tabs>
               <w:tab w:val="right" w:pos="9355" w:leader="dot"/>
             </w:tabs>
-            <w:ind w:left="220"/>
           </w:pPr>
           <w:hyperlink w:history="1" w:anchor="_Toc14">
             <w:r>
@@ -486,7 +481,6 @@
             <w:tabs>
               <w:tab w:val="right" w:pos="9355" w:leader="dot"/>
             </w:tabs>
-            <w:ind w:left="220"/>
           </w:pPr>
           <w:hyperlink w:history="1" w:anchor="_Toc15">
             <w:r>
@@ -553,7 +547,6 @@
             <w:tabs>
               <w:tab w:val="right" w:pos="9355" w:leader="dot"/>
             </w:tabs>
-            <w:ind w:left="220"/>
           </w:pPr>
           <w:hyperlink w:history="1" w:anchor="_Toc18">
             <w:r>
@@ -576,7 +569,6 @@
             <w:tabs>
               <w:tab w:val="right" w:pos="9355" w:leader="dot"/>
             </w:tabs>
-            <w:ind w:left="220"/>
           </w:pPr>
           <w:hyperlink w:history="1" w:anchor="_Toc19">
             <w:r>
@@ -1266,7 +1258,7 @@
                 <w:sz w:val="24"/>
                 <w:szCs w:val="24"/>
               </w:rPr>
-              <w:t xml:space="preserve">автоматические тесты логики (70 тестов)</w:t>
+              <w:t xml:space="preserve">автоматические тесты логики (80 тестов)</w:t>
             </w:r>
           </w:p>
         </w:tc>
@@ -1756,6 +1748,21 @@
     </w:p>
     <w:p>
       <w:pPr>
+        <w:spacing w:after="120" w:line="360"/>
+        <w:ind w:firstLine="709"/>
+        <w:jc w:val="both"/>
+      </w:pPr>
+      <w:r>
+        <w:rPr>
+          <w:rFonts w:ascii="Times New Roman" w:cs="Times New Roman" w:eastAsia="Times New Roman" w:hAnsi="Times New Roman"/>
+          <w:sz w:val="28"/>
+          <w:szCs w:val="28"/>
+        </w:rPr>
+        <w:t xml:space="preserve">Дату можно ввести по-разному. Полная дата записывается как ДД.ММ.ГГГГ. Если написать только число («25»), программа возьмёт ближайшее такое число в будущем, а если число и месяц («25.11») — ближайший такой день. Результат сразу показывается в поле полной датой. Можно и вовсе не печатать: щелчок по полю открывает маленький календарь, где достаточно нажать на нужное число, и оно подставится само. Прошедшие дни в нём недоступны.</w:t>
+      </w:r>
+    </w:p>
+    <w:p>
+      <w:pPr>
         <w:pStyle w:val="Heading2"/>
         <w:keepNext/>
         <w:spacing w:after="120" w:before="240"/>
@@ -1806,15 +1813,217 @@
     <w:p>
       <w:pPr>
         <w:keepNext/>
+        <w:pBdr>
+          <w:top w:val="single" w:color="999999" w:sz="4"/>
+          <w:left w:val="single" w:color="999999" w:sz="4"/>
+          <w:bottom w:val="single" w:color="999999" w:sz="4"/>
+          <w:right w:val="single" w:color="999999" w:sz="4"/>
+        </w:pBdr>
+        <w:shd w:fill="F3F4F6" w:val="clear"/>
         <w:spacing w:after="60" w:before="120"/>
         <w:jc w:val="center"/>
       </w:pPr>
       <w:r>
+        <w:rPr>
+          <w:rFonts w:ascii="Times New Roman" w:cs="Times New Roman" w:eastAsia="Times New Roman" w:hAnsi="Times New Roman"/>
+          <w:i/>
+          <w:iCs/>
+          <w:color w:val="666666"/>
+          <w:sz w:val="24"/>
+          <w:szCs w:val="24"/>
+        </w:rPr>
+        <w:t xml:space="preserve">[Здесь будет скриншот: 03_dialog.png]</w:t>
+      </w:r>
+    </w:p>
+    <w:p>
+      <w:pPr>
+        <w:spacing w:after="240"/>
+        <w:jc w:val="center"/>
+      </w:pPr>
+      <w:r>
+        <w:rPr>
+          <w:rFonts w:ascii="Times New Roman" w:cs="Times New Roman" w:eastAsia="Times New Roman" w:hAnsi="Times New Roman"/>
+          <w:sz w:val="24"/>
+          <w:szCs w:val="24"/>
+        </w:rPr>
+        <w:t xml:space="preserve">Рисунок 1 — Окно добавления нескольких тем</w:t>
+      </w:r>
+    </w:p>
+    <w:p>
+      <w:pPr>
+        <w:pStyle w:val="Heading2"/>
+        <w:keepNext/>
+        <w:spacing w:after="120" w:before="240"/>
+      </w:pPr>
+      <w:bookmarkStart w:name="_Toc7" w:id="7"/>
+      <w:r>
+        <w:rPr>
+          <w:rFonts w:ascii="Times New Roman" w:cs="Times New Roman" w:eastAsia="Times New Roman" w:hAnsi="Times New Roman"/>
+          <w:b/>
+          <w:bCs/>
+          <w:sz w:val="28"/>
+          <w:szCs w:val="28"/>
+        </w:rPr>
+        <w:t xml:space="preserve">4.3. Распределение по дням</w:t>
+      </w:r>
+      <w:bookmarkEnd w:id="7"/>
+    </w:p>
+    <w:p>
+      <w:pPr>
+        <w:spacing w:after="120" w:line="360"/>
+        <w:ind w:firstLine="709"/>
+        <w:jc w:val="both"/>
+      </w:pPr>
+      <w:r>
+        <w:rPr>
+          <w:rFonts w:ascii="Times New Roman" w:cs="Times New Roman" w:eastAsia="Times New Roman" w:hAnsi="Times New Roman"/>
+          <w:sz w:val="28"/>
+          <w:szCs w:val="28"/>
+        </w:rPr>
+        <w:t xml:space="preserve">План пересобирается после каждого изменения. Правила такие:</w:t>
+      </w:r>
+    </w:p>
+    <w:p>
+      <w:pPr>
+        <w:pStyle w:val="ListParagraph"/>
+        <w:numPr>
+          <w:ilvl w:val="0"/>
+          <w:numId w:val="2"/>
+        </w:numPr>
+        <w:spacing w:after="60" w:line="360"/>
+        <w:jc w:val="both"/>
+      </w:pPr>
+      <w:r>
+        <w:rPr>
+          <w:rFonts w:ascii="Times New Roman" w:cs="Times New Roman" w:eastAsia="Times New Roman" w:hAnsi="Times New Roman"/>
+          <w:sz w:val="28"/>
+          <w:szCs w:val="28"/>
+        </w:rPr>
+        <w:t xml:space="preserve">часов на тему столько же, какова её сложность;</w:t>
+      </w:r>
+    </w:p>
+    <w:p>
+      <w:pPr>
+        <w:pStyle w:val="ListParagraph"/>
+        <w:numPr>
+          <w:ilvl w:val="0"/>
+          <w:numId w:val="2"/>
+        </w:numPr>
+        <w:spacing w:after="60" w:line="360"/>
+        <w:jc w:val="both"/>
+      </w:pPr>
+      <w:r>
+        <w:rPr>
+          <w:rFonts w:ascii="Times New Roman" w:cs="Times New Roman" w:eastAsia="Times New Roman" w:hAnsi="Times New Roman"/>
+          <w:sz w:val="28"/>
+          <w:szCs w:val="28"/>
+        </w:rPr>
+        <w:t xml:space="preserve">в день ставится не больше заданного числа часов (по умолчанию 4) и не больше 2 часов одной темы, поэтому большая тема растягивается на несколько дней по 1–2 часа;</w:t>
+      </w:r>
+    </w:p>
+    <w:p>
+      <w:pPr>
+        <w:pStyle w:val="ListParagraph"/>
+        <w:numPr>
+          <w:ilvl w:val="0"/>
+          <w:numId w:val="2"/>
+        </w:numPr>
+        <w:spacing w:after="60" w:line="360"/>
+        <w:jc w:val="both"/>
+      </w:pPr>
+      <w:r>
+        <w:rPr>
+          <w:rFonts w:ascii="Times New Roman" w:cs="Times New Roman" w:eastAsia="Times New Roman" w:hAnsi="Times New Roman"/>
+          <w:sz w:val="28"/>
+          <w:szCs w:val="28"/>
+        </w:rPr>
+        <w:t xml:space="preserve">первыми идут самые сложные темы ближайшего события;</w:t>
+      </w:r>
+    </w:p>
+    <w:p>
+      <w:pPr>
+        <w:pStyle w:val="ListParagraph"/>
+        <w:numPr>
+          <w:ilvl w:val="0"/>
+          <w:numId w:val="2"/>
+        </w:numPr>
+        <w:spacing w:after="60" w:line="360"/>
+        <w:jc w:val="both"/>
+      </w:pPr>
+      <w:r>
+        <w:rPr>
+          <w:rFonts w:ascii="Times New Roman" w:cs="Times New Roman" w:eastAsia="Times New Roman" w:hAnsi="Times New Roman"/>
+          <w:sz w:val="28"/>
+          <w:szCs w:val="28"/>
+        </w:rPr>
+        <w:t xml:space="preserve">день перед экзаменом отдан под повторение (2 часа), перед контрольной ставится 1 час, в день самого события занятий нет;</w:t>
+      </w:r>
+    </w:p>
+    <w:p>
+      <w:pPr>
+        <w:pStyle w:val="ListParagraph"/>
+        <w:numPr>
+          <w:ilvl w:val="0"/>
+          <w:numId w:val="2"/>
+        </w:numPr>
+        <w:spacing w:after="60" w:line="360"/>
+        <w:jc w:val="both"/>
+      </w:pPr>
+      <w:r>
+        <w:rPr>
+          <w:rFonts w:ascii="Times New Roman" w:cs="Times New Roman" w:eastAsia="Times New Roman" w:hAnsi="Times New Roman"/>
+          <w:sz w:val="28"/>
+          <w:szCs w:val="28"/>
+        </w:rPr>
+        <w:t xml:space="preserve">если темы не помещаются в срок, дни не перегружаются: программа показывает, какие темы под угрозой.</w:t>
+      </w:r>
+    </w:p>
+    <w:p>
+      <w:pPr>
+        <w:pStyle w:val="Heading2"/>
+        <w:keepNext/>
+        <w:spacing w:after="120" w:before="240"/>
+      </w:pPr>
+      <w:bookmarkStart w:name="_Toc8" w:id="8"/>
+      <w:r>
+        <w:rPr>
+          <w:rFonts w:ascii="Times New Roman" w:cs="Times New Roman" w:eastAsia="Times New Roman" w:hAnsi="Times New Roman"/>
+          <w:b/>
+          <w:bCs/>
+          <w:sz w:val="28"/>
+          <w:szCs w:val="28"/>
+        </w:rPr>
+        <w:t xml:space="preserve">4.4. Пересчёт плана</w:t>
+      </w:r>
+      <w:bookmarkEnd w:id="8"/>
+    </w:p>
+    <w:p>
+      <w:pPr>
+        <w:spacing w:after="120" w:line="360"/>
+        <w:ind w:firstLine="709"/>
+        <w:jc w:val="both"/>
+      </w:pPr>
+      <w:r>
+        <w:rPr>
+          <w:rFonts w:ascii="Times New Roman" w:cs="Times New Roman" w:eastAsia="Times New Roman" w:hAnsi="Times New Roman"/>
+          <w:sz w:val="28"/>
+          <w:szCs w:val="28"/>
+        </w:rPr>
+        <w:t xml:space="preserve">Если вы отстали, нажмите «Перепланировать». Для каждой темы мы запоминаем день, на который её поставили. Невыполненные темы с прошедшим днём планируются заново с сегодняшнего дня. Программа пишет, что перенесла, и предупреждает о темах, которые уже не успеть. Выполненные темы отмечаются кнопкой «Готово» и в плане больше не участвуют.</w:t>
+      </w:r>
+    </w:p>
+    <w:p>
+      <w:pPr>
+        <w:keepNext/>
+        <w:spacing w:after="60" w:before="120"/>
+        <w:jc w:val="center"/>
+      </w:pPr>
+      <w:r>
         <w:drawing>
           <wp:inline distT="0" distB="0" distL="0" distR="0">
-            <wp:extent cx="3619500" cy="2714625"/>
+            <wp:extent cx="5334000" cy="3838575"/>
             <wp:effectExtent t="0" r="0" b="0" l="0"/>
-            <wp:docPr id="1" name="03_dialog.png" descr="Окно добавления нескольких тем" title="Окно добавления нескольких тем"/>
+            <wp:docPr id="1" name="s4_risk_gantt.png" descr="Предупреждение: темы не помещаются до экзамена (лимит 2 часа в день)" title="Предупреждение: темы не помещаются до экзамена (лимит 2 часа в день)"/>
             <wp:cNvGraphicFramePr>
               <a:graphicFrameLocks xmlns:a="http://schemas.openxmlformats.org/drawingml/2006/main" noChangeAspect="1"/>
             </wp:cNvGraphicFramePr>
@@ -1837,230 +2046,6 @@
                   <pic:spPr bwMode="auto">
                     <a:xfrm>
                       <a:off x="0" y="0"/>
-                      <a:ext cx="3619500" cy="2714625"/>
-                    </a:xfrm>
-                    <a:prstGeom prst="rect">
-                      <a:avLst/>
-                    </a:prstGeom>
-                  </pic:spPr>
-                </pic:pic>
-              </a:graphicData>
-            </a:graphic>
-          </wp:inline>
-        </w:drawing>
-      </w:r>
-    </w:p>
-    <w:p>
-      <w:pPr>
-        <w:spacing w:after="240"/>
-        <w:jc w:val="center"/>
-      </w:pPr>
-      <w:r>
-        <w:rPr>
-          <w:rFonts w:ascii="Times New Roman" w:cs="Times New Roman" w:eastAsia="Times New Roman" w:hAnsi="Times New Roman"/>
-          <w:sz w:val="24"/>
-          <w:szCs w:val="24"/>
-        </w:rPr>
-        <w:t xml:space="preserve">Рисунок 1 — Окно добавления нескольких тем</w:t>
-      </w:r>
-    </w:p>
-    <w:p>
-      <w:pPr>
-        <w:pStyle w:val="Heading2"/>
-        <w:keepNext/>
-        <w:spacing w:after="120" w:before="240"/>
-      </w:pPr>
-      <w:bookmarkStart w:name="_Toc7" w:id="7"/>
-      <w:r>
-        <w:rPr>
-          <w:rFonts w:ascii="Times New Roman" w:cs="Times New Roman" w:eastAsia="Times New Roman" w:hAnsi="Times New Roman"/>
-          <w:b/>
-          <w:bCs/>
-          <w:sz w:val="28"/>
-          <w:szCs w:val="28"/>
-        </w:rPr>
-        <w:t xml:space="preserve">4.3. Распределение по дням</w:t>
-      </w:r>
-      <w:bookmarkEnd w:id="7"/>
-    </w:p>
-    <w:p>
-      <w:pPr>
-        <w:spacing w:after="120" w:line="360"/>
-        <w:ind w:firstLine="709"/>
-        <w:jc w:val="both"/>
-      </w:pPr>
-      <w:r>
-        <w:rPr>
-          <w:rFonts w:ascii="Times New Roman" w:cs="Times New Roman" w:eastAsia="Times New Roman" w:hAnsi="Times New Roman"/>
-          <w:sz w:val="28"/>
-          <w:szCs w:val="28"/>
-        </w:rPr>
-        <w:t xml:space="preserve">План пересобирается после каждого изменения. Правила такие:</w:t>
-      </w:r>
-    </w:p>
-    <w:p>
-      <w:pPr>
-        <w:pStyle w:val="ListParagraph"/>
-        <w:numPr>
-          <w:ilvl w:val="0"/>
-          <w:numId w:val="2"/>
-        </w:numPr>
-        <w:spacing w:after="60" w:line="360"/>
-        <w:jc w:val="both"/>
-      </w:pPr>
-      <w:r>
-        <w:rPr>
-          <w:rFonts w:ascii="Times New Roman" w:cs="Times New Roman" w:eastAsia="Times New Roman" w:hAnsi="Times New Roman"/>
-          <w:sz w:val="28"/>
-          <w:szCs w:val="28"/>
-        </w:rPr>
-        <w:t xml:space="preserve">часов на тему столько же, какова её сложность;</w:t>
-      </w:r>
-    </w:p>
-    <w:p>
-      <w:pPr>
-        <w:pStyle w:val="ListParagraph"/>
-        <w:numPr>
-          <w:ilvl w:val="0"/>
-          <w:numId w:val="2"/>
-        </w:numPr>
-        <w:spacing w:after="60" w:line="360"/>
-        <w:jc w:val="both"/>
-      </w:pPr>
-      <w:r>
-        <w:rPr>
-          <w:rFonts w:ascii="Times New Roman" w:cs="Times New Roman" w:eastAsia="Times New Roman" w:hAnsi="Times New Roman"/>
-          <w:sz w:val="28"/>
-          <w:szCs w:val="28"/>
-        </w:rPr>
-        <w:t xml:space="preserve">в день ставится не больше заданного числа часов (по умолчанию 4) и не больше 2 часов одной темы, поэтому большая тема растягивается на несколько дней по 1–2 часа;</w:t>
-      </w:r>
-    </w:p>
-    <w:p>
-      <w:pPr>
-        <w:pStyle w:val="ListParagraph"/>
-        <w:numPr>
-          <w:ilvl w:val="0"/>
-          <w:numId w:val="2"/>
-        </w:numPr>
-        <w:spacing w:after="60" w:line="360"/>
-        <w:jc w:val="both"/>
-      </w:pPr>
-      <w:r>
-        <w:rPr>
-          <w:rFonts w:ascii="Times New Roman" w:cs="Times New Roman" w:eastAsia="Times New Roman" w:hAnsi="Times New Roman"/>
-          <w:sz w:val="28"/>
-          <w:szCs w:val="28"/>
-        </w:rPr>
-        <w:t xml:space="preserve">первыми идут самые сложные темы ближайшего события;</w:t>
-      </w:r>
-    </w:p>
-    <w:p>
-      <w:pPr>
-        <w:pStyle w:val="ListParagraph"/>
-        <w:numPr>
-          <w:ilvl w:val="0"/>
-          <w:numId w:val="2"/>
-        </w:numPr>
-        <w:spacing w:after="60" w:line="360"/>
-        <w:jc w:val="both"/>
-      </w:pPr>
-      <w:r>
-        <w:rPr>
-          <w:rFonts w:ascii="Times New Roman" w:cs="Times New Roman" w:eastAsia="Times New Roman" w:hAnsi="Times New Roman"/>
-          <w:sz w:val="28"/>
-          <w:szCs w:val="28"/>
-        </w:rPr>
-        <w:t xml:space="preserve">день перед экзаменом отдан под повторение (2 часа), перед контрольной ставится 1 час, в день самого события занятий нет;</w:t>
-      </w:r>
-    </w:p>
-    <w:p>
-      <w:pPr>
-        <w:pStyle w:val="ListParagraph"/>
-        <w:numPr>
-          <w:ilvl w:val="0"/>
-          <w:numId w:val="2"/>
-        </w:numPr>
-        <w:spacing w:after="60" w:line="360"/>
-        <w:jc w:val="both"/>
-      </w:pPr>
-      <w:r>
-        <w:rPr>
-          <w:rFonts w:ascii="Times New Roman" w:cs="Times New Roman" w:eastAsia="Times New Roman" w:hAnsi="Times New Roman"/>
-          <w:sz w:val="28"/>
-          <w:szCs w:val="28"/>
-        </w:rPr>
-        <w:t xml:space="preserve">если темы не помещаются в срок, дни не перегружаются: программа показывает, какие темы под угрозой.</w:t>
-      </w:r>
-    </w:p>
-    <w:p>
-      <w:pPr>
-        <w:pStyle w:val="Heading2"/>
-        <w:keepNext/>
-        <w:spacing w:after="120" w:before="240"/>
-      </w:pPr>
-      <w:bookmarkStart w:name="_Toc8" w:id="8"/>
-      <w:r>
-        <w:rPr>
-          <w:rFonts w:ascii="Times New Roman" w:cs="Times New Roman" w:eastAsia="Times New Roman" w:hAnsi="Times New Roman"/>
-          <w:b/>
-          <w:bCs/>
-          <w:sz w:val="28"/>
-          <w:szCs w:val="28"/>
-        </w:rPr>
-        <w:t xml:space="preserve">4.4. Пересчёт плана</w:t>
-      </w:r>
-      <w:bookmarkEnd w:id="8"/>
-    </w:p>
-    <w:p>
-      <w:pPr>
-        <w:spacing w:after="120" w:line="360"/>
-        <w:ind w:firstLine="709"/>
-        <w:jc w:val="both"/>
-      </w:pPr>
-      <w:r>
-        <w:rPr>
-          <w:rFonts w:ascii="Times New Roman" w:cs="Times New Roman" w:eastAsia="Times New Roman" w:hAnsi="Times New Roman"/>
-          <w:sz w:val="28"/>
-          <w:szCs w:val="28"/>
-        </w:rPr>
-        <w:t xml:space="preserve">Если вы отстали, нажмите «Перепланировать». Для каждой темы мы запоминаем день, на который её поставили. Невыполненные темы с прошедшим днём планируются заново с сегодняшнего дня. Программа пишет, что перенесла, и предупреждает о темах, которые уже не успеть. Выполненные темы отмечаются кнопкой «Готово» и в плане больше не участвуют.</w:t>
-      </w:r>
-    </w:p>
-    <w:p>
-      <w:pPr>
-        <w:keepNext/>
-        <w:spacing w:after="60" w:before="120"/>
-        <w:jc w:val="center"/>
-      </w:pPr>
-      <w:r>
-        <w:drawing>
-          <wp:inline distT="0" distB="0" distL="0" distR="0">
-            <wp:extent cx="5334000" cy="3838575"/>
-            <wp:effectExtent t="0" r="0" b="0" l="0"/>
-            <wp:docPr id="2" name="s4_risk_gantt.png" descr="Предупреждение: темы не помещаются до экзамена (лимит 2 часа в день)" title="Предупреждение: темы не помещаются до экзамена (лимит 2 часа в день)"/>
-            <wp:cNvGraphicFramePr>
-              <a:graphicFrameLocks xmlns:a="http://schemas.openxmlformats.org/drawingml/2006/main" noChangeAspect="1"/>
-            </wp:cNvGraphicFramePr>
-            <a:graphic xmlns:a="http://schemas.openxmlformats.org/drawingml/2006/main">
-              <a:graphicData uri="http://schemas.openxmlformats.org/drawingml/2006/picture">
-                <pic:pic xmlns:pic="http://schemas.openxmlformats.org/drawingml/2006/picture">
-                  <pic:nvPicPr>
-                    <pic:cNvPr id="0" name="" descr=""/>
-                    <pic:cNvPicPr>
-                      <a:picLocks noChangeAspect="1" noChangeArrowheads="1"/>
-                    </pic:cNvPicPr>
-                  </pic:nvPicPr>
-                  <pic:blipFill>
-                    <a:blip r:embed="rId9" cstate="none"/>
-                    <a:srcRect/>
-                    <a:stretch>
-                      <a:fillRect/>
-                    </a:stretch>
-                  </pic:blipFill>
-                  <pic:spPr bwMode="auto">
-                    <a:xfrm>
-                      <a:off x="0" y="0"/>
                       <a:ext cx="5334000" cy="3838575"/>
                     </a:xfrm>
                     <a:prstGeom prst="rect">
@@ -2125,48 +2110,26 @@
     <w:p>
       <w:pPr>
         <w:keepNext/>
+        <w:pBdr>
+          <w:top w:val="single" w:color="999999" w:sz="4"/>
+          <w:left w:val="single" w:color="999999" w:sz="4"/>
+          <w:bottom w:val="single" w:color="999999" w:sz="4"/>
+          <w:right w:val="single" w:color="999999" w:sz="4"/>
+        </w:pBdr>
+        <w:shd w:fill="F3F4F6" w:val="clear"/>
         <w:spacing w:after="60" w:before="120"/>
         <w:jc w:val="center"/>
       </w:pPr>
       <w:r>
-        <w:drawing>
-          <wp:inline distT="0" distB="0" distL="0" distR="0">
-            <wp:extent cx="5334000" cy="3838575"/>
-            <wp:effectExtent t="0" r="0" b="0" l="0"/>
-            <wp:docPr id="3" name="01_calendar.png" descr="Календарь нагрузки" title="Календарь нагрузки"/>
-            <wp:cNvGraphicFramePr>
-              <a:graphicFrameLocks xmlns:a="http://schemas.openxmlformats.org/drawingml/2006/main" noChangeAspect="1"/>
-            </wp:cNvGraphicFramePr>
-            <a:graphic xmlns:a="http://schemas.openxmlformats.org/drawingml/2006/main">
-              <a:graphicData uri="http://schemas.openxmlformats.org/drawingml/2006/picture">
-                <pic:pic xmlns:pic="http://schemas.openxmlformats.org/drawingml/2006/picture">
-                  <pic:nvPicPr>
-                    <pic:cNvPr id="0" name="" descr=""/>
-                    <pic:cNvPicPr>
-                      <a:picLocks noChangeAspect="1" noChangeArrowheads="1"/>
-                    </pic:cNvPicPr>
-                  </pic:nvPicPr>
-                  <pic:blipFill>
-                    <a:blip r:embed="rId10" cstate="none"/>
-                    <a:srcRect/>
-                    <a:stretch>
-                      <a:fillRect/>
-                    </a:stretch>
-                  </pic:blipFill>
-                  <pic:spPr bwMode="auto">
-                    <a:xfrm>
-                      <a:off x="0" y="0"/>
-                      <a:ext cx="5334000" cy="3838575"/>
-                    </a:xfrm>
-                    <a:prstGeom prst="rect">
-                      <a:avLst/>
-                    </a:prstGeom>
-                  </pic:spPr>
-                </pic:pic>
-              </a:graphicData>
-            </a:graphic>
-          </wp:inline>
-        </w:drawing>
+        <w:rPr>
+          <w:rFonts w:ascii="Times New Roman" w:cs="Times New Roman" w:eastAsia="Times New Roman" w:hAnsi="Times New Roman"/>
+          <w:i/>
+          <w:iCs/>
+          <w:color w:val="666666"/>
+          <w:sz w:val="24"/>
+          <w:szCs w:val="24"/>
+        </w:rPr>
+        <w:t xml:space="preserve">[Здесь будет скриншот: 01_calendar.png]</w:t>
       </w:r>
     </w:p>
     <w:p>
@@ -2201,48 +2164,26 @@
     <w:p>
       <w:pPr>
         <w:keepNext/>
+        <w:pBdr>
+          <w:top w:val="single" w:color="999999" w:sz="4"/>
+          <w:left w:val="single" w:color="999999" w:sz="4"/>
+          <w:bottom w:val="single" w:color="999999" w:sz="4"/>
+          <w:right w:val="single" w:color="999999" w:sz="4"/>
+        </w:pBdr>
+        <w:shd w:fill="F3F4F6" w:val="clear"/>
         <w:spacing w:after="60" w:before="120"/>
         <w:jc w:val="center"/>
       </w:pPr>
       <w:r>
-        <w:drawing>
-          <wp:inline distT="0" distB="0" distL="0" distR="0">
-            <wp:extent cx="5334000" cy="3838575"/>
-            <wp:effectExtent t="0" r="0" b="0" l="0"/>
-            <wp:docPr id="4" name="02_gantt.png" descr="Диаграмма Ганта" title="Диаграмма Ганта"/>
-            <wp:cNvGraphicFramePr>
-              <a:graphicFrameLocks xmlns:a="http://schemas.openxmlformats.org/drawingml/2006/main" noChangeAspect="1"/>
-            </wp:cNvGraphicFramePr>
-            <a:graphic xmlns:a="http://schemas.openxmlformats.org/drawingml/2006/main">
-              <a:graphicData uri="http://schemas.openxmlformats.org/drawingml/2006/picture">
-                <pic:pic xmlns:pic="http://schemas.openxmlformats.org/drawingml/2006/picture">
-                  <pic:nvPicPr>
-                    <pic:cNvPr id="0" name="" descr=""/>
-                    <pic:cNvPicPr>
-                      <a:picLocks noChangeAspect="1" noChangeArrowheads="1"/>
-                    </pic:cNvPicPr>
-                  </pic:nvPicPr>
-                  <pic:blipFill>
-                    <a:blip r:embed="rId11" cstate="none"/>
-                    <a:srcRect/>
-                    <a:stretch>
-                      <a:fillRect/>
-                    </a:stretch>
-                  </pic:blipFill>
-                  <pic:spPr bwMode="auto">
-                    <a:xfrm>
-                      <a:off x="0" y="0"/>
-                      <a:ext cx="5334000" cy="3838575"/>
-                    </a:xfrm>
-                    <a:prstGeom prst="rect">
-                      <a:avLst/>
-                    </a:prstGeom>
-                  </pic:spPr>
-                </pic:pic>
-              </a:graphicData>
-            </a:graphic>
-          </wp:inline>
-        </w:drawing>
+        <w:rPr>
+          <w:rFonts w:ascii="Times New Roman" w:cs="Times New Roman" w:eastAsia="Times New Roman" w:hAnsi="Times New Roman"/>
+          <w:i/>
+          <w:iCs/>
+          <w:color w:val="666666"/>
+          <w:sz w:val="24"/>
+          <w:szCs w:val="24"/>
+        </w:rPr>
+        <w:t xml:space="preserve">[Здесь будет скриншот: 02_gantt.png]</w:t>
       </w:r>
     </w:p>
     <w:p>
@@ -4321,7 +4262,7 @@
           <w:sz w:val="28"/>
           <w:szCs w:val="28"/>
         </w:rPr>
-        <w:t xml:space="preserve">Логику проверяют 70 автотестов на pytest (папка tests). Они смотрят, как программа реагирует на неверные даты, сложность и лимиты, не превышаются ли лимиты часов, остаётся ли день перед экзаменом только под повторение, как тема растягивается по дням, как работают перепланирование, автоподбор сложности и списки предметов. Отдельно проверено чтение и запись CSV: повреждённые и неполные файлы, файлы с BOM. Результат запуска: 70 passed.</w:t>
+        <w:t xml:space="preserve">Логику проверяют 80 автотестов на pytest (папка tests). Они смотрят, как программа реагирует на неверные даты, сложность и лимиты, не превышаются ли лимиты часов, остаётся ли день перед экзаменом только под повторение, как тема растягивается по дням, как работают перепланирование, автоподбор сложности и списки предметов. Отдельно проверено чтение и запись CSV: повреждённые и неполные файлы, файлы с BOM. Результат запуска: 80 passed.</w:t>
       </w:r>
     </w:p>
     <w:p>
@@ -5228,48 +5169,26 @@
     <w:p>
       <w:pPr>
         <w:keepNext/>
+        <w:pBdr>
+          <w:top w:val="single" w:color="999999" w:sz="4"/>
+          <w:left w:val="single" w:color="999999" w:sz="4"/>
+          <w:bottom w:val="single" w:color="999999" w:sz="4"/>
+          <w:right w:val="single" w:color="999999" w:sz="4"/>
+        </w:pBdr>
+        <w:shd w:fill="F3F4F6" w:val="clear"/>
         <w:spacing w:after="60" w:before="120"/>
         <w:jc w:val="center"/>
       </w:pPr>
       <w:r>
-        <w:drawing>
-          <wp:inline distT="0" distB="0" distL="0" distR="0">
-            <wp:extent cx="4000500" cy="2390775"/>
-            <wp:effectExtent t="0" r="0" b="0" l="0"/>
-            <wp:docPr id="5" name="04_error.png" descr="Сообщение об ошибке при вводе неверной даты" title="Сообщение об ошибке при вводе неверной даты"/>
-            <wp:cNvGraphicFramePr>
-              <a:graphicFrameLocks xmlns:a="http://schemas.openxmlformats.org/drawingml/2006/main" noChangeAspect="1"/>
-            </wp:cNvGraphicFramePr>
-            <a:graphic xmlns:a="http://schemas.openxmlformats.org/drawingml/2006/main">
-              <a:graphicData uri="http://schemas.openxmlformats.org/drawingml/2006/picture">
-                <pic:pic xmlns:pic="http://schemas.openxmlformats.org/drawingml/2006/picture">
-                  <pic:nvPicPr>
-                    <pic:cNvPr id="0" name="" descr=""/>
-                    <pic:cNvPicPr>
-                      <a:picLocks noChangeAspect="1" noChangeArrowheads="1"/>
-                    </pic:cNvPicPr>
-                  </pic:nvPicPr>
-                  <pic:blipFill>
-                    <a:blip r:embed="rId12" cstate="none"/>
-                    <a:srcRect/>
-                    <a:stretch>
-                      <a:fillRect/>
-                    </a:stretch>
-                  </pic:blipFill>
-                  <pic:spPr bwMode="auto">
-                    <a:xfrm>
-                      <a:off x="0" y="0"/>
-                      <a:ext cx="4000500" cy="2390775"/>
-                    </a:xfrm>
-                    <a:prstGeom prst="rect">
-                      <a:avLst/>
-                    </a:prstGeom>
-                  </pic:spPr>
-                </pic:pic>
-              </a:graphicData>
-            </a:graphic>
-          </wp:inline>
-        </w:drawing>
+        <w:rPr>
+          <w:rFonts w:ascii="Times New Roman" w:cs="Times New Roman" w:eastAsia="Times New Roman" w:hAnsi="Times New Roman"/>
+          <w:i/>
+          <w:iCs/>
+          <w:color w:val="666666"/>
+          <w:sz w:val="24"/>
+          <w:szCs w:val="24"/>
+        </w:rPr>
+        <w:t xml:space="preserve">[Здесь будет скриншот: 04_error.png]</w:t>
       </w:r>
     </w:p>
     <w:p>
@@ -5964,6 +5883,139 @@
     <w:basedOn w:val="Normal"/>
     <w:qFormat/>
   </w:style>
+  <w:style w:type="paragraph" w:styleId="Caption">
+    <w:name w:val="caption"/>
+    <w:basedOn w:val="Normal"/>
+    <w:next w:val="Normal"/>
+    <w:uiPriority w:val="35"/>
+    <w:semiHidden/>
+    <w:unhideWhenUsed/>
+    <w:qFormat/>
+    <w:pPr>
+      <w:spacing w:after="200"/>
+    </w:pPr>
+    <w:rPr>
+      <w:i/>
+      <w:iCs/>
+      <w:color w:val="44546A" w:themeColor="dark2"/>
+      <w:sz w:val="18"/>
+      <w:szCs w:val="18"/>
+    </w:rPr>
+  </w:style>
+  <w:style w:type="paragraph" w:styleId="Bibliography">
+    <w:name w:val="Bibliography"/>
+    <w:basedOn w:val="Normal"/>
+    <w:next w:val="Normal"/>
+    <w:uiPriority w:val="37"/>
+    <w:unhideWhenUsed/>
+  </w:style>
+  <w:style w:type="paragraph" w:styleId="TOC1">
+    <w:name w:val="toc 1"/>
+    <w:basedOn w:val="Normal"/>
+    <w:next w:val="Normal"/>
+    <w:uiPriority w:val="39"/>
+    <w:semiHidden/>
+    <w:unhideWhenUsed/>
+    <w:pPr>
+      <w:spacing w:after="100"/>
+    </w:pPr>
+  </w:style>
+  <w:style w:type="paragraph" w:styleId="TOC2">
+    <w:name w:val="toc 2"/>
+    <w:basedOn w:val="Normal"/>
+    <w:next w:val="Normal"/>
+    <w:uiPriority w:val="39"/>
+    <w:semiHidden/>
+    <w:unhideWhenUsed/>
+    <w:pPr>
+      <w:spacing w:after="100"/>
+      <w:ind w:left="280"/>
+    </w:pPr>
+  </w:style>
+  <w:style w:type="paragraph" w:styleId="TOC3">
+    <w:name w:val="toc 3"/>
+    <w:basedOn w:val="Normal"/>
+    <w:next w:val="Normal"/>
+    <w:uiPriority w:val="39"/>
+    <w:semiHidden/>
+    <w:unhideWhenUsed/>
+    <w:pPr>
+      <w:spacing w:after="100"/>
+      <w:ind w:left="560"/>
+    </w:pPr>
+  </w:style>
+  <w:style w:type="paragraph" w:styleId="TOC4">
+    <w:name w:val="toc 4"/>
+    <w:basedOn w:val="Normal"/>
+    <w:next w:val="Normal"/>
+    <w:uiPriority w:val="39"/>
+    <w:semiHidden/>
+    <w:unhideWhenUsed/>
+    <w:pPr>
+      <w:spacing w:after="100"/>
+      <w:ind w:left="840"/>
+    </w:pPr>
+  </w:style>
+  <w:style w:type="paragraph" w:styleId="TOC5">
+    <w:name w:val="toc 5"/>
+    <w:basedOn w:val="Normal"/>
+    <w:next w:val="Normal"/>
+    <w:uiPriority w:val="39"/>
+    <w:semiHidden/>
+    <w:unhideWhenUsed/>
+    <w:pPr>
+      <w:spacing w:after="100"/>
+      <w:ind w:left="1120"/>
+    </w:pPr>
+  </w:style>
+  <w:style w:type="paragraph" w:styleId="TOC6">
+    <w:name w:val="toc 6"/>
+    <w:basedOn w:val="Normal"/>
+    <w:next w:val="Normal"/>
+    <w:uiPriority w:val="39"/>
+    <w:semiHidden/>
+    <w:unhideWhenUsed/>
+    <w:pPr>
+      <w:spacing w:after="100"/>
+      <w:ind w:left="1400"/>
+    </w:pPr>
+  </w:style>
+  <w:style w:type="paragraph" w:styleId="TOC7">
+    <w:name w:val="toc 7"/>
+    <w:basedOn w:val="Normal"/>
+    <w:next w:val="Normal"/>
+    <w:uiPriority w:val="39"/>
+    <w:semiHidden/>
+    <w:unhideWhenUsed/>
+    <w:pPr>
+      <w:spacing w:after="100"/>
+      <w:ind w:left="1680"/>
+    </w:pPr>
+  </w:style>
+  <w:style w:type="paragraph" w:styleId="TOC8">
+    <w:name w:val="toc 8"/>
+    <w:basedOn w:val="Normal"/>
+    <w:next w:val="Normal"/>
+    <w:uiPriority w:val="39"/>
+    <w:semiHidden/>
+    <w:unhideWhenUsed/>
+    <w:pPr>
+      <w:spacing w:after="100"/>
+      <w:ind w:left="1960"/>
+    </w:pPr>
+  </w:style>
+  <w:style w:type="paragraph" w:styleId="TOC9">
+    <w:name w:val="toc 9"/>
+    <w:basedOn w:val="Normal"/>
+    <w:next w:val="Normal"/>
+    <w:uiPriority w:val="39"/>
+    <w:semiHidden/>
+    <w:unhideWhenUsed/>
+    <w:pPr>
+      <w:spacing w:after="100"/>
+      <w:ind w:left="2240"/>
+    </w:pPr>
+  </w:style>
   <w:style w:type="character" w:styleId="Hyperlink">
     <w:name w:val="Hyperlink"/>
     <w:basedOn w:val="DefaultParagraphFont"/>
@@ -6047,6 +6099,13 @@
       <w:sz w:val="20"/>
       <w:szCs w:val="20"/>
     </w:rPr>
+  </w:style>
+  <w:style w:type="character" w:styleId="LineNumber">
+    <w:name w:val="line number"/>
+    <w:basedOn w:val="DefaultParagraphFont"/>
+    <w:uiPriority w:val="99"/>
+    <w:semiHidden/>
+    <w:unhideWhenUsed/>
   </w:style>
   <w:style w:type="paragraph" w:styleId="Heading1">
     <w:name w:val="Heading 1"/>

</xml_diff>

<commit_message>
Spread each event's hours evenly over the whole period before the exam
Co-Authored-By: Claude Sonnet 5.5 <noreply@anthropic.com>
</commit_message>
<xml_diff>
--- a/docs/Отчёт_Планировщик_экзаменов.docx
+++ b/docs/Отчёт_Планировщик_экзаменов.docx
@@ -1258,7 +1258,7 @@
                 <w:sz w:val="24"/>
                 <w:szCs w:val="24"/>
               </w:rPr>
-              <w:t xml:space="preserve">автоматические тесты логики (80 тестов)</w:t>
+              <w:t xml:space="preserve">автоматические тесты логики (83 теста)</w:t>
             </w:r>
           </w:p>
         </w:tc>
@@ -1813,217 +1813,15 @@
     <w:p>
       <w:pPr>
         <w:keepNext/>
-        <w:pBdr>
-          <w:top w:val="single" w:color="999999" w:sz="4"/>
-          <w:left w:val="single" w:color="999999" w:sz="4"/>
-          <w:bottom w:val="single" w:color="999999" w:sz="4"/>
-          <w:right w:val="single" w:color="999999" w:sz="4"/>
-        </w:pBdr>
-        <w:shd w:fill="F3F4F6" w:val="clear"/>
         <w:spacing w:after="60" w:before="120"/>
         <w:jc w:val="center"/>
       </w:pPr>
       <w:r>
-        <w:rPr>
-          <w:rFonts w:ascii="Times New Roman" w:cs="Times New Roman" w:eastAsia="Times New Roman" w:hAnsi="Times New Roman"/>
-          <w:i/>
-          <w:iCs/>
-          <w:color w:val="666666"/>
-          <w:sz w:val="24"/>
-          <w:szCs w:val="24"/>
-        </w:rPr>
-        <w:t xml:space="preserve">[Здесь будет скриншот: 03_dialog.png]</w:t>
-      </w:r>
-    </w:p>
-    <w:p>
-      <w:pPr>
-        <w:spacing w:after="240"/>
-        <w:jc w:val="center"/>
-      </w:pPr>
-      <w:r>
-        <w:rPr>
-          <w:rFonts w:ascii="Times New Roman" w:cs="Times New Roman" w:eastAsia="Times New Roman" w:hAnsi="Times New Roman"/>
-          <w:sz w:val="24"/>
-          <w:szCs w:val="24"/>
-        </w:rPr>
-        <w:t xml:space="preserve">Рисунок 1 — Окно добавления нескольких тем</w:t>
-      </w:r>
-    </w:p>
-    <w:p>
-      <w:pPr>
-        <w:pStyle w:val="Heading2"/>
-        <w:keepNext/>
-        <w:spacing w:after="120" w:before="240"/>
-      </w:pPr>
-      <w:bookmarkStart w:name="_Toc7" w:id="7"/>
-      <w:r>
-        <w:rPr>
-          <w:rFonts w:ascii="Times New Roman" w:cs="Times New Roman" w:eastAsia="Times New Roman" w:hAnsi="Times New Roman"/>
-          <w:b/>
-          <w:bCs/>
-          <w:sz w:val="28"/>
-          <w:szCs w:val="28"/>
-        </w:rPr>
-        <w:t xml:space="preserve">4.3. Распределение по дням</w:t>
-      </w:r>
-      <w:bookmarkEnd w:id="7"/>
-    </w:p>
-    <w:p>
-      <w:pPr>
-        <w:spacing w:after="120" w:line="360"/>
-        <w:ind w:firstLine="709"/>
-        <w:jc w:val="both"/>
-      </w:pPr>
-      <w:r>
-        <w:rPr>
-          <w:rFonts w:ascii="Times New Roman" w:cs="Times New Roman" w:eastAsia="Times New Roman" w:hAnsi="Times New Roman"/>
-          <w:sz w:val="28"/>
-          <w:szCs w:val="28"/>
-        </w:rPr>
-        <w:t xml:space="preserve">План пересобирается после каждого изменения. Правила такие:</w:t>
-      </w:r>
-    </w:p>
-    <w:p>
-      <w:pPr>
-        <w:pStyle w:val="ListParagraph"/>
-        <w:numPr>
-          <w:ilvl w:val="0"/>
-          <w:numId w:val="2"/>
-        </w:numPr>
-        <w:spacing w:after="60" w:line="360"/>
-        <w:jc w:val="both"/>
-      </w:pPr>
-      <w:r>
-        <w:rPr>
-          <w:rFonts w:ascii="Times New Roman" w:cs="Times New Roman" w:eastAsia="Times New Roman" w:hAnsi="Times New Roman"/>
-          <w:sz w:val="28"/>
-          <w:szCs w:val="28"/>
-        </w:rPr>
-        <w:t xml:space="preserve">часов на тему столько же, какова её сложность;</w:t>
-      </w:r>
-    </w:p>
-    <w:p>
-      <w:pPr>
-        <w:pStyle w:val="ListParagraph"/>
-        <w:numPr>
-          <w:ilvl w:val="0"/>
-          <w:numId w:val="2"/>
-        </w:numPr>
-        <w:spacing w:after="60" w:line="360"/>
-        <w:jc w:val="both"/>
-      </w:pPr>
-      <w:r>
-        <w:rPr>
-          <w:rFonts w:ascii="Times New Roman" w:cs="Times New Roman" w:eastAsia="Times New Roman" w:hAnsi="Times New Roman"/>
-          <w:sz w:val="28"/>
-          <w:szCs w:val="28"/>
-        </w:rPr>
-        <w:t xml:space="preserve">в день ставится не больше заданного числа часов (по умолчанию 4) и не больше 2 часов одной темы, поэтому большая тема растягивается на несколько дней по 1–2 часа;</w:t>
-      </w:r>
-    </w:p>
-    <w:p>
-      <w:pPr>
-        <w:pStyle w:val="ListParagraph"/>
-        <w:numPr>
-          <w:ilvl w:val="0"/>
-          <w:numId w:val="2"/>
-        </w:numPr>
-        <w:spacing w:after="60" w:line="360"/>
-        <w:jc w:val="both"/>
-      </w:pPr>
-      <w:r>
-        <w:rPr>
-          <w:rFonts w:ascii="Times New Roman" w:cs="Times New Roman" w:eastAsia="Times New Roman" w:hAnsi="Times New Roman"/>
-          <w:sz w:val="28"/>
-          <w:szCs w:val="28"/>
-        </w:rPr>
-        <w:t xml:space="preserve">первыми идут самые сложные темы ближайшего события;</w:t>
-      </w:r>
-    </w:p>
-    <w:p>
-      <w:pPr>
-        <w:pStyle w:val="ListParagraph"/>
-        <w:numPr>
-          <w:ilvl w:val="0"/>
-          <w:numId w:val="2"/>
-        </w:numPr>
-        <w:spacing w:after="60" w:line="360"/>
-        <w:jc w:val="both"/>
-      </w:pPr>
-      <w:r>
-        <w:rPr>
-          <w:rFonts w:ascii="Times New Roman" w:cs="Times New Roman" w:eastAsia="Times New Roman" w:hAnsi="Times New Roman"/>
-          <w:sz w:val="28"/>
-          <w:szCs w:val="28"/>
-        </w:rPr>
-        <w:t xml:space="preserve">день перед экзаменом отдан под повторение (2 часа), перед контрольной ставится 1 час, в день самого события занятий нет;</w:t>
-      </w:r>
-    </w:p>
-    <w:p>
-      <w:pPr>
-        <w:pStyle w:val="ListParagraph"/>
-        <w:numPr>
-          <w:ilvl w:val="0"/>
-          <w:numId w:val="2"/>
-        </w:numPr>
-        <w:spacing w:after="60" w:line="360"/>
-        <w:jc w:val="both"/>
-      </w:pPr>
-      <w:r>
-        <w:rPr>
-          <w:rFonts w:ascii="Times New Roman" w:cs="Times New Roman" w:eastAsia="Times New Roman" w:hAnsi="Times New Roman"/>
-          <w:sz w:val="28"/>
-          <w:szCs w:val="28"/>
-        </w:rPr>
-        <w:t xml:space="preserve">если темы не помещаются в срок, дни не перегружаются: программа показывает, какие темы под угрозой.</w:t>
-      </w:r>
-    </w:p>
-    <w:p>
-      <w:pPr>
-        <w:pStyle w:val="Heading2"/>
-        <w:keepNext/>
-        <w:spacing w:after="120" w:before="240"/>
-      </w:pPr>
-      <w:bookmarkStart w:name="_Toc8" w:id="8"/>
-      <w:r>
-        <w:rPr>
-          <w:rFonts w:ascii="Times New Roman" w:cs="Times New Roman" w:eastAsia="Times New Roman" w:hAnsi="Times New Roman"/>
-          <w:b/>
-          <w:bCs/>
-          <w:sz w:val="28"/>
-          <w:szCs w:val="28"/>
-        </w:rPr>
-        <w:t xml:space="preserve">4.4. Пересчёт плана</w:t>
-      </w:r>
-      <w:bookmarkEnd w:id="8"/>
-    </w:p>
-    <w:p>
-      <w:pPr>
-        <w:spacing w:after="120" w:line="360"/>
-        <w:ind w:firstLine="709"/>
-        <w:jc w:val="both"/>
-      </w:pPr>
-      <w:r>
-        <w:rPr>
-          <w:rFonts w:ascii="Times New Roman" w:cs="Times New Roman" w:eastAsia="Times New Roman" w:hAnsi="Times New Roman"/>
-          <w:sz w:val="28"/>
-          <w:szCs w:val="28"/>
-        </w:rPr>
-        <w:t xml:space="preserve">Если вы отстали, нажмите «Перепланировать». Для каждой темы мы запоминаем день, на который её поставили. Невыполненные темы с прошедшим днём планируются заново с сегодняшнего дня. Программа пишет, что перенесла, и предупреждает о темах, которые уже не успеть. Выполненные темы отмечаются кнопкой «Готово» и в плане больше не участвуют.</w:t>
-      </w:r>
-    </w:p>
-    <w:p>
-      <w:pPr>
-        <w:keepNext/>
-        <w:spacing w:after="60" w:before="120"/>
-        <w:jc w:val="center"/>
-      </w:pPr>
-      <w:r>
         <w:drawing>
           <wp:inline distT="0" distB="0" distL="0" distR="0">
-            <wp:extent cx="5334000" cy="3838575"/>
+            <wp:extent cx="3619500" cy="2714625"/>
             <wp:effectExtent t="0" r="0" b="0" l="0"/>
-            <wp:docPr id="1" name="s4_risk_gantt.png" descr="Предупреждение: темы не помещаются до экзамена (лимит 2 часа в день)" title="Предупреждение: темы не помещаются до экзамена (лимит 2 часа в день)"/>
+            <wp:docPr id="1" name="03_dialog.png" descr="Окно добавления нескольких тем" title="Окно добавления нескольких тем"/>
             <wp:cNvGraphicFramePr>
               <a:graphicFrameLocks xmlns:a="http://schemas.openxmlformats.org/drawingml/2006/main" noChangeAspect="1"/>
             </wp:cNvGraphicFramePr>
@@ -2046,6 +1844,249 @@
                   <pic:spPr bwMode="auto">
                     <a:xfrm>
                       <a:off x="0" y="0"/>
+                      <a:ext cx="3619500" cy="2714625"/>
+                    </a:xfrm>
+                    <a:prstGeom prst="rect">
+                      <a:avLst/>
+                    </a:prstGeom>
+                  </pic:spPr>
+                </pic:pic>
+              </a:graphicData>
+            </a:graphic>
+          </wp:inline>
+        </w:drawing>
+      </w:r>
+    </w:p>
+    <w:p>
+      <w:pPr>
+        <w:spacing w:after="240"/>
+        <w:jc w:val="center"/>
+      </w:pPr>
+      <w:r>
+        <w:rPr>
+          <w:rFonts w:ascii="Times New Roman" w:cs="Times New Roman" w:eastAsia="Times New Roman" w:hAnsi="Times New Roman"/>
+          <w:sz w:val="24"/>
+          <w:szCs w:val="24"/>
+        </w:rPr>
+        <w:t xml:space="preserve">Рисунок 1 — Окно добавления нескольких тем</w:t>
+      </w:r>
+    </w:p>
+    <w:p>
+      <w:pPr>
+        <w:pStyle w:val="Heading2"/>
+        <w:keepNext/>
+        <w:spacing w:after="120" w:before="240"/>
+      </w:pPr>
+      <w:bookmarkStart w:name="_Toc7" w:id="7"/>
+      <w:r>
+        <w:rPr>
+          <w:rFonts w:ascii="Times New Roman" w:cs="Times New Roman" w:eastAsia="Times New Roman" w:hAnsi="Times New Roman"/>
+          <w:b/>
+          <w:bCs/>
+          <w:sz w:val="28"/>
+          <w:szCs w:val="28"/>
+        </w:rPr>
+        <w:t xml:space="preserve">4.3. Распределение по дням</w:t>
+      </w:r>
+      <w:bookmarkEnd w:id="7"/>
+    </w:p>
+    <w:p>
+      <w:pPr>
+        <w:spacing w:after="120" w:line="360"/>
+        <w:ind w:firstLine="709"/>
+        <w:jc w:val="both"/>
+      </w:pPr>
+      <w:r>
+        <w:rPr>
+          <w:rFonts w:ascii="Times New Roman" w:cs="Times New Roman" w:eastAsia="Times New Roman" w:hAnsi="Times New Roman"/>
+          <w:sz w:val="28"/>
+          <w:szCs w:val="28"/>
+        </w:rPr>
+        <w:t xml:space="preserve">План пересобирается после каждого изменения. Правила такие:</w:t>
+      </w:r>
+    </w:p>
+    <w:p>
+      <w:pPr>
+        <w:pStyle w:val="ListParagraph"/>
+        <w:numPr>
+          <w:ilvl w:val="0"/>
+          <w:numId w:val="2"/>
+        </w:numPr>
+        <w:spacing w:after="60" w:line="360"/>
+        <w:jc w:val="both"/>
+      </w:pPr>
+      <w:r>
+        <w:rPr>
+          <w:rFonts w:ascii="Times New Roman" w:cs="Times New Roman" w:eastAsia="Times New Roman" w:hAnsi="Times New Roman"/>
+          <w:sz w:val="28"/>
+          <w:szCs w:val="28"/>
+        </w:rPr>
+        <w:t xml:space="preserve">часов на тему столько же, какова её сложность;</w:t>
+      </w:r>
+    </w:p>
+    <w:p>
+      <w:pPr>
+        <w:pStyle w:val="ListParagraph"/>
+        <w:numPr>
+          <w:ilvl w:val="0"/>
+          <w:numId w:val="2"/>
+        </w:numPr>
+        <w:spacing w:after="60" w:line="360"/>
+        <w:jc w:val="both"/>
+      </w:pPr>
+      <w:r>
+        <w:rPr>
+          <w:rFonts w:ascii="Times New Roman" w:cs="Times New Roman" w:eastAsia="Times New Roman" w:hAnsi="Times New Roman"/>
+          <w:sz w:val="28"/>
+          <w:szCs w:val="28"/>
+        </w:rPr>
+        <w:t xml:space="preserve">часы события делятся поровну на все дни до повторения: если тем мало, занятия идут через день-два, а не в первый же день, и срок не остаётся пустым;</w:t>
+      </w:r>
+    </w:p>
+    <w:p>
+      <w:pPr>
+        <w:pStyle w:val="ListParagraph"/>
+        <w:numPr>
+          <w:ilvl w:val="0"/>
+          <w:numId w:val="2"/>
+        </w:numPr>
+        <w:spacing w:after="60" w:line="360"/>
+        <w:jc w:val="both"/>
+      </w:pPr>
+      <w:r>
+        <w:rPr>
+          <w:rFonts w:ascii="Times New Roman" w:cs="Times New Roman" w:eastAsia="Times New Roman" w:hAnsi="Times New Roman"/>
+          <w:sz w:val="28"/>
+          <w:szCs w:val="28"/>
+        </w:rPr>
+        <w:t xml:space="preserve">в день ставится не больше заданного числа часов (по умолчанию 4) и не больше 2 часов одной темы, поэтому большая тема растягивается на несколько дней по 1–2 часа;</w:t>
+      </w:r>
+    </w:p>
+    <w:p>
+      <w:pPr>
+        <w:pStyle w:val="ListParagraph"/>
+        <w:numPr>
+          <w:ilvl w:val="0"/>
+          <w:numId w:val="2"/>
+        </w:numPr>
+        <w:spacing w:after="60" w:line="360"/>
+        <w:jc w:val="both"/>
+      </w:pPr>
+      <w:r>
+        <w:rPr>
+          <w:rFonts w:ascii="Times New Roman" w:cs="Times New Roman" w:eastAsia="Times New Roman" w:hAnsi="Times New Roman"/>
+          <w:sz w:val="28"/>
+          <w:szCs w:val="28"/>
+        </w:rPr>
+        <w:t xml:space="preserve">первыми идут самые сложные темы ближайшего события;</w:t>
+      </w:r>
+    </w:p>
+    <w:p>
+      <w:pPr>
+        <w:pStyle w:val="ListParagraph"/>
+        <w:numPr>
+          <w:ilvl w:val="0"/>
+          <w:numId w:val="2"/>
+        </w:numPr>
+        <w:spacing w:after="60" w:line="360"/>
+        <w:jc w:val="both"/>
+      </w:pPr>
+      <w:r>
+        <w:rPr>
+          <w:rFonts w:ascii="Times New Roman" w:cs="Times New Roman" w:eastAsia="Times New Roman" w:hAnsi="Times New Roman"/>
+          <w:sz w:val="28"/>
+          <w:szCs w:val="28"/>
+        </w:rPr>
+        <w:t xml:space="preserve">день перед экзаменом отдан под повторение (2 часа), перед контрольной ставится 1 час, в день самого события занятий нет;</w:t>
+      </w:r>
+    </w:p>
+    <w:p>
+      <w:pPr>
+        <w:pStyle w:val="ListParagraph"/>
+        <w:numPr>
+          <w:ilvl w:val="0"/>
+          <w:numId w:val="2"/>
+        </w:numPr>
+        <w:spacing w:after="60" w:line="360"/>
+        <w:jc w:val="both"/>
+      </w:pPr>
+      <w:r>
+        <w:rPr>
+          <w:rFonts w:ascii="Times New Roman" w:cs="Times New Roman" w:eastAsia="Times New Roman" w:hAnsi="Times New Roman"/>
+          <w:sz w:val="28"/>
+          <w:szCs w:val="28"/>
+        </w:rPr>
+        <w:t xml:space="preserve">если темы не помещаются в срок, дни не перегружаются: программа показывает, какие темы под угрозой.</w:t>
+      </w:r>
+    </w:p>
+    <w:p>
+      <w:pPr>
+        <w:pStyle w:val="Heading2"/>
+        <w:keepNext/>
+        <w:spacing w:after="120" w:before="240"/>
+      </w:pPr>
+      <w:bookmarkStart w:name="_Toc8" w:id="8"/>
+      <w:r>
+        <w:rPr>
+          <w:rFonts w:ascii="Times New Roman" w:cs="Times New Roman" w:eastAsia="Times New Roman" w:hAnsi="Times New Roman"/>
+          <w:b/>
+          <w:bCs/>
+          <w:sz w:val="28"/>
+          <w:szCs w:val="28"/>
+        </w:rPr>
+        <w:t xml:space="preserve">4.4. Пересчёт плана</w:t>
+      </w:r>
+      <w:bookmarkEnd w:id="8"/>
+    </w:p>
+    <w:p>
+      <w:pPr>
+        <w:spacing w:after="120" w:line="360"/>
+        <w:ind w:firstLine="709"/>
+        <w:jc w:val="both"/>
+      </w:pPr>
+      <w:r>
+        <w:rPr>
+          <w:rFonts w:ascii="Times New Roman" w:cs="Times New Roman" w:eastAsia="Times New Roman" w:hAnsi="Times New Roman"/>
+          <w:sz w:val="28"/>
+          <w:szCs w:val="28"/>
+        </w:rPr>
+        <w:t xml:space="preserve">Если вы отстали, нажмите «Перепланировать». Для каждой темы мы запоминаем день, на который её поставили. Невыполненные темы с прошедшим днём планируются заново с сегодняшнего дня. Программа пишет, что перенесла, и предупреждает о темах, которые уже не успеть. Выполненные темы отмечаются кнопкой «Готово» и в плане больше не участвуют.</w:t>
+      </w:r>
+    </w:p>
+    <w:p>
+      <w:pPr>
+        <w:keepNext/>
+        <w:spacing w:after="60" w:before="120"/>
+        <w:jc w:val="center"/>
+      </w:pPr>
+      <w:r>
+        <w:drawing>
+          <wp:inline distT="0" distB="0" distL="0" distR="0">
+            <wp:extent cx="5334000" cy="3838575"/>
+            <wp:effectExtent t="0" r="0" b="0" l="0"/>
+            <wp:docPr id="2" name="s4_risk_gantt.png" descr="Предупреждение: темы не помещаются до экзамена (лимит 2 часа в день)" title="Предупреждение: темы не помещаются до экзамена (лимит 2 часа в день)"/>
+            <wp:cNvGraphicFramePr>
+              <a:graphicFrameLocks xmlns:a="http://schemas.openxmlformats.org/drawingml/2006/main" noChangeAspect="1"/>
+            </wp:cNvGraphicFramePr>
+            <a:graphic xmlns:a="http://schemas.openxmlformats.org/drawingml/2006/main">
+              <a:graphicData uri="http://schemas.openxmlformats.org/drawingml/2006/picture">
+                <pic:pic xmlns:pic="http://schemas.openxmlformats.org/drawingml/2006/picture">
+                  <pic:nvPicPr>
+                    <pic:cNvPr id="0" name="" descr=""/>
+                    <pic:cNvPicPr>
+                      <a:picLocks noChangeAspect="1" noChangeArrowheads="1"/>
+                    </pic:cNvPicPr>
+                  </pic:nvPicPr>
+                  <pic:blipFill>
+                    <a:blip r:embed="rId9" cstate="none"/>
+                    <a:srcRect/>
+                    <a:stretch>
+                      <a:fillRect/>
+                    </a:stretch>
+                  </pic:blipFill>
+                  <pic:spPr bwMode="auto">
+                    <a:xfrm>
+                      <a:off x="0" y="0"/>
                       <a:ext cx="5334000" cy="3838575"/>
                     </a:xfrm>
                     <a:prstGeom prst="rect">
@@ -2110,26 +2151,48 @@
     <w:p>
       <w:pPr>
         <w:keepNext/>
-        <w:pBdr>
-          <w:top w:val="single" w:color="999999" w:sz="4"/>
-          <w:left w:val="single" w:color="999999" w:sz="4"/>
-          <w:bottom w:val="single" w:color="999999" w:sz="4"/>
-          <w:right w:val="single" w:color="999999" w:sz="4"/>
-        </w:pBdr>
-        <w:shd w:fill="F3F4F6" w:val="clear"/>
         <w:spacing w:after="60" w:before="120"/>
         <w:jc w:val="center"/>
       </w:pPr>
       <w:r>
-        <w:rPr>
-          <w:rFonts w:ascii="Times New Roman" w:cs="Times New Roman" w:eastAsia="Times New Roman" w:hAnsi="Times New Roman"/>
-          <w:i/>
-          <w:iCs/>
-          <w:color w:val="666666"/>
-          <w:sz w:val="24"/>
-          <w:szCs w:val="24"/>
-        </w:rPr>
-        <w:t xml:space="preserve">[Здесь будет скриншот: 01_calendar.png]</w:t>
+        <w:drawing>
+          <wp:inline distT="0" distB="0" distL="0" distR="0">
+            <wp:extent cx="5334000" cy="3838575"/>
+            <wp:effectExtent t="0" r="0" b="0" l="0"/>
+            <wp:docPr id="3" name="01_calendar.png" descr="Календарь нагрузки" title="Календарь нагрузки"/>
+            <wp:cNvGraphicFramePr>
+              <a:graphicFrameLocks xmlns:a="http://schemas.openxmlformats.org/drawingml/2006/main" noChangeAspect="1"/>
+            </wp:cNvGraphicFramePr>
+            <a:graphic xmlns:a="http://schemas.openxmlformats.org/drawingml/2006/main">
+              <a:graphicData uri="http://schemas.openxmlformats.org/drawingml/2006/picture">
+                <pic:pic xmlns:pic="http://schemas.openxmlformats.org/drawingml/2006/picture">
+                  <pic:nvPicPr>
+                    <pic:cNvPr id="0" name="" descr=""/>
+                    <pic:cNvPicPr>
+                      <a:picLocks noChangeAspect="1" noChangeArrowheads="1"/>
+                    </pic:cNvPicPr>
+                  </pic:nvPicPr>
+                  <pic:blipFill>
+                    <a:blip r:embed="rId10" cstate="none"/>
+                    <a:srcRect/>
+                    <a:stretch>
+                      <a:fillRect/>
+                    </a:stretch>
+                  </pic:blipFill>
+                  <pic:spPr bwMode="auto">
+                    <a:xfrm>
+                      <a:off x="0" y="0"/>
+                      <a:ext cx="5334000" cy="3838575"/>
+                    </a:xfrm>
+                    <a:prstGeom prst="rect">
+                      <a:avLst/>
+                    </a:prstGeom>
+                  </pic:spPr>
+                </pic:pic>
+              </a:graphicData>
+            </a:graphic>
+          </wp:inline>
+        </w:drawing>
       </w:r>
     </w:p>
     <w:p>
@@ -2164,26 +2227,48 @@
     <w:p>
       <w:pPr>
         <w:keepNext/>
-        <w:pBdr>
-          <w:top w:val="single" w:color="999999" w:sz="4"/>
-          <w:left w:val="single" w:color="999999" w:sz="4"/>
-          <w:bottom w:val="single" w:color="999999" w:sz="4"/>
-          <w:right w:val="single" w:color="999999" w:sz="4"/>
-        </w:pBdr>
-        <w:shd w:fill="F3F4F6" w:val="clear"/>
         <w:spacing w:after="60" w:before="120"/>
         <w:jc w:val="center"/>
       </w:pPr>
       <w:r>
-        <w:rPr>
-          <w:rFonts w:ascii="Times New Roman" w:cs="Times New Roman" w:eastAsia="Times New Roman" w:hAnsi="Times New Roman"/>
-          <w:i/>
-          <w:iCs/>
-          <w:color w:val="666666"/>
-          <w:sz w:val="24"/>
-          <w:szCs w:val="24"/>
-        </w:rPr>
-        <w:t xml:space="preserve">[Здесь будет скриншот: 02_gantt.png]</w:t>
+        <w:drawing>
+          <wp:inline distT="0" distB="0" distL="0" distR="0">
+            <wp:extent cx="5334000" cy="3838575"/>
+            <wp:effectExtent t="0" r="0" b="0" l="0"/>
+            <wp:docPr id="4" name="02_gantt.png" descr="Диаграмма Ганта" title="Диаграмма Ганта"/>
+            <wp:cNvGraphicFramePr>
+              <a:graphicFrameLocks xmlns:a="http://schemas.openxmlformats.org/drawingml/2006/main" noChangeAspect="1"/>
+            </wp:cNvGraphicFramePr>
+            <a:graphic xmlns:a="http://schemas.openxmlformats.org/drawingml/2006/main">
+              <a:graphicData uri="http://schemas.openxmlformats.org/drawingml/2006/picture">
+                <pic:pic xmlns:pic="http://schemas.openxmlformats.org/drawingml/2006/picture">
+                  <pic:nvPicPr>
+                    <pic:cNvPr id="0" name="" descr=""/>
+                    <pic:cNvPicPr>
+                      <a:picLocks noChangeAspect="1" noChangeArrowheads="1"/>
+                    </pic:cNvPicPr>
+                  </pic:nvPicPr>
+                  <pic:blipFill>
+                    <a:blip r:embed="rId11" cstate="none"/>
+                    <a:srcRect/>
+                    <a:stretch>
+                      <a:fillRect/>
+                    </a:stretch>
+                  </pic:blipFill>
+                  <pic:spPr bwMode="auto">
+                    <a:xfrm>
+                      <a:off x="0" y="0"/>
+                      <a:ext cx="5334000" cy="3838575"/>
+                    </a:xfrm>
+                    <a:prstGeom prst="rect">
+                      <a:avLst/>
+                    </a:prstGeom>
+                  </pic:spPr>
+                </pic:pic>
+              </a:graphicData>
+            </a:graphic>
+          </wp:inline>
+        </w:drawing>
       </w:r>
     </w:p>
     <w:p>
@@ -3410,7 +3495,7 @@
           <w:sz w:val="28"/>
           <w:szCs w:val="28"/>
         </w:rPr>
-        <w:t xml:space="preserve">Метод build_plan работает так. Сначала собираются закрытые для учёбы дни: дни событий и дни перед ними. На день перед каждым событием ставится повторение. Потом события обходятся по возрастанию даты, а темы внутри события по убыванию сложности. Для каждой темы перебираются дни от сегодняшнего до последнего учебного (за два дня до события). В свободный день ставится порция часов: не больше свободного места в дне и не больше лимита на одну тему. Хватило дней — тема размещена, не хватило — она попадает в список «под угрозой».</w:t>
+        <w:t xml:space="preserve">Метод build_plan работает так. Сначала собираются закрытые для учёбы дни: дни событий и дни перед ними. На день перед каждым событием ставится повторение. Потом события обходятся по возрастанию даты. Для каждого события выбираются учебные дни от сегодняшнего до дня за два дня до события, в которых есть свободное время. Все часы события (сумма часов его тем) равномерно раскладываются на эти дни: k-й час попадает в день с номером floor((k + 0.5) · число дней / число часов). Так занятия растягиваются на весь срок, а не копятся в первых днях. Темы идут по убыванию сложности, часы каждого дня отдаются им по очереди, но не больше лимита на тему в день. Если из-за лимитов часть часов не встала, она ставится в самые свободные дни срока. Что не поместилось даже так, попадает в список «под угрозой».</w:t>
       </w:r>
     </w:p>
     <w:p>
@@ -3470,7 +3555,7 @@
           <w:sz w:val="22"/>
           <w:szCs w:val="22"/>
         </w:rPr>
-        <w:t xml:space="preserve">    для темы в порядке убывания сложности:</w:t>
+        <w:t xml:space="preserve">    дни = учебные дни до (дата события - 2 дня) со свободным временем</w:t>
       </w:r>
     </w:p>
     <w:p>
@@ -3485,7 +3570,7 @@
           <w:sz w:val="22"/>
           <w:szCs w:val="22"/>
         </w:rPr>
-        <w:t xml:space="preserve">        осталось = часы темы</w:t>
+        <w:t xml:space="preserve">    часы = сумма часов тем события</w:t>
       </w:r>
     </w:p>
     <w:p>
@@ -3500,7 +3585,7 @@
           <w:sz w:val="22"/>
           <w:szCs w:val="22"/>
         </w:rPr>
-        <w:t xml:space="preserve">        для дня от сегодня до (дата события - 2 дня):</w:t>
+        <w:t xml:space="preserve">    k-й час -&gt; день номер floor((k + 0.5) * len(дни) / часы)   # равномерно</w:t>
       </w:r>
     </w:p>
     <w:p>
@@ -3515,7 +3600,7 @@
           <w:sz w:val="22"/>
           <w:szCs w:val="22"/>
         </w:rPr>
-        <w:t xml:space="preserve">            если день не закрыт и в нём есть место:</w:t>
+        <w:t xml:space="preserve">    для каждого дня: отдать часы дня темам по очереди (сложные первыми),</w:t>
       </w:r>
     </w:p>
     <w:p>
@@ -3530,13 +3615,13 @@
           <w:sz w:val="22"/>
           <w:szCs w:val="22"/>
         </w:rPr>
-        <w:t xml:space="preserve">                порция = min(место в дне, осталось, лимит на тему)</w:t>
+        <w:t xml:space="preserve">                     не больше лимита на тему и лимита дня</w:t>
       </w:r>
     </w:p>
     <w:p>
       <w:pPr>
         <w:shd w:fill="F3F4F6" w:val="clear"/>
-        <w:spacing w:after="0" w:line="260"/>
+        <w:spacing w:after="200" w:line="260"/>
         <w:ind w:left="200" w:right="200"/>
       </w:pPr>
       <w:r>
@@ -3545,22 +3630,7 @@
           <w:sz w:val="22"/>
           <w:szCs w:val="22"/>
         </w:rPr>
-        <w:t xml:space="preserve">                поставить порцию в план; осталось -= порция</w:t>
-      </w:r>
-    </w:p>
-    <w:p>
-      <w:pPr>
-        <w:shd w:fill="F3F4F6" w:val="clear"/>
-        <w:spacing w:after="200" w:line="260"/>
-        <w:ind w:left="200" w:right="200"/>
-      </w:pPr>
-      <w:r>
-        <w:rPr>
-          <w:rFonts w:ascii="Courier New" w:cs="Courier New" w:eastAsia="Courier New" w:hAnsi="Courier New"/>
-          <w:sz w:val="22"/>
-          <w:szCs w:val="22"/>
-        </w:rPr>
-        <w:t xml:space="preserve">        если осталось &gt; 0: добавить тему в «под угрозой»</w:t>
+        <w:t xml:space="preserve">    остаток -&gt; в самые свободные дни; что не влезло -&gt; «под угрозой»</w:t>
       </w:r>
     </w:p>
     <w:p>
@@ -4262,7 +4332,7 @@
           <w:sz w:val="28"/>
           <w:szCs w:val="28"/>
         </w:rPr>
-        <w:t xml:space="preserve">Логику проверяют 80 автотестов на pytest (папка tests). Они смотрят, как программа реагирует на неверные даты, сложность и лимиты, не превышаются ли лимиты часов, остаётся ли день перед экзаменом только под повторение, как тема растягивается по дням, как работают перепланирование, автоподбор сложности и списки предметов. Отдельно проверено чтение и запись CSV: повреждённые и неполные файлы, файлы с BOM. Результат запуска: 80 passed.</w:t>
+        <w:t xml:space="preserve">Логику проверяют 83 автотеста на pytest (папка tests). Они смотрят, как программа реагирует на неверные даты, сложность и лимиты, не превышаются ли лимиты часов, остаётся ли день перед экзаменом только под повторение, как тема растягивается по дням, как работают перепланирование, автоподбор сложности и списки предметов. Отдельно проверено чтение и запись CSV: повреждённые и неполные файлы, файлы с BOM. Результат запуска: 83 passed.</w:t>
       </w:r>
     </w:p>
     <w:p>
@@ -5013,7 +5083,7 @@
           <w:sz w:val="22"/>
           <w:szCs w:val="22"/>
         </w:rPr>
-        <w:t xml:space="preserve">01.10  4 ч: Кинематика (2 ч), Оптика (2 ч)</w:t>
+        <w:t xml:space="preserve">01.10  3 ч: Кинематика (2 ч), Интегралы (1 ч)</w:t>
       </w:r>
     </w:p>
     <w:p>
@@ -5028,7 +5098,7 @@
           <w:sz w:val="22"/>
           <w:szCs w:val="22"/>
         </w:rPr>
-        <w:t xml:space="preserve">02.10  4 ч: Кинематика (2 ч), Оптика (2 ч)</w:t>
+        <w:t xml:space="preserve">02.10  4 ч: Кинематика (2 ч), Интегралы (2 ч)</w:t>
       </w:r>
     </w:p>
     <w:p>
@@ -5043,7 +5113,7 @@
           <w:sz w:val="22"/>
           <w:szCs w:val="22"/>
         </w:rPr>
-        <w:t xml:space="preserve">03.10  4 ч: Интегралы (2 ч), Ряды (2 ч)</w:t>
+        <w:t xml:space="preserve">03.10  3 ч: Оптика (2 ч), Интегралы (1 ч)</w:t>
       </w:r>
     </w:p>
     <w:p>
@@ -5058,7 +5128,7 @@
           <w:sz w:val="22"/>
           <w:szCs w:val="22"/>
         </w:rPr>
-        <w:t xml:space="preserve">04.10  4 ч: Интегралы (2 ч), Ряды (1 ч), Введение в анализ (1 ч)</w:t>
+        <w:t xml:space="preserve">04.10  4 ч: Оптика (2 ч), Интегралы (1 ч), Ряды (1 ч)</w:t>
       </w:r>
     </w:p>
     <w:p>
@@ -5088,7 +5158,7 @@
           <w:sz w:val="22"/>
           <w:szCs w:val="22"/>
         </w:rPr>
-        <w:t xml:space="preserve">07.10  2 ч: Интегралы (1 ч), Введение в анализ (1 ч)</w:t>
+        <w:t xml:space="preserve">07.10  1 ч: Ряды (1 ч)</w:t>
       </w:r>
     </w:p>
     <w:p>
@@ -5103,6 +5173,36 @@
           <w:sz w:val="22"/>
           <w:szCs w:val="22"/>
         </w:rPr>
+        <w:t xml:space="preserve">08.10  2 ч: Ряды (1 ч), Введение в анализ (1 ч)</w:t>
+      </w:r>
+    </w:p>
+    <w:p>
+      <w:pPr>
+        <w:shd w:fill="F3F4F6" w:val="clear"/>
+        <w:spacing w:after="0" w:line="260"/>
+        <w:ind w:left="200" w:right="200"/>
+      </w:pPr>
+      <w:r>
+        <w:rPr>
+          <w:rFonts w:ascii="Courier New" w:cs="Courier New" w:eastAsia="Courier New" w:hAnsi="Courier New"/>
+          <w:sz w:val="22"/>
+          <w:szCs w:val="22"/>
+        </w:rPr>
+        <w:t xml:space="preserve">09.10  1 ч: Введение в анализ (1 ч)</w:t>
+      </w:r>
+    </w:p>
+    <w:p>
+      <w:pPr>
+        <w:shd w:fill="F3F4F6" w:val="clear"/>
+        <w:spacing w:after="0" w:line="260"/>
+        <w:ind w:left="200" w:right="200"/>
+      </w:pPr>
+      <w:r>
+        <w:rPr>
+          <w:rFonts w:ascii="Courier New" w:cs="Courier New" w:eastAsia="Courier New" w:hAnsi="Courier New"/>
+          <w:sz w:val="22"/>
+          <w:szCs w:val="22"/>
+        </w:rPr>
         <w:t xml:space="preserve">10.10  2 ч: Повторение · Математика (2 ч)</w:t>
       </w:r>
     </w:p>
@@ -5148,7 +5248,7 @@
           <w:sz w:val="22"/>
           <w:szCs w:val="22"/>
         </w:rPr>
-        <w:t xml:space="preserve">Перенесено вперёд: ['Ряды', 'Кинематика', 'Оптика']</w:t>
+        <w:t xml:space="preserve">Перенесено вперёд: ['Кинематика', 'Оптика']</w:t>
       </w:r>
     </w:p>
     <w:p>

</xml_diff>

<commit_message>
Clean up project: remove helper scripts and tests, simple comments, short README
Co-Authored-By: Claude Sonnet 5.5 <noreply@anthropic.com>
</commit_message>
<xml_diff>
--- a/docs/Отчёт_Планировщик_экзаменов.docx
+++ b/docs/Отчёт_Планировщик_экзаменов.docx
@@ -528,7 +528,7 @@
           </w:pPr>
           <w:hyperlink w:history="1" w:anchor="_Toc17">
             <w:r>
-              <w:t xml:space="preserve">7. Тестирование</w:t>
+              <w:t xml:space="preserve">7. Примеры работы программы</w:t>
             </w:r>
             <w:r>
               <w:tab/>
@@ -543,14 +543,14 @@
         </w:p>
         <w:p>
           <w:pPr>
-            <w:pStyle w:val="TOC2"/>
+            <w:pStyle w:val="TOC1"/>
             <w:tabs>
               <w:tab w:val="right" w:pos="9355" w:leader="dot"/>
             </w:tabs>
           </w:pPr>
           <w:hyperlink w:history="1" w:anchor="_Toc18">
             <w:r>
-              <w:t xml:space="preserve">7.1. Автоматические тесты</w:t>
+              <w:t xml:space="preserve">8. Запуск программы</w:t>
             </w:r>
             <w:r>
               <w:tab/>
@@ -565,14 +565,14 @@
         </w:p>
         <w:p>
           <w:pPr>
-            <w:pStyle w:val="TOC2"/>
+            <w:pStyle w:val="TOC1"/>
             <w:tabs>
               <w:tab w:val="right" w:pos="9355" w:leader="dot"/>
             </w:tabs>
           </w:pPr>
           <w:hyperlink w:history="1" w:anchor="_Toc19">
             <w:r>
-              <w:t xml:space="preserve">7.2. Примеры ввода и вывода</w:t>
+              <w:t xml:space="preserve">9. Заключение</w:t>
             </w:r>
             <w:r>
               <w:tab/>
@@ -594,7 +594,7 @@
           </w:pPr>
           <w:hyperlink w:history="1" w:anchor="_Toc20">
             <w:r>
-              <w:t xml:space="preserve">8. Запуск программы</w:t>
+              <w:t xml:space="preserve">Приложение. Пример файлов данных</w:t>
             </w:r>
             <w:r>
               <w:tab/>
@@ -602,50 +602,6 @@
             <w:r>
               <w:fldChar w:fldCharType="begin" w:dirty="true"/>
               <w:instrText xml:space="preserve">PAGEREF _Toc20 \h</w:instrText>
-              <w:fldChar w:fldCharType="separate"/>
-              <w:fldChar w:fldCharType="end"/>
-            </w:r>
-          </w:hyperlink>
-        </w:p>
-        <w:p>
-          <w:pPr>
-            <w:pStyle w:val="TOC1"/>
-            <w:tabs>
-              <w:tab w:val="right" w:pos="9355" w:leader="dot"/>
-            </w:tabs>
-          </w:pPr>
-          <w:hyperlink w:history="1" w:anchor="_Toc21">
-            <w:r>
-              <w:t xml:space="preserve">9. Заключение</w:t>
-            </w:r>
-            <w:r>
-              <w:tab/>
-            </w:r>
-            <w:r>
-              <w:fldChar w:fldCharType="begin" w:dirty="true"/>
-              <w:instrText xml:space="preserve">PAGEREF _Toc21 \h</w:instrText>
-              <w:fldChar w:fldCharType="separate"/>
-              <w:fldChar w:fldCharType="end"/>
-            </w:r>
-          </w:hyperlink>
-        </w:p>
-        <w:p>
-          <w:pPr>
-            <w:pStyle w:val="TOC1"/>
-            <w:tabs>
-              <w:tab w:val="right" w:pos="9355" w:leader="dot"/>
-            </w:tabs>
-          </w:pPr>
-          <w:hyperlink w:history="1" w:anchor="_Toc22">
-            <w:r>
-              <w:t xml:space="preserve">Приложение. Пример файлов данных</w:t>
-            </w:r>
-            <w:r>
-              <w:tab/>
-            </w:r>
-            <w:r>
-              <w:fldChar w:fldCharType="begin" w:dirty="true"/>
-              <w:instrText xml:space="preserve">PAGEREF _Toc22 \h</w:instrText>
               <w:fldChar w:fldCharType="separate"/>
               <w:fldChar w:fldCharType="end"/>
             </w:r>
@@ -800,7 +756,7 @@
           <w:sz w:val="28"/>
           <w:szCs w:val="28"/>
         </w:rPr>
-        <w:t xml:space="preserve">Сверх задания мы сделали контрольные работы (несколько тем на одну дату), автоподбор сложности по названию темы, выпадающие списки с типовыми предметами и темами и автотесты.</w:t>
+        <w:t xml:space="preserve">Сверх задания мы сделали контрольные работы (несколько тем на одну дату), автоподбор сложности по названию темы, выпадающие списки с типовыми предметами и темами.</w:t>
       </w:r>
     </w:p>
     <w:p>
@@ -1229,66 +1185,6 @@
                 <w:sz w:val="24"/>
                 <w:szCs w:val="24"/>
               </w:rPr>
-              <w:t xml:space="preserve">pytest</w:t>
-            </w:r>
-          </w:p>
-        </w:tc>
-        <w:tc>
-          <w:tcPr>
-            <w:tcW w:type="dxa" w:w="6355"/>
-            <w:tcBorders>
-              <w:top w:val="single" w:color="999999" w:sz="4"/>
-              <w:left w:val="single" w:color="999999" w:sz="4"/>
-              <w:bottom w:val="single" w:color="999999" w:sz="4"/>
-              <w:right w:val="single" w:color="999999" w:sz="4"/>
-            </w:tcBorders>
-            <w:tcMar>
-              <w:top w:type="dxa" w:w="60"/>
-              <w:left w:type="dxa" w:w="100"/>
-              <w:bottom w:type="dxa" w:w="60"/>
-              <w:right w:type="dxa" w:w="100"/>
-            </w:tcMar>
-          </w:tcPr>
-          <w:p>
-            <w:r>
-              <w:rPr>
-                <w:rFonts w:ascii="Times New Roman" w:cs="Times New Roman" w:eastAsia="Times New Roman" w:hAnsi="Times New Roman"/>
-                <w:b w:val="false"/>
-                <w:bCs w:val="false"/>
-                <w:sz w:val="24"/>
-                <w:szCs w:val="24"/>
-              </w:rPr>
-              <w:t xml:space="preserve">автоматические тесты логики (83 теста)</w:t>
-            </w:r>
-          </w:p>
-        </w:tc>
-      </w:tr>
-      <w:tr>
-        <w:tc>
-          <w:tcPr>
-            <w:tcW w:type="dxa" w:w="3000"/>
-            <w:tcBorders>
-              <w:top w:val="single" w:color="999999" w:sz="4"/>
-              <w:left w:val="single" w:color="999999" w:sz="4"/>
-              <w:bottom w:val="single" w:color="999999" w:sz="4"/>
-              <w:right w:val="single" w:color="999999" w:sz="4"/>
-            </w:tcBorders>
-            <w:tcMar>
-              <w:top w:type="dxa" w:w="60"/>
-              <w:left w:type="dxa" w:w="100"/>
-              <w:bottom w:type="dxa" w:w="60"/>
-              <w:right w:type="dxa" w:w="100"/>
-            </w:tcMar>
-          </w:tcPr>
-          <w:p>
-            <w:r>
-              <w:rPr>
-                <w:rFonts w:ascii="Times New Roman" w:cs="Times New Roman" w:eastAsia="Times New Roman" w:hAnsi="Times New Roman"/>
-                <w:b w:val="false"/>
-                <w:bCs w:val="false"/>
-                <w:sz w:val="24"/>
-                <w:szCs w:val="24"/>
-              </w:rPr>
               <w:t xml:space="preserve">git</w:t>
             </w:r>
           </w:p>
@@ -1328,21 +1224,6 @@
       <w:pPr>
         <w:spacing w:after="120"/>
       </w:pPr>
-    </w:p>
-    <w:p>
-      <w:pPr>
-        <w:spacing w:after="120" w:line="360"/>
-        <w:ind w:firstLine="709"/>
-        <w:jc w:val="both"/>
-      </w:pPr>
-      <w:r>
-        <w:rPr>
-          <w:rFonts w:ascii="Times New Roman" w:cs="Times New Roman" w:eastAsia="Times New Roman" w:hAnsi="Times New Roman"/>
-          <w:sz w:val="28"/>
-          <w:szCs w:val="28"/>
-        </w:rPr>
-        <w:t xml:space="preserve">pytest ставится отдельно и нужен только для запуска тестов, сама программа работает без него.</w:t>
-      </w:r>
     </w:p>
     <w:p>
       <w:pPr>
@@ -1375,7 +1256,7 @@
           <w:sz w:val="28"/>
           <w:szCs w:val="28"/>
         </w:rPr>
-        <w:t xml:space="preserve">Код мы разделили на две части: логика лежит в папке planner, окно в папке ui. Логика ничего не знает про окно, поэтому тесты проверяют её без запуска интерфейса.</w:t>
+        <w:t xml:space="preserve">Код мы разделили на две части: логика лежит в папке planner, окно в папке ui. Логика ничего не знает про окно, поэтому её можно менять отдельно от окна.</w:t>
       </w:r>
     </w:p>
     <w:p>
@@ -1420,7 +1301,7 @@
           <w:sz w:val="22"/>
           <w:szCs w:val="22"/>
         </w:rPr>
-        <w:t xml:space="preserve">  demo.py            окно с примерными данными (для скриншотов)</w:t>
+        <w:t xml:space="preserve">  planner/           логика</w:t>
       </w:r>
     </w:p>
     <w:p>
@@ -1435,7 +1316,7 @@
           <w:sz w:val="22"/>
           <w:szCs w:val="22"/>
         </w:rPr>
-        <w:t xml:space="preserve">  planner/           логика</w:t>
+        <w:t xml:space="preserve">    models.py        классы Exam, Topic, проверка ввода</w:t>
       </w:r>
     </w:p>
     <w:p>
@@ -1450,7 +1331,7 @@
           <w:sz w:val="22"/>
           <w:szCs w:val="22"/>
         </w:rPr>
-        <w:t xml:space="preserve">    models.py        классы Exam, Topic, проверка ввода</w:t>
+        <w:t xml:space="preserve">    scheduler.py     класс Planner: построение и пересчёт плана</w:t>
       </w:r>
     </w:p>
     <w:p>
@@ -1465,7 +1346,7 @@
           <w:sz w:val="22"/>
           <w:szCs w:val="22"/>
         </w:rPr>
-        <w:t xml:space="preserve">    scheduler.py     класс Planner: построение и пересчёт плана</w:t>
+        <w:t xml:space="preserve">    estimator.py     автоподбор сложности темы (словари)</w:t>
       </w:r>
     </w:p>
     <w:p>
@@ -1480,7 +1361,7 @@
           <w:sz w:val="22"/>
           <w:szCs w:val="22"/>
         </w:rPr>
-        <w:t xml:space="preserve">    estimator.py     автоподбор сложности темы (словари)</w:t>
+        <w:t xml:space="preserve">    catalog.py       типовые предметы и темы для списков</w:t>
       </w:r>
     </w:p>
     <w:p>
@@ -1495,7 +1376,7 @@
           <w:sz w:val="22"/>
           <w:szCs w:val="22"/>
         </w:rPr>
-        <w:t xml:space="preserve">    catalog.py       типовые предметы и темы для списков</w:t>
+        <w:t xml:space="preserve">    storage.py       класс Storage: чтение и запись CSV</w:t>
       </w:r>
     </w:p>
     <w:p>
@@ -1510,7 +1391,7 @@
           <w:sz w:val="22"/>
           <w:szCs w:val="22"/>
         </w:rPr>
-        <w:t xml:space="preserve">    storage.py       класс Storage: чтение и запись CSV</w:t>
+        <w:t xml:space="preserve">    calview.py       сетка календаря и цвета нагрузки</w:t>
       </w:r>
     </w:p>
     <w:p>
@@ -1525,7 +1406,7 @@
           <w:sz w:val="22"/>
           <w:szCs w:val="22"/>
         </w:rPr>
-        <w:t xml:space="preserve">    calview.py       сетка календаря и цвета нагрузки</w:t>
+        <w:t xml:space="preserve">    ganttview.py     подготовка строк диаграммы Ганта</w:t>
       </w:r>
     </w:p>
     <w:p>
@@ -1540,7 +1421,7 @@
           <w:sz w:val="22"/>
           <w:szCs w:val="22"/>
         </w:rPr>
-        <w:t xml:space="preserve">    ganttview.py     подготовка строк диаграммы Ганта</w:t>
+        <w:t xml:space="preserve">    errors.py        собственные исключения</w:t>
       </w:r>
     </w:p>
     <w:p>
@@ -1555,7 +1436,7 @@
           <w:sz w:val="22"/>
           <w:szCs w:val="22"/>
         </w:rPr>
-        <w:t xml:space="preserve">    errors.py        собственные исключения</w:t>
+        <w:t xml:space="preserve">  ui/                окно tkinter</w:t>
       </w:r>
     </w:p>
     <w:p>
@@ -1570,7 +1451,7 @@
           <w:sz w:val="22"/>
           <w:szCs w:val="22"/>
         </w:rPr>
-        <w:t xml:space="preserve">  ui/                окно tkinter</w:t>
+        <w:t xml:space="preserve">    app.py           главное окно (класс App)</w:t>
       </w:r>
     </w:p>
     <w:p>
@@ -1585,7 +1466,7 @@
           <w:sz w:val="22"/>
           <w:szCs w:val="22"/>
         </w:rPr>
-        <w:t xml:space="preserve">    app.py           главное окно (класс App)</w:t>
+        <w:t xml:space="preserve">    gantt.py         диаграмма Ганта (класс GanttChart)</w:t>
       </w:r>
     </w:p>
     <w:p>
@@ -1600,7 +1481,7 @@
           <w:sz w:val="22"/>
           <w:szCs w:val="22"/>
         </w:rPr>
-        <w:t xml:space="preserve">    gantt.py         диаграмма Ганта (класс GanttChart)</w:t>
+        <w:t xml:space="preserve">    dialogs.py       диалог «Несколько тем»</w:t>
       </w:r>
     </w:p>
     <w:p>
@@ -1615,7 +1496,7 @@
           <w:sz w:val="22"/>
           <w:szCs w:val="22"/>
         </w:rPr>
-        <w:t xml:space="preserve">    dialogs.py       диалог «Несколько тем»</w:t>
+        <w:t xml:space="preserve">    widgets.py       поля ввода с подсказкой внутри</w:t>
       </w:r>
     </w:p>
     <w:p>
@@ -1630,52 +1511,7 @@
           <w:sz w:val="22"/>
           <w:szCs w:val="22"/>
         </w:rPr>
-        <w:t xml:space="preserve">    widgets.py       поля ввода с подсказкой внутри</w:t>
-      </w:r>
-    </w:p>
-    <w:p>
-      <w:pPr>
-        <w:shd w:fill="F3F4F6" w:val="clear"/>
-        <w:spacing w:after="0" w:line="260"/>
-        <w:ind w:left="200" w:right="200"/>
-      </w:pPr>
-      <w:r>
-        <w:rPr>
-          <w:rFonts w:ascii="Courier New" w:cs="Courier New" w:eastAsia="Courier New" w:hAnsi="Courier New"/>
-          <w:sz w:val="22"/>
-          <w:szCs w:val="22"/>
-        </w:rPr>
         <w:t xml:space="preserve">    theme.py         цвета и стили</w:t>
-      </w:r>
-    </w:p>
-    <w:p>
-      <w:pPr>
-        <w:shd w:fill="F3F4F6" w:val="clear"/>
-        <w:spacing w:after="0" w:line="260"/>
-        <w:ind w:left="200" w:right="200"/>
-      </w:pPr>
-      <w:r>
-        <w:rPr>
-          <w:rFonts w:ascii="Courier New" w:cs="Courier New" w:eastAsia="Courier New" w:hAnsi="Courier New"/>
-          <w:sz w:val="22"/>
-          <w:szCs w:val="22"/>
-        </w:rPr>
-        <w:t xml:space="preserve">  tests/             автоматические тесты (pytest)</w:t>
-      </w:r>
-    </w:p>
-    <w:p>
-      <w:pPr>
-        <w:shd w:fill="F3F4F6" w:val="clear"/>
-        <w:spacing w:after="0" w:line="260"/>
-        <w:ind w:left="200" w:right="200"/>
-      </w:pPr>
-      <w:r>
-        <w:rPr>
-          <w:rFonts w:ascii="Courier New" w:cs="Courier New" w:eastAsia="Courier New" w:hAnsi="Courier New"/>
-          <w:sz w:val="22"/>
-          <w:szCs w:val="22"/>
-        </w:rPr>
-        <w:t xml:space="preserve">  examples/          примеры ввода-вывода в консоли</w:t>
       </w:r>
     </w:p>
     <w:p>
@@ -4276,7 +4112,7 @@
                 <w:sz w:val="24"/>
                 <w:szCs w:val="24"/>
               </w:rPr>
-              <w:t xml:space="preserve">автотесты pytest, автоподбор сложности, контрольные работы, выпадающие списки</w:t>
+              <w:t xml:space="preserve">автоподбор сложности, контрольные работы, выпадающие списки</w:t>
             </w:r>
           </w:p>
         </w:tc>
@@ -4297,28 +4133,9 @@
           <w:sz w:val="32"/>
           <w:szCs w:val="32"/>
         </w:rPr>
-        <w:t xml:space="preserve">7. Тестирование</w:t>
+        <w:t xml:space="preserve">7. Примеры работы программы</w:t>
       </w:r>
       <w:bookmarkEnd w:id="17"/>
-    </w:p>
-    <w:p>
-      <w:pPr>
-        <w:pStyle w:val="Heading2"/>
-        <w:keepNext/>
-        <w:spacing w:after="120" w:before="240"/>
-      </w:pPr>
-      <w:bookmarkStart w:name="_Toc18" w:id="18"/>
-      <w:r>
-        <w:rPr>
-          <w:rFonts w:ascii="Times New Roman" w:cs="Times New Roman" w:eastAsia="Times New Roman" w:hAnsi="Times New Roman"/>
-          <w:b/>
-          <w:bCs/>
-          <w:sz w:val="28"/>
-          <w:szCs w:val="28"/>
-        </w:rPr>
-        <w:t xml:space="preserve">7.1. Автоматические тесты</w:t>
-      </w:r>
-      <w:bookmarkEnd w:id="18"/>
     </w:p>
     <w:p>
       <w:pPr>
@@ -4332,41 +4149,7 @@
           <w:sz w:val="28"/>
           <w:szCs w:val="28"/>
         </w:rPr>
-        <w:t xml:space="preserve">Логику проверяют 83 автотеста на pytest (папка tests). Они смотрят, как программа реагирует на неверные даты, сложность и лимиты, не превышаются ли лимиты часов, остаётся ли день перед экзаменом только под повторение, как тема растягивается по дням, как работают перепланирование, автоподбор сложности и списки предметов. Отдельно проверено чтение и запись CSV: повреждённые и неполные файлы, файлы с BOM. Результат запуска: 83 passed.</w:t>
-      </w:r>
-    </w:p>
-    <w:p>
-      <w:pPr>
-        <w:pStyle w:val="Heading2"/>
-        <w:keepNext/>
-        <w:spacing w:after="120" w:before="240"/>
-      </w:pPr>
-      <w:bookmarkStart w:name="_Toc19" w:id="19"/>
-      <w:r>
-        <w:rPr>
-          <w:rFonts w:ascii="Times New Roman" w:cs="Times New Roman" w:eastAsia="Times New Roman" w:hAnsi="Times New Roman"/>
-          <w:b/>
-          <w:bCs/>
-          <w:sz w:val="28"/>
-          <w:szCs w:val="28"/>
-        </w:rPr>
-        <w:t xml:space="preserve">7.2. Примеры ввода и вывода</w:t>
-      </w:r>
-      <w:bookmarkEnd w:id="19"/>
-    </w:p>
-    <w:p>
-      <w:pPr>
-        <w:spacing w:after="120" w:line="360"/>
-        <w:ind w:firstLine="709"/>
-        <w:jc w:val="both"/>
-      </w:pPr>
-      <w:r>
-        <w:rPr>
-          <w:rFonts w:ascii="Times New Roman" w:cs="Times New Roman" w:eastAsia="Times New Roman" w:hAnsi="Times New Roman"/>
-          <w:sz w:val="28"/>
-          <w:szCs w:val="28"/>
-        </w:rPr>
-        <w:t xml:space="preserve">Ниже реальный вывод программы: скрипт examples/io_demo.py с фиксированной датой «сегодня» 01.10.2026.</w:t>
+        <w:t xml:space="preserve">Ниже реальные примеры ввода и вывода программы (дата «сегодня» взята 01.10.2026).</w:t>
       </w:r>
     </w:p>
     <w:tbl>
@@ -5311,7 +5094,7 @@
         <w:keepNext/>
         <w:spacing w:after="200" w:before="360"/>
       </w:pPr>
-      <w:bookmarkStart w:name="_Toc20" w:id="20"/>
+      <w:bookmarkStart w:name="_Toc18" w:id="18"/>
       <w:r>
         <w:rPr>
           <w:rFonts w:ascii="Times New Roman" w:cs="Times New Roman" w:eastAsia="Times New Roman" w:hAnsi="Times New Roman"/>
@@ -5322,7 +5105,7 @@
         </w:rPr>
         <w:t xml:space="preserve">8. Запуск программы</w:t>
       </w:r>
-      <w:bookmarkEnd w:id="20"/>
+      <w:bookmarkEnd w:id="18"/>
     </w:p>
     <w:p>
       <w:pPr>
@@ -5381,7 +5164,7 @@
           <w:sz w:val="28"/>
           <w:szCs w:val="28"/>
         </w:rPr>
-        <w:t xml:space="preserve">Нужен Python 3.9 или новее с tkinter (он есть в стандартной установке). Для тестов создайте виртуальное окружение, поставьте pytest и запустите pytest. Окно с примерными данными открывает python3 demo.py, а скрипт screenshots.py сам проводит программу по сценарию и сохраняет скриншоты для отчёта и презентации (только macOS).</w:t>
+        <w:t xml:space="preserve">Нужен Python 3.9 или новее с tkinter (он есть в стандартной установке).</w:t>
       </w:r>
     </w:p>
     <w:p>
@@ -5390,7 +5173,7 @@
         <w:keepNext/>
         <w:spacing w:after="200" w:before="360"/>
       </w:pPr>
-      <w:bookmarkStart w:name="_Toc21" w:id="21"/>
+      <w:bookmarkStart w:name="_Toc19" w:id="19"/>
       <w:r>
         <w:rPr>
           <w:rFonts w:ascii="Times New Roman" w:cs="Times New Roman" w:eastAsia="Times New Roman" w:hAnsi="Times New Roman"/>
@@ -5401,7 +5184,7 @@
         </w:rPr>
         <w:t xml:space="preserve">9. Заключение</w:t>
       </w:r>
-      <w:bookmarkEnd w:id="21"/>
+      <w:bookmarkEnd w:id="19"/>
     </w:p>
     <w:p>
       <w:pPr>
@@ -5415,7 +5198,7 @@
           <w:sz w:val="28"/>
           <w:szCs w:val="28"/>
         </w:rPr>
-        <w:t xml:space="preserve">Мы сделали планировщик подготовки к экзаменам. Он принимает экзамены и контрольные с темами, сам подбирает сложность, раскладывает темы по дням с учётом лимитов, пересчитывает план, когда человек отстаёт, и показывает результат в календаре и на диаграмме Ганта. Требования курса (ошибки, словари, ООП) и четвёртый критерий (визуализация) выполнены, данные лежат в CSV, а логику проверяют тесты. Что можно добавить дальше: редактирование записей, напоминания о занятиях и экспорт плана в календарь.</w:t>
+        <w:t xml:space="preserve">Мы сделали планировщик подготовки к экзаменам. Он принимает экзамены и контрольные с темами, сам подбирает сложность, раскладывает темы по дням с учётом лимитов, пересчитывает план, когда человек отстаёт, и показывает результат в календаре и на диаграмме Ганта. Требования курса (ошибки, словари, ООП) и четвёртый критерий (визуализация) выполнены, данные лежат в CSV. Что можно добавить дальше: редактирование записей, напоминания о занятиях и экспорт плана в календарь.</w:t>
       </w:r>
     </w:p>
     <w:p>
@@ -5424,7 +5207,7 @@
         <w:keepNext/>
         <w:spacing w:after="200" w:before="360"/>
       </w:pPr>
-      <w:bookmarkStart w:name="_Toc22" w:id="22"/>
+      <w:bookmarkStart w:name="_Toc20" w:id="20"/>
       <w:r>
         <w:rPr>
           <w:rFonts w:ascii="Times New Roman" w:cs="Times New Roman" w:eastAsia="Times New Roman" w:hAnsi="Times New Roman"/>
@@ -5435,7 +5218,7 @@
         </w:rPr>
         <w:t xml:space="preserve">Приложение. Пример файлов данных</w:t>
       </w:r>
-      <w:bookmarkEnd w:id="22"/>
+      <w:bookmarkEnd w:id="20"/>
     </w:p>
     <w:p>
       <w:pPr>

</xml_diff>

<commit_message>
Report rewritten in plainer words, real screenshots, date picker section
Co-Authored-By: Claude Sonnet 5.5 <noreply@anthropic.com>
</commit_message>
<xml_diff>
--- a/docs/Отчёт_Планировщик_экзаменов.docx
+++ b/docs/Отчёт_Планировщик_экзаменов.docx
@@ -286,7 +286,7 @@
           </w:pPr>
           <w:hyperlink w:history="1" w:anchor="_Toc6">
             <w:r>
-              <w:t xml:space="preserve">4.2. Темы и автоподбор сложности</w:t>
+              <w:t xml:space="preserve">4.2. Темы и подбор сложности</w:t>
             </w:r>
             <w:r>
               <w:tab/>
@@ -418,7 +418,7 @@
           </w:pPr>
           <w:hyperlink w:history="1" w:anchor="_Toc12">
             <w:r>
-              <w:t xml:space="preserve">5.1. Классы и их методы</w:t>
+              <w:t xml:space="preserve">5.1. Классы и функции</w:t>
             </w:r>
             <w:r>
               <w:tab/>
@@ -440,7 +440,7 @@
           </w:pPr>
           <w:hyperlink w:history="1" w:anchor="_Toc13">
             <w:r>
-              <w:t xml:space="preserve">5.2. Алгоритм построения плана</w:t>
+              <w:t xml:space="preserve">5.2. Как строится план</w:t>
             </w:r>
             <w:r>
               <w:tab/>
@@ -462,7 +462,7 @@
           </w:pPr>
           <w:hyperlink w:history="1" w:anchor="_Toc14">
             <w:r>
-              <w:t xml:space="preserve">5.3. Автоподбор сложности</w:t>
+              <w:t xml:space="preserve">5.3. Подбор сложности</w:t>
             </w:r>
             <w:r>
               <w:tab/>
@@ -506,7 +506,7 @@
           </w:pPr>
           <w:hyperlink w:history="1" w:anchor="_Toc16">
             <w:r>
-              <w:t xml:space="preserve">6. Соответствие требованиям задания</w:t>
+              <w:t xml:space="preserve">6. Что требовалось и что сделано</w:t>
             </w:r>
             <w:r>
               <w:tab/>
@@ -650,7 +650,7 @@
           <w:sz w:val="28"/>
           <w:szCs w:val="28"/>
         </w:rPr>
-        <w:t xml:space="preserve">Нужно было сделать программу для подготовки к экзаменам. Пользователь вводит экзамены, даты и темы с оценкой сложности. Программа сама решает, что учить в каждый день, а если человек отстаёт, пересчитывает план. Результат показывается в виде диаграммы Ганта или календаря нагрузки.</w:t>
+        <w:t xml:space="preserve">Нам нужно было написать программу на Python для подготовки к экзаменам. Человек вводит экзамены, их даты и темы, а программа сама решает, что учить в какой день. Если он отстаёт, план пересчитывается. Результат надо показать наглядно, в виде календаря нагрузки или диаграммы Ганта.</w:t>
       </w:r>
     </w:p>
     <w:p>
@@ -665,7 +665,7 @@
           <w:sz w:val="28"/>
           <w:szCs w:val="28"/>
         </w:rPr>
-        <w:t xml:space="preserve">Требования из задания:</w:t>
+        <w:t xml:space="preserve">Что требовалось по заданию:</w:t>
       </w:r>
     </w:p>
     <w:p>
@@ -684,7 +684,7 @@
           <w:sz w:val="28"/>
           <w:szCs w:val="28"/>
         </w:rPr>
-        <w:t xml:space="preserve">писать на Python и брать только то, что прошли на курсе;</w:t>
+        <w:t xml:space="preserve">писать на Python и брать только то, что мы прошли на курсе;</w:t>
       </w:r>
     </w:p>
     <w:p>
@@ -722,7 +722,7 @@
           <w:sz w:val="28"/>
           <w:szCs w:val="28"/>
         </w:rPr>
-        <w:t xml:space="preserve">четвёртым критерием добавить визуализацию (окно tkinter, график и т. п.);</w:t>
+        <w:t xml:space="preserve">четвёртым пунктом сделать визуализацию (окно на tkinter, график и так далее);</w:t>
       </w:r>
     </w:p>
     <w:p>
@@ -741,7 +741,7 @@
           <w:sz w:val="28"/>
           <w:szCs w:val="28"/>
         </w:rPr>
-        <w:t xml:space="preserve">хранить данные в базе, а если базы нет, то в CSV-файлах или словарях.</w:t>
+        <w:t xml:space="preserve">данные хранить в базе, а если базы нет, то в CSV-файлах или словарях.</w:t>
       </w:r>
     </w:p>
     <w:p>
@@ -756,7 +756,7 @@
           <w:sz w:val="28"/>
           <w:szCs w:val="28"/>
         </w:rPr>
-        <w:t xml:space="preserve">Сверх задания мы сделали контрольные работы (несколько тем на одну дату), автоподбор сложности по названию темы, выпадающие списки с типовыми предметами и темами.</w:t>
+        <w:t xml:space="preserve">Кроме этого мы добавили контрольные работы (на одну дату может быть несколько тем), подбор сложности по названию темы и выпадающие списки с готовыми предметами и темами.</w:t>
       </w:r>
     </w:p>
     <w:p>
@@ -854,7 +854,7 @@
                 <w:sz w:val="24"/>
                 <w:szCs w:val="24"/>
               </w:rPr>
-              <w:t xml:space="preserve">Для чего нужен</w:t>
+              <w:t xml:space="preserve">Зачем нужен</w:t>
             </w:r>
           </w:p>
         </w:tc>
@@ -914,7 +914,7 @@
                 <w:sz w:val="24"/>
                 <w:szCs w:val="24"/>
               </w:rPr>
-              <w:t xml:space="preserve">основной язык; проект работает на версии 3.9 и новее</w:t>
+              <w:t xml:space="preserve">основной язык, программа работает на версии 3.9 и новее</w:t>
             </w:r>
           </w:p>
         </w:tc>
@@ -974,7 +974,7 @@
                 <w:sz w:val="24"/>
                 <w:szCs w:val="24"/>
               </w:rPr>
-              <w:t xml:space="preserve">окно программы: формы, выпадающие списки, таблицы, вкладки, диалоги, календарь</w:t>
+              <w:t xml:space="preserve">окно программы, формы, списки, таблицы, вкладки и диалоги</w:t>
             </w:r>
           </w:p>
         </w:tc>
@@ -1034,7 +1034,7 @@
                 <w:sz w:val="24"/>
                 <w:szCs w:val="24"/>
               </w:rPr>
-              <w:t xml:space="preserve">рисование диаграммы Ганта</w:t>
+              <w:t xml:space="preserve">рисуем диаграмму Ганта</w:t>
             </w:r>
           </w:p>
         </w:tc>
@@ -1094,7 +1094,7 @@
                 <w:sz w:val="24"/>
                 <w:szCs w:val="24"/>
               </w:rPr>
-              <w:t xml:space="preserve">хранение данных в файлах exams.csv, topics.csv, settings.csv</w:t>
+              <w:t xml:space="preserve">хранение данных в файлах exams.csv, topics.csv и settings.csv</w:t>
             </w:r>
           </w:p>
         </w:tc>
@@ -1185,7 +1185,7 @@
                 <w:sz w:val="24"/>
                 <w:szCs w:val="24"/>
               </w:rPr>
-              <w:t xml:space="preserve">git</w:t>
+              <w:t xml:space="preserve">git и GitHub</w:t>
             </w:r>
           </w:p>
         </w:tc>
@@ -1214,7 +1214,7 @@
                 <w:sz w:val="24"/>
                 <w:szCs w:val="24"/>
               </w:rPr>
-              <w:t xml:space="preserve">история изменений проекта</w:t>
+              <w:t xml:space="preserve">история изменений и общий репозиторий</w:t>
             </w:r>
           </w:p>
         </w:tc>
@@ -1224,6 +1224,21 @@
       <w:pPr>
         <w:spacing w:after="120"/>
       </w:pPr>
+    </w:p>
+    <w:p>
+      <w:pPr>
+        <w:spacing w:after="120" w:line="360"/>
+        <w:ind w:firstLine="709"/>
+        <w:jc w:val="both"/>
+      </w:pPr>
+      <w:r>
+        <w:rPr>
+          <w:rFonts w:ascii="Times New Roman" w:cs="Times New Roman" w:eastAsia="Times New Roman" w:hAnsi="Times New Roman"/>
+          <w:sz w:val="28"/>
+          <w:szCs w:val="28"/>
+        </w:rPr>
+        <w:t xml:space="preserve">Всё это уже есть в обычной установке Python, ничего отдельно ставить не нужно. Базу данных мы не брали, нам хватило CSV.</w:t>
+      </w:r>
     </w:p>
     <w:p>
       <w:pPr>
@@ -1256,7 +1271,7 @@
           <w:sz w:val="28"/>
           <w:szCs w:val="28"/>
         </w:rPr>
-        <w:t xml:space="preserve">Код мы разделили на две части: логика лежит в папке planner, окно в папке ui. Логика ничего не знает про окно, поэтому её можно менять отдельно от окна.</w:t>
+        <w:t xml:space="preserve">Программу мы поделили на две части. В папке planner лежит вся логика, в папке ui окно. Логика про окно ничего не знает, поэтому её можно менять отдельно от интерфейса.</w:t>
       </w:r>
     </w:p>
     <w:p>
@@ -1316,7 +1331,7 @@
           <w:sz w:val="22"/>
           <w:szCs w:val="22"/>
         </w:rPr>
-        <w:t xml:space="preserve">    models.py        классы Exam, Topic, проверка ввода</w:t>
+        <w:t xml:space="preserve">    models.py        классы Exam и Topic, проверка ввода, разбор дат</w:t>
       </w:r>
     </w:p>
     <w:p>
@@ -1331,7 +1346,7 @@
           <w:sz w:val="22"/>
           <w:szCs w:val="22"/>
         </w:rPr>
-        <w:t xml:space="preserve">    scheduler.py     класс Planner: построение и пересчёт плана</w:t>
+        <w:t xml:space="preserve">    scheduler.py     класс Planner, построение и пересчёт плана</w:t>
       </w:r>
     </w:p>
     <w:p>
@@ -1346,7 +1361,7 @@
           <w:sz w:val="22"/>
           <w:szCs w:val="22"/>
         </w:rPr>
-        <w:t xml:space="preserve">    estimator.py     автоподбор сложности темы (словари)</w:t>
+        <w:t xml:space="preserve">    estimator.py     подбор сложности темы (словари)</w:t>
       </w:r>
     </w:p>
     <w:p>
@@ -1361,7 +1376,7 @@
           <w:sz w:val="22"/>
           <w:szCs w:val="22"/>
         </w:rPr>
-        <w:t xml:space="preserve">    catalog.py       типовые предметы и темы для списков</w:t>
+        <w:t xml:space="preserve">    catalog.py       готовые предметы и темы для списков</w:t>
       </w:r>
     </w:p>
     <w:p>
@@ -1376,7 +1391,7 @@
           <w:sz w:val="22"/>
           <w:szCs w:val="22"/>
         </w:rPr>
-        <w:t xml:space="preserve">    storage.py       класс Storage: чтение и запись CSV</w:t>
+        <w:t xml:space="preserve">    storage.py       класс Storage, чтение и запись CSV</w:t>
       </w:r>
     </w:p>
     <w:p>
@@ -1406,7 +1421,7 @@
           <w:sz w:val="22"/>
           <w:szCs w:val="22"/>
         </w:rPr>
-        <w:t xml:space="preserve">    ganttview.py     подготовка строк диаграммы Ганта</w:t>
+        <w:t xml:space="preserve">    ganttview.py     строки для диаграммы Ганта</w:t>
       </w:r>
     </w:p>
     <w:p>
@@ -1421,7 +1436,7 @@
           <w:sz w:val="22"/>
           <w:szCs w:val="22"/>
         </w:rPr>
-        <w:t xml:space="preserve">    errors.py        собственные исключения</w:t>
+        <w:t xml:space="preserve">    errors.py        наши исключения</w:t>
       </w:r>
     </w:p>
     <w:p>
@@ -1481,7 +1496,7 @@
           <w:sz w:val="22"/>
           <w:szCs w:val="22"/>
         </w:rPr>
-        <w:t xml:space="preserve">    dialogs.py       диалог «Несколько тем»</w:t>
+        <w:t xml:space="preserve">    datepicker.py    календарь для выбора даты</w:t>
       </w:r>
     </w:p>
     <w:p>
@@ -1496,7 +1511,7 @@
           <w:sz w:val="22"/>
           <w:szCs w:val="22"/>
         </w:rPr>
-        <w:t xml:space="preserve">    widgets.py       поля ввода с подсказкой внутри</w:t>
+        <w:t xml:space="preserve">    dialogs.py       окно «Несколько тем»</w:t>
       </w:r>
     </w:p>
     <w:p>
@@ -1511,6 +1526,21 @@
           <w:sz w:val="22"/>
           <w:szCs w:val="22"/>
         </w:rPr>
+        <w:t xml:space="preserve">    widgets.py       поля с подсказкой внутри</w:t>
+      </w:r>
+    </w:p>
+    <w:p>
+      <w:pPr>
+        <w:shd w:fill="F3F4F6" w:val="clear"/>
+        <w:spacing w:after="0" w:line="260"/>
+        <w:ind w:left="200" w:right="200"/>
+      </w:pPr>
+      <w:r>
+        <w:rPr>
+          <w:rFonts w:ascii="Courier New" w:cs="Courier New" w:eastAsia="Courier New" w:hAnsi="Courier New"/>
+          <w:sz w:val="22"/>
+          <w:szCs w:val="22"/>
+        </w:rPr>
         <w:t xml:space="preserve">    theme.py         цвета и стили</w:t>
       </w:r>
     </w:p>
@@ -1526,7 +1556,7 @@
           <w:sz w:val="22"/>
           <w:szCs w:val="22"/>
         </w:rPr>
-        <w:t xml:space="preserve">  data/              файлы данных CSV</w:t>
+        <w:t xml:space="preserve">  data/              файлы с данными (CSV)</w:t>
       </w:r>
     </w:p>
     <w:p>
@@ -1579,7 +1609,7 @@
           <w:sz w:val="28"/>
           <w:szCs w:val="28"/>
         </w:rPr>
-        <w:t xml:space="preserve">Предмет выбирается из выпадающего списка или вводится вручную. Дальше указываются дата в формате ДД.ММ.ГГГГ и тип: «Экзамен» или «Контрольная». У каждого события своя дата и свои темы. В списке видно, сколько дней осталось. Дата должна быть в будущем, название не может быть пустым, два одинаковых события добавить нельзя.</w:t>
+        <w:t xml:space="preserve">Предмет выбирается из списка или пишется вручную. Дальше нужны дата и тип события, экзамен или контрольная. У каждого события своя дата и свои темы, а в таблице рядом видно, сколько дней осталось. Дата должна быть в будущем, название не может быть пустым, два одинаковых события добавить нельзя.</w:t>
       </w:r>
     </w:p>
     <w:p>
@@ -1594,56 +1624,7 @@
           <w:sz w:val="28"/>
           <w:szCs w:val="28"/>
         </w:rPr>
-        <w:t xml:space="preserve">Дату можно ввести по-разному. Полная дата записывается как ДД.ММ.ГГГГ. Если написать только число («25»), программа возьмёт ближайшее такое число в будущем, а если число и месяц («25.11») — ближайший такой день. Результат сразу показывается в поле полной датой. Можно и вовсе не печатать: щелчок по полю открывает маленький календарь, где достаточно нажать на нужное число, и оно подставится само. Прошедшие дни в нём недоступны.</w:t>
-      </w:r>
-    </w:p>
-    <w:p>
-      <w:pPr>
-        <w:pStyle w:val="Heading2"/>
-        <w:keepNext/>
-        <w:spacing w:after="120" w:before="240"/>
-      </w:pPr>
-      <w:bookmarkStart w:name="_Toc6" w:id="6"/>
-      <w:r>
-        <w:rPr>
-          <w:rFonts w:ascii="Times New Roman" w:cs="Times New Roman" w:eastAsia="Times New Roman" w:hAnsi="Times New Roman"/>
-          <w:b/>
-          <w:bCs/>
-          <w:sz w:val="28"/>
-          <w:szCs w:val="28"/>
-        </w:rPr>
-        <w:t xml:space="preserve">4.2. Темы и автоподбор сложности</w:t>
-      </w:r>
-      <w:bookmarkEnd w:id="6"/>
-    </w:p>
-    <w:p>
-      <w:pPr>
-        <w:spacing w:after="120" w:line="360"/>
-        <w:ind w:firstLine="709"/>
-        <w:jc w:val="both"/>
-      </w:pPr>
-      <w:r>
-        <w:rPr>
-          <w:rFonts w:ascii="Times New Roman" w:cs="Times New Roman" w:eastAsia="Times New Roman" w:hAnsi="Times New Roman"/>
-          <w:sz w:val="28"/>
-          <w:szCs w:val="28"/>
-        </w:rPr>
-        <w:t xml:space="preserve">После выбора события в списке тем появляются типовые темы по этому предмету (те, что уже добавлены, из списка пропадают). Тему можно вписать самому. Кнопка «Несколько…» открывает окно, где отмечаются сразу много тем и дописываются свои через запятую.</w:t>
-      </w:r>
-    </w:p>
-    <w:p>
-      <w:pPr>
-        <w:spacing w:after="120" w:line="360"/>
-        <w:ind w:firstLine="709"/>
-        <w:jc w:val="both"/>
-      </w:pPr>
-      <w:r>
-        <w:rPr>
-          <w:rFonts w:ascii="Times New Roman" w:cs="Times New Roman" w:eastAsia="Times New Roman" w:hAnsi="Times New Roman"/>
-          <w:sz w:val="28"/>
-          <w:szCs w:val="28"/>
-        </w:rPr>
-        <w:t xml:space="preserve">Сложность темы — число от 1 до 5, и она же задаёт число часов. По умолчанию стоит «авто»: программа оценивает сложность по названию предмета и темы с помощью словарей. Например, у математики базовая сложность 4, у физкультуры 1, слово «введение» её снижает, а «теорема» или «интеграл» повышают. Значение можно задать вручную или поменять у готовой темы.</w:t>
+        <w:t xml:space="preserve">Дату можно вводить по-разному. Полная запись выглядит как 25.11.2026. Если написать только число, например 25, программа возьмёт ближайшее такое число впереди. Если написать 25.11, возьмёт ближайший такой день. Результат сразу превращается в полную дату прямо в поле. А можно вообще ничего не печатать: щелчок по полю открывает маленький календарь, и нужное число выбирается кликом. Прошедшие дни в нём выбрать нельзя.</w:t>
       </w:r>
     </w:p>
     <w:p>
@@ -1655,9 +1636,9 @@
       <w:r>
         <w:drawing>
           <wp:inline distT="0" distB="0" distL="0" distR="0">
-            <wp:extent cx="3619500" cy="2714625"/>
+            <wp:extent cx="4953000" cy="3562350"/>
             <wp:effectExtent t="0" r="0" b="0" l="0"/>
-            <wp:docPr id="1" name="03_dialog.png" descr="Окно добавления нескольких тем" title="Окно добавления нескольких тем"/>
+            <wp:docPr id="1" name="05_picker.png" descr="Календарь для выбора даты под полем ввода" title="Календарь для выбора даты под полем ввода"/>
             <wp:cNvGraphicFramePr>
               <a:graphicFrameLocks xmlns:a="http://schemas.openxmlformats.org/drawingml/2006/main" noChangeAspect="1"/>
             </wp:cNvGraphicFramePr>
@@ -1680,7 +1661,7 @@
                   <pic:spPr bwMode="auto">
                     <a:xfrm>
                       <a:off x="0" y="0"/>
-                      <a:ext cx="3619500" cy="2714625"/>
+                      <a:ext cx="4953000" cy="3562350"/>
                     </a:xfrm>
                     <a:prstGeom prst="rect">
                       <a:avLst/>
@@ -1704,7 +1685,22 @@
           <w:sz w:val="24"/>
           <w:szCs w:val="24"/>
         </w:rPr>
-        <w:t xml:space="preserve">Рисунок 1 — Окно добавления нескольких тем</w:t>
+        <w:t xml:space="preserve">Рисунок 1 — Календарь для выбора даты под полем ввода</w:t>
+      </w:r>
+    </w:p>
+    <w:p>
+      <w:pPr>
+        <w:spacing w:after="120" w:line="360"/>
+        <w:ind w:firstLine="709"/>
+        <w:jc w:val="both"/>
+      </w:pPr>
+      <w:r>
+        <w:rPr>
+          <w:rFonts w:ascii="Times New Roman" w:cs="Times New Roman" w:eastAsia="Times New Roman" w:hAnsi="Times New Roman"/>
+          <w:sz w:val="28"/>
+          <w:szCs w:val="28"/>
+        </w:rPr>
+        <w:t xml:space="preserve">Во всех пустых полях виден серый текст-подсказка, что туда вводить. Он не пропадает, даже когда поле выбрано, и исчезает только с первой набранной буквой.</w:t>
       </w:r>
     </w:p>
     <w:p>
@@ -1713,7 +1709,7 @@
         <w:keepNext/>
         <w:spacing w:after="120" w:before="240"/>
       </w:pPr>
-      <w:bookmarkStart w:name="_Toc7" w:id="7"/>
+      <w:bookmarkStart w:name="_Toc6" w:id="6"/>
       <w:r>
         <w:rPr>
           <w:rFonts w:ascii="Times New Roman" w:cs="Times New Roman" w:eastAsia="Times New Roman" w:hAnsi="Times New Roman"/>
@@ -1722,9 +1718,9 @@
           <w:sz w:val="28"/>
           <w:szCs w:val="28"/>
         </w:rPr>
-        <w:t xml:space="preserve">4.3. Распределение по дням</w:t>
-      </w:r>
-      <w:bookmarkEnd w:id="7"/>
+        <w:t xml:space="preserve">4.2. Темы и подбор сложности</w:t>
+      </w:r>
+      <w:bookmarkEnd w:id="6"/>
     </w:p>
     <w:p>
       <w:pPr>
@@ -1738,141 +1734,8 @@
           <w:sz w:val="28"/>
           <w:szCs w:val="28"/>
         </w:rPr>
-        <w:t xml:space="preserve">План пересобирается после каждого изменения. Правила такие:</w:t>
-      </w:r>
-    </w:p>
-    <w:p>
-      <w:pPr>
-        <w:pStyle w:val="ListParagraph"/>
-        <w:numPr>
-          <w:ilvl w:val="0"/>
-          <w:numId w:val="2"/>
-        </w:numPr>
-        <w:spacing w:after="60" w:line="360"/>
-        <w:jc w:val="both"/>
-      </w:pPr>
-      <w:r>
-        <w:rPr>
-          <w:rFonts w:ascii="Times New Roman" w:cs="Times New Roman" w:eastAsia="Times New Roman" w:hAnsi="Times New Roman"/>
-          <w:sz w:val="28"/>
-          <w:szCs w:val="28"/>
-        </w:rPr>
-        <w:t xml:space="preserve">часов на тему столько же, какова её сложность;</w:t>
-      </w:r>
-    </w:p>
-    <w:p>
-      <w:pPr>
-        <w:pStyle w:val="ListParagraph"/>
-        <w:numPr>
-          <w:ilvl w:val="0"/>
-          <w:numId w:val="2"/>
-        </w:numPr>
-        <w:spacing w:after="60" w:line="360"/>
-        <w:jc w:val="both"/>
-      </w:pPr>
-      <w:r>
-        <w:rPr>
-          <w:rFonts w:ascii="Times New Roman" w:cs="Times New Roman" w:eastAsia="Times New Roman" w:hAnsi="Times New Roman"/>
-          <w:sz w:val="28"/>
-          <w:szCs w:val="28"/>
-        </w:rPr>
-        <w:t xml:space="preserve">часы события делятся поровну на все дни до повторения: если тем мало, занятия идут через день-два, а не в первый же день, и срок не остаётся пустым;</w:t>
-      </w:r>
-    </w:p>
-    <w:p>
-      <w:pPr>
-        <w:pStyle w:val="ListParagraph"/>
-        <w:numPr>
-          <w:ilvl w:val="0"/>
-          <w:numId w:val="2"/>
-        </w:numPr>
-        <w:spacing w:after="60" w:line="360"/>
-        <w:jc w:val="both"/>
-      </w:pPr>
-      <w:r>
-        <w:rPr>
-          <w:rFonts w:ascii="Times New Roman" w:cs="Times New Roman" w:eastAsia="Times New Roman" w:hAnsi="Times New Roman"/>
-          <w:sz w:val="28"/>
-          <w:szCs w:val="28"/>
-        </w:rPr>
-        <w:t xml:space="preserve">в день ставится не больше заданного числа часов (по умолчанию 4) и не больше 2 часов одной темы, поэтому большая тема растягивается на несколько дней по 1–2 часа;</w:t>
-      </w:r>
-    </w:p>
-    <w:p>
-      <w:pPr>
-        <w:pStyle w:val="ListParagraph"/>
-        <w:numPr>
-          <w:ilvl w:val="0"/>
-          <w:numId w:val="2"/>
-        </w:numPr>
-        <w:spacing w:after="60" w:line="360"/>
-        <w:jc w:val="both"/>
-      </w:pPr>
-      <w:r>
-        <w:rPr>
-          <w:rFonts w:ascii="Times New Roman" w:cs="Times New Roman" w:eastAsia="Times New Roman" w:hAnsi="Times New Roman"/>
-          <w:sz w:val="28"/>
-          <w:szCs w:val="28"/>
-        </w:rPr>
-        <w:t xml:space="preserve">первыми идут самые сложные темы ближайшего события;</w:t>
-      </w:r>
-    </w:p>
-    <w:p>
-      <w:pPr>
-        <w:pStyle w:val="ListParagraph"/>
-        <w:numPr>
-          <w:ilvl w:val="0"/>
-          <w:numId w:val="2"/>
-        </w:numPr>
-        <w:spacing w:after="60" w:line="360"/>
-        <w:jc w:val="both"/>
-      </w:pPr>
-      <w:r>
-        <w:rPr>
-          <w:rFonts w:ascii="Times New Roman" w:cs="Times New Roman" w:eastAsia="Times New Roman" w:hAnsi="Times New Roman"/>
-          <w:sz w:val="28"/>
-          <w:szCs w:val="28"/>
-        </w:rPr>
-        <w:t xml:space="preserve">день перед экзаменом отдан под повторение (2 часа), перед контрольной ставится 1 час, в день самого события занятий нет;</w:t>
-      </w:r>
-    </w:p>
-    <w:p>
-      <w:pPr>
-        <w:pStyle w:val="ListParagraph"/>
-        <w:numPr>
-          <w:ilvl w:val="0"/>
-          <w:numId w:val="2"/>
-        </w:numPr>
-        <w:spacing w:after="60" w:line="360"/>
-        <w:jc w:val="both"/>
-      </w:pPr>
-      <w:r>
-        <w:rPr>
-          <w:rFonts w:ascii="Times New Roman" w:cs="Times New Roman" w:eastAsia="Times New Roman" w:hAnsi="Times New Roman"/>
-          <w:sz w:val="28"/>
-          <w:szCs w:val="28"/>
-        </w:rPr>
-        <w:t xml:space="preserve">если темы не помещаются в срок, дни не перегружаются: программа показывает, какие темы под угрозой.</w:t>
-      </w:r>
-    </w:p>
-    <w:p>
-      <w:pPr>
-        <w:pStyle w:val="Heading2"/>
-        <w:keepNext/>
-        <w:spacing w:after="120" w:before="240"/>
-      </w:pPr>
-      <w:bookmarkStart w:name="_Toc8" w:id="8"/>
-      <w:r>
-        <w:rPr>
-          <w:rFonts w:ascii="Times New Roman" w:cs="Times New Roman" w:eastAsia="Times New Roman" w:hAnsi="Times New Roman"/>
-          <w:b/>
-          <w:bCs/>
-          <w:sz w:val="28"/>
-          <w:szCs w:val="28"/>
-        </w:rPr>
-        <w:t xml:space="preserve">4.4. Пересчёт плана</w:t>
-      </w:r>
-      <w:bookmarkEnd w:id="8"/>
+        <w:t xml:space="preserve">Когда выбрано событие, в списке тем появляются готовые темы этого предмета, а уже добавленные из списка пропадают. Свою тему можно вписать руками. Кнопка «Несколько…» открывает окно, где отмечаются сразу много тем, а свои дописываются через запятую.</w:t>
+      </w:r>
     </w:p>
     <w:p>
       <w:pPr>
@@ -1886,7 +1749,7 @@
           <w:sz w:val="28"/>
           <w:szCs w:val="28"/>
         </w:rPr>
-        <w:t xml:space="preserve">Если вы отстали, нажмите «Перепланировать». Для каждой темы мы запоминаем день, на который её поставили. Невыполненные темы с прошедшим днём планируются заново с сегодняшнего дня. Программа пишет, что перенесла, и предупреждает о темах, которые уже не успеть. Выполненные темы отмечаются кнопкой «Готово» и в плане больше не участвуют.</w:t>
+        <w:t xml:space="preserve">Сложность темы это число от 1 до 5, и ровно столько часов на неё нужно. По умолчанию стоит «авто», тогда программа сама оценивает сложность по названию предмета и темы. Например, у математики база 4, у физкультуры 1, слово «введение» сложность снижает, а «теорема» или «интеграл» повышают. Число можно выбрать вручную или поменять у темы, которая уже добавлена.</w:t>
       </w:r>
     </w:p>
     <w:p>
@@ -1898,9 +1761,9 @@
       <w:r>
         <w:drawing>
           <wp:inline distT="0" distB="0" distL="0" distR="0">
-            <wp:extent cx="5334000" cy="3838575"/>
+            <wp:extent cx="3619500" cy="2714625"/>
             <wp:effectExtent t="0" r="0" b="0" l="0"/>
-            <wp:docPr id="2" name="s4_risk_gantt.png" descr="Предупреждение: темы не помещаются до экзамена (лимит 2 часа в день)" title="Предупреждение: темы не помещаются до экзамена (лимит 2 часа в день)"/>
+            <wp:docPr id="2" name="03_dialog.png" descr="Окно, где можно отметить сразу несколько тем" title="Окно, где можно отметить сразу несколько тем"/>
             <wp:cNvGraphicFramePr>
               <a:graphicFrameLocks xmlns:a="http://schemas.openxmlformats.org/drawingml/2006/main" noChangeAspect="1"/>
             </wp:cNvGraphicFramePr>
@@ -1923,7 +1786,7 @@
                   <pic:spPr bwMode="auto">
                     <a:xfrm>
                       <a:off x="0" y="0"/>
-                      <a:ext cx="5334000" cy="3838575"/>
+                      <a:ext cx="3619500" cy="2714625"/>
                     </a:xfrm>
                     <a:prstGeom prst="rect">
                       <a:avLst/>
@@ -1947,7 +1810,7 @@
           <w:sz w:val="24"/>
           <w:szCs w:val="24"/>
         </w:rPr>
-        <w:t xml:space="preserve">Рисунок 2 — Предупреждение: темы не помещаются до экзамена (лимит 2 часа в день)</w:t>
+        <w:t xml:space="preserve">Рисунок 2 — Окно, где можно отметить сразу несколько тем</w:t>
       </w:r>
     </w:p>
     <w:p>
@@ -1956,7 +1819,7 @@
         <w:keepNext/>
         <w:spacing w:after="120" w:before="240"/>
       </w:pPr>
-      <w:bookmarkStart w:name="_Toc9" w:id="9"/>
+      <w:bookmarkStart w:name="_Toc7" w:id="7"/>
       <w:r>
         <w:rPr>
           <w:rFonts w:ascii="Times New Roman" w:cs="Times New Roman" w:eastAsia="Times New Roman" w:hAnsi="Times New Roman"/>
@@ -1965,9 +1828,9 @@
           <w:sz w:val="28"/>
           <w:szCs w:val="28"/>
         </w:rPr>
-        <w:t xml:space="preserve">4.5. Визуализация</w:t>
-      </w:r>
-      <w:bookmarkEnd w:id="9"/>
+        <w:t xml:space="preserve">4.3. Распределение по дням</w:t>
+      </w:r>
+      <w:bookmarkEnd w:id="7"/>
     </w:p>
     <w:p>
       <w:pPr>
@@ -1981,7 +1844,155 @@
           <w:sz w:val="28"/>
           <w:szCs w:val="28"/>
         </w:rPr>
-        <w:t xml:space="preserve">Календарь показывает месяц. Цвет клетки зависит от загрузки: от серого (свободно) до оранжевого (дошли до лимита часов). Экзамены красные, контрольные фиолетовые. Если нажать на день, внизу появится список тем и часов на этот день.</w:t>
+        <w:t xml:space="preserve">План пересобирается после любого изменения. Правила у него такие:</w:t>
+      </w:r>
+    </w:p>
+    <w:p>
+      <w:pPr>
+        <w:pStyle w:val="ListParagraph"/>
+        <w:numPr>
+          <w:ilvl w:val="0"/>
+          <w:numId w:val="2"/>
+        </w:numPr>
+        <w:spacing w:after="60" w:line="360"/>
+        <w:jc w:val="both"/>
+      </w:pPr>
+      <w:r>
+        <w:rPr>
+          <w:rFonts w:ascii="Times New Roman" w:cs="Times New Roman" w:eastAsia="Times New Roman" w:hAnsi="Times New Roman"/>
+          <w:sz w:val="28"/>
+          <w:szCs w:val="28"/>
+        </w:rPr>
+        <w:t xml:space="preserve">часов на тему столько, какова её сложность;</w:t>
+      </w:r>
+    </w:p>
+    <w:p>
+      <w:pPr>
+        <w:pStyle w:val="ListParagraph"/>
+        <w:numPr>
+          <w:ilvl w:val="0"/>
+          <w:numId w:val="2"/>
+        </w:numPr>
+        <w:spacing w:after="60" w:line="360"/>
+        <w:jc w:val="both"/>
+      </w:pPr>
+      <w:r>
+        <w:rPr>
+          <w:rFonts w:ascii="Times New Roman" w:cs="Times New Roman" w:eastAsia="Times New Roman" w:hAnsi="Times New Roman"/>
+          <w:sz w:val="28"/>
+          <w:szCs w:val="28"/>
+        </w:rPr>
+        <w:t xml:space="preserve">часы события делятся поровну на все дни до повторения. Если тем мало, занятия идут через день-два, и последняя неделя перед экзаменом не остаётся пустой;</w:t>
+      </w:r>
+    </w:p>
+    <w:p>
+      <w:pPr>
+        <w:pStyle w:val="ListParagraph"/>
+        <w:numPr>
+          <w:ilvl w:val="0"/>
+          <w:numId w:val="2"/>
+        </w:numPr>
+        <w:spacing w:after="60" w:line="360"/>
+        <w:jc w:val="both"/>
+      </w:pPr>
+      <w:r>
+        <w:rPr>
+          <w:rFonts w:ascii="Times New Roman" w:cs="Times New Roman" w:eastAsia="Times New Roman" w:hAnsi="Times New Roman"/>
+          <w:sz w:val="28"/>
+          <w:szCs w:val="28"/>
+        </w:rPr>
+        <w:t xml:space="preserve">в день ставится не больше 4 часов (это число можно менять) и не больше 2 часов одной темы, поэтому большая тема растягивается на несколько дней;</w:t>
+      </w:r>
+    </w:p>
+    <w:p>
+      <w:pPr>
+        <w:pStyle w:val="ListParagraph"/>
+        <w:numPr>
+          <w:ilvl w:val="0"/>
+          <w:numId w:val="2"/>
+        </w:numPr>
+        <w:spacing w:after="60" w:line="360"/>
+        <w:jc w:val="both"/>
+      </w:pPr>
+      <w:r>
+        <w:rPr>
+          <w:rFonts w:ascii="Times New Roman" w:cs="Times New Roman" w:eastAsia="Times New Roman" w:hAnsi="Times New Roman"/>
+          <w:sz w:val="28"/>
+          <w:szCs w:val="28"/>
+        </w:rPr>
+        <w:t xml:space="preserve">сложные темы идут первыми;</w:t>
+      </w:r>
+    </w:p>
+    <w:p>
+      <w:pPr>
+        <w:pStyle w:val="ListParagraph"/>
+        <w:numPr>
+          <w:ilvl w:val="0"/>
+          <w:numId w:val="2"/>
+        </w:numPr>
+        <w:spacing w:after="60" w:line="360"/>
+        <w:jc w:val="both"/>
+      </w:pPr>
+      <w:r>
+        <w:rPr>
+          <w:rFonts w:ascii="Times New Roman" w:cs="Times New Roman" w:eastAsia="Times New Roman" w:hAnsi="Times New Roman"/>
+          <w:sz w:val="28"/>
+          <w:szCs w:val="28"/>
+        </w:rPr>
+        <w:t xml:space="preserve">накануне экзамена только повторение на 2 часа, перед контрольной на 1 час, а в сам день занятий нет;</w:t>
+      </w:r>
+    </w:p>
+    <w:p>
+      <w:pPr>
+        <w:pStyle w:val="ListParagraph"/>
+        <w:numPr>
+          <w:ilvl w:val="0"/>
+          <w:numId w:val="2"/>
+        </w:numPr>
+        <w:spacing w:after="60" w:line="360"/>
+        <w:jc w:val="both"/>
+      </w:pPr>
+      <w:r>
+        <w:rPr>
+          <w:rFonts w:ascii="Times New Roman" w:cs="Times New Roman" w:eastAsia="Times New Roman" w:hAnsi="Times New Roman"/>
+          <w:sz w:val="28"/>
+          <w:szCs w:val="28"/>
+        </w:rPr>
+        <w:t xml:space="preserve">если темы не помещаются в срок, дни не перегружаются, а программа показывает, какие темы под угрозой.</w:t>
+      </w:r>
+    </w:p>
+    <w:p>
+      <w:pPr>
+        <w:pStyle w:val="Heading2"/>
+        <w:keepNext/>
+        <w:spacing w:after="120" w:before="240"/>
+      </w:pPr>
+      <w:bookmarkStart w:name="_Toc8" w:id="8"/>
+      <w:r>
+        <w:rPr>
+          <w:rFonts w:ascii="Times New Roman" w:cs="Times New Roman" w:eastAsia="Times New Roman" w:hAnsi="Times New Roman"/>
+          <w:b/>
+          <w:bCs/>
+          <w:sz w:val="28"/>
+          <w:szCs w:val="28"/>
+        </w:rPr>
+        <w:t xml:space="preserve">4.4. Пересчёт плана</w:t>
+      </w:r>
+      <w:bookmarkEnd w:id="8"/>
+    </w:p>
+    <w:p>
+      <w:pPr>
+        <w:spacing w:after="120" w:line="360"/>
+        <w:ind w:firstLine="709"/>
+        <w:jc w:val="both"/>
+      </w:pPr>
+      <w:r>
+        <w:rPr>
+          <w:rFonts w:ascii="Times New Roman" w:cs="Times New Roman" w:eastAsia="Times New Roman" w:hAnsi="Times New Roman"/>
+          <w:sz w:val="28"/>
+          <w:szCs w:val="28"/>
+        </w:rPr>
+        <w:t xml:space="preserve">Если человек отстал, он нажимает «Перепланировать». Для каждой темы мы запоминаем день, на который её поставили. Невыполненные темы, чей день уже прошёл, планируются заново с сегодняшнего дня. Программа пишет, что перенесла, и предупреждает о темах, которые уже не успеть. Выполненную тему отмечают кнопкой «Готово», в плане её больше нет.</w:t>
       </w:r>
     </w:p>
     <w:p>
@@ -1995,7 +2006,7 @@
           <wp:inline distT="0" distB="0" distL="0" distR="0">
             <wp:extent cx="5334000" cy="3838575"/>
             <wp:effectExtent t="0" r="0" b="0" l="0"/>
-            <wp:docPr id="3" name="01_calendar.png" descr="Календарь нагрузки" title="Календарь нагрузки"/>
+            <wp:docPr id="3" name="s4_risk_gantt.png" descr="Если часов не хватает, темы подсвечиваются красным и внизу появляется предупреждение" title="Если часов не хватает, темы подсвечиваются красным и внизу появляется предупреждение"/>
             <wp:cNvGraphicFramePr>
               <a:graphicFrameLocks xmlns:a="http://schemas.openxmlformats.org/drawingml/2006/main" noChangeAspect="1"/>
             </wp:cNvGraphicFramePr>
@@ -2042,8 +2053,27 @@
           <w:sz w:val="24"/>
           <w:szCs w:val="24"/>
         </w:rPr>
-        <w:t xml:space="preserve">Рисунок 3 — Календарь нагрузки</w:t>
-      </w:r>
+        <w:t xml:space="preserve">Рисунок 3 — Если часов не хватает, темы подсвечиваются красным и внизу появляется предупреждение</w:t>
+      </w:r>
+    </w:p>
+    <w:p>
+      <w:pPr>
+        <w:pStyle w:val="Heading2"/>
+        <w:keepNext/>
+        <w:spacing w:after="120" w:before="240"/>
+      </w:pPr>
+      <w:bookmarkStart w:name="_Toc9" w:id="9"/>
+      <w:r>
+        <w:rPr>
+          <w:rFonts w:ascii="Times New Roman" w:cs="Times New Roman" w:eastAsia="Times New Roman" w:hAnsi="Times New Roman"/>
+          <w:b/>
+          <w:bCs/>
+          <w:sz w:val="28"/>
+          <w:szCs w:val="28"/>
+        </w:rPr>
+        <w:t xml:space="preserve">4.5. Визуализация</w:t>
+      </w:r>
+      <w:bookmarkEnd w:id="9"/>
     </w:p>
     <w:p>
       <w:pPr>
@@ -2057,7 +2087,7 @@
           <w:sz w:val="28"/>
           <w:szCs w:val="28"/>
         </w:rPr>
-        <w:t xml:space="preserve">Диаграмму Ганта мы нарисовали на tkinter Canvas. Каждая тема — полоска от первого до последнего дня занятий, полоски сгруппированы по событиям. Вертикальные линии отмечают даты экзаменов и контрольных, пунктирная — сегодняшний день. Выполненные темы и темы, которые не успеть, показаны отдельными строками.</w:t>
+        <w:t xml:space="preserve">Календарь показывает месяц. Цвет клетки зависит от загрузки дня, от серого (свободно) до оранжевого (дошли до лимита часов). Экзамены красные, контрольные фиолетовые. Если нажать на день, внизу появится список тем и часов на него.</w:t>
       </w:r>
     </w:p>
     <w:p>
@@ -2071,7 +2101,7 @@
           <wp:inline distT="0" distB="0" distL="0" distR="0">
             <wp:extent cx="5334000" cy="3838575"/>
             <wp:effectExtent t="0" r="0" b="0" l="0"/>
-            <wp:docPr id="4" name="02_gantt.png" descr="Диаграмма Ганта" title="Диаграмма Ганта"/>
+            <wp:docPr id="4" name="01_calendar.png" descr="Календарь нагрузки" title="Календарь нагрузки"/>
             <wp:cNvGraphicFramePr>
               <a:graphicFrameLocks xmlns:a="http://schemas.openxmlformats.org/drawingml/2006/main" noChangeAspect="1"/>
             </wp:cNvGraphicFramePr>
@@ -2118,7 +2148,83 @@
           <w:sz w:val="24"/>
           <w:szCs w:val="24"/>
         </w:rPr>
-        <w:t xml:space="preserve">Рисунок 4 — Диаграмма Ганта</w:t>
+        <w:t xml:space="preserve">Рисунок 4 — Календарь нагрузки</w:t>
+      </w:r>
+    </w:p>
+    <w:p>
+      <w:pPr>
+        <w:spacing w:after="120" w:line="360"/>
+        <w:ind w:firstLine="709"/>
+        <w:jc w:val="both"/>
+      </w:pPr>
+      <w:r>
+        <w:rPr>
+          <w:rFonts w:ascii="Times New Roman" w:cs="Times New Roman" w:eastAsia="Times New Roman" w:hAnsi="Times New Roman"/>
+          <w:sz w:val="28"/>
+          <w:szCs w:val="28"/>
+        </w:rPr>
+        <w:t xml:space="preserve">Диаграмму Ганта мы нарисовали на tkinter Canvas. Каждая тема это полоска от первого до последнего дня занятий, полоски сгруппированы по событиям. Вертикальные линии показывают даты экзаменов и контрольных, пунктирная линия это сегодня. Выполненные темы и те, что не успеть, вынесены в отдельные строки.</w:t>
+      </w:r>
+    </w:p>
+    <w:p>
+      <w:pPr>
+        <w:keepNext/>
+        <w:spacing w:after="60" w:before="120"/>
+        <w:jc w:val="center"/>
+      </w:pPr>
+      <w:r>
+        <w:drawing>
+          <wp:inline distT="0" distB="0" distL="0" distR="0">
+            <wp:extent cx="5334000" cy="3838575"/>
+            <wp:effectExtent t="0" r="0" b="0" l="0"/>
+            <wp:docPr id="5" name="02_gantt.png" descr="Диаграмма Ганта" title="Диаграмма Ганта"/>
+            <wp:cNvGraphicFramePr>
+              <a:graphicFrameLocks xmlns:a="http://schemas.openxmlformats.org/drawingml/2006/main" noChangeAspect="1"/>
+            </wp:cNvGraphicFramePr>
+            <a:graphic xmlns:a="http://schemas.openxmlformats.org/drawingml/2006/main">
+              <a:graphicData uri="http://schemas.openxmlformats.org/drawingml/2006/picture">
+                <pic:pic xmlns:pic="http://schemas.openxmlformats.org/drawingml/2006/picture">
+                  <pic:nvPicPr>
+                    <pic:cNvPr id="0" name="" descr=""/>
+                    <pic:cNvPicPr>
+                      <a:picLocks noChangeAspect="1" noChangeArrowheads="1"/>
+                    </pic:cNvPicPr>
+                  </pic:nvPicPr>
+                  <pic:blipFill>
+                    <a:blip r:embed="rId12" cstate="none"/>
+                    <a:srcRect/>
+                    <a:stretch>
+                      <a:fillRect/>
+                    </a:stretch>
+                  </pic:blipFill>
+                  <pic:spPr bwMode="auto">
+                    <a:xfrm>
+                      <a:off x="0" y="0"/>
+                      <a:ext cx="5334000" cy="3838575"/>
+                    </a:xfrm>
+                    <a:prstGeom prst="rect">
+                      <a:avLst/>
+                    </a:prstGeom>
+                  </pic:spPr>
+                </pic:pic>
+              </a:graphicData>
+            </a:graphic>
+          </wp:inline>
+        </w:drawing>
+      </w:r>
+    </w:p>
+    <w:p>
+      <w:pPr>
+        <w:spacing w:after="240"/>
+        <w:jc w:val="center"/>
+      </w:pPr>
+      <w:r>
+        <w:rPr>
+          <w:rFonts w:ascii="Times New Roman" w:cs="Times New Roman" w:eastAsia="Times New Roman" w:hAnsi="Times New Roman"/>
+          <w:sz w:val="24"/>
+          <w:szCs w:val="24"/>
+        </w:rPr>
+        <w:t xml:space="preserve">Рисунок 5 — Диаграмма Ганта</w:t>
       </w:r>
     </w:p>
     <w:p>
@@ -2152,7 +2258,7 @@
           <w:sz w:val="28"/>
           <w:szCs w:val="28"/>
         </w:rPr>
-        <w:t xml:space="preserve">Данные сохраняются после каждого изменения в три CSV-файла в папке data: exams.csv (события), topics.csv (темы) и settings.csv (лимиты часов). Файл сначала пишется во временный, а потом подменяет старый, поэтому сбой посреди записи не оставит половину файла. Если файл повреждён, программа не падает: она переименовывает его в .bak, сообщает об этом и начинает с пустого плана.</w:t>
+        <w:t xml:space="preserve">Данные сохраняются после каждого изменения в три CSV-файла в папке data: exams.csv с событиями, topics.csv с темами и settings.csv с лимитами часов. Файл сначала пишется во временный, а потом подменяет старый, так что сбой посреди записи не оставит половину файла. Если файл повреждён, программа не падает. Она переименовывает его в .bak, говорит об этом и начинает с пустого плана.</w:t>
       </w:r>
     </w:p>
     <w:p>
@@ -2189,7 +2295,7 @@
           <w:sz w:val="28"/>
           <w:szCs w:val="28"/>
         </w:rPr>
-        <w:t xml:space="preserve">5.1. Классы и их методы</w:t>
+        <w:t xml:space="preserve">5.1. Классы и функции</w:t>
       </w:r>
       <w:bookmarkEnd w:id="12"/>
     </w:p>
@@ -2239,7 +2345,7 @@
                 <w:sz w:val="24"/>
                 <w:szCs w:val="24"/>
               </w:rPr>
-              <w:t xml:space="preserve">Класс / функция</w:t>
+              <w:t xml:space="preserve">Класс или функция</w:t>
             </w:r>
           </w:p>
         </w:tc>
@@ -2329,7 +2435,7 @@
                 <w:sz w:val="24"/>
                 <w:szCs w:val="24"/>
               </w:rPr>
-              <w:t xml:space="preserve">экзамен или контрольная: название, дата, тип; проверяет данные при создании</w:t>
+              <w:t xml:space="preserve">экзамен или контрольная, хранит название, дату и тип и сам проверяет данные при создании</w:t>
             </w:r>
           </w:p>
         </w:tc>
@@ -2389,7 +2495,7 @@
                 <w:sz w:val="24"/>
                 <w:szCs w:val="24"/>
               </w:rPr>
-              <w:t xml:space="preserve">тема: событие, название, сложность 1–5, статус, день планирования; свойство hours даёт часы</w:t>
+              <w:t xml:space="preserve">тема, хранит событие, название, сложность 1-5, статус и первый день в плане, свойство hours даёт часы</w:t>
             </w:r>
           </w:p>
         </w:tc>
@@ -2420,7 +2526,7 @@
                 <w:sz w:val="24"/>
                 <w:szCs w:val="24"/>
               </w:rPr>
-              <w:t xml:space="preserve">parse_date, parse_difficulty, clean_name</w:t>
+              <w:t xml:space="preserve">parse_date, next_date</w:t>
             </w:r>
           </w:p>
         </w:tc>
@@ -2449,7 +2555,7 @@
                 <w:sz w:val="24"/>
                 <w:szCs w:val="24"/>
               </w:rPr>
-              <w:t xml:space="preserve">проверяют и преобразуют введённые значения; при ошибке выбрасывают ValidationError</w:t>
+              <w:t xml:space="preserve">разбирают введённую дату, в том числе короткие «25» и «25.11», и ищут ближайшую будущую дату</w:t>
             </w:r>
           </w:p>
         </w:tc>
@@ -2480,7 +2586,7 @@
                 <w:sz w:val="24"/>
                 <w:szCs w:val="24"/>
               </w:rPr>
-              <w:t xml:space="preserve">Planner.add_exam, add_topic</w:t>
+              <w:t xml:space="preserve">parse_difficulty, clean_name</w:t>
             </w:r>
           </w:p>
         </w:tc>
@@ -2509,7 +2615,7 @@
                 <w:sz w:val="24"/>
                 <w:szCs w:val="24"/>
               </w:rPr>
-              <w:t xml:space="preserve">добавляют событие и тему с проверками (дата в будущем, повторы, существует ли событие)</w:t>
+              <w:t xml:space="preserve">проверяют сложность и название, при ошибке выбрасывают ValidationError</w:t>
             </w:r>
           </w:p>
         </w:tc>
@@ -2540,7 +2646,7 @@
                 <w:sz w:val="24"/>
                 <w:szCs w:val="24"/>
               </w:rPr>
-              <w:t xml:space="preserve">Planner.remove_exam, remove_topic</w:t>
+              <w:t xml:space="preserve">Planner.add_exam, add_topic</w:t>
             </w:r>
           </w:p>
         </w:tc>
@@ -2569,7 +2675,7 @@
                 <w:sz w:val="24"/>
                 <w:szCs w:val="24"/>
               </w:rPr>
-              <w:t xml:space="preserve">удаляют событие вместе с темами или одну тему</w:t>
+              <w:t xml:space="preserve">добавляют событие и тему с проверками (дата в будущем, повторы, есть ли такое событие)</w:t>
             </w:r>
           </w:p>
         </w:tc>
@@ -2600,7 +2706,7 @@
                 <w:sz w:val="24"/>
                 <w:szCs w:val="24"/>
               </w:rPr>
-              <w:t xml:space="preserve">Planner.set_difficulty, set_status</w:t>
+              <w:t xml:space="preserve">Planner.remove_exam, remove_topic</w:t>
             </w:r>
           </w:p>
         </w:tc>
@@ -2629,7 +2735,7 @@
                 <w:sz w:val="24"/>
                 <w:szCs w:val="24"/>
               </w:rPr>
-              <w:t xml:space="preserve">меняют сложность темы (в том числе на «авто») и статус «готово»</w:t>
+              <w:t xml:space="preserve">удаляют событие вместе с темами или одну тему</w:t>
             </w:r>
           </w:p>
         </w:tc>
@@ -2660,7 +2766,7 @@
                 <w:sz w:val="24"/>
                 <w:szCs w:val="24"/>
               </w:rPr>
-              <w:t xml:space="preserve">Planner.set_daily_limit, set_max_chunk</w:t>
+              <w:t xml:space="preserve">Planner.set_difficulty, set_status</w:t>
             </w:r>
           </w:p>
         </w:tc>
@@ -2689,7 +2795,7 @@
                 <w:sz w:val="24"/>
                 <w:szCs w:val="24"/>
               </w:rPr>
-              <w:t xml:space="preserve">задают лимит часов в день и часов одной темы в день, проверяя диапазон</w:t>
+              <w:t xml:space="preserve">меняют сложность темы (в том числе на «авто») и статус «готово»</w:t>
             </w:r>
           </w:p>
         </w:tc>
@@ -2720,7 +2826,7 @@
                 <w:sz w:val="24"/>
                 <w:szCs w:val="24"/>
               </w:rPr>
-              <w:t xml:space="preserve">Planner.build_plan</w:t>
+              <w:t xml:space="preserve">Planner.set_daily_limit, set_max_chunk</w:t>
             </w:r>
           </w:p>
         </w:tc>
@@ -2749,7 +2855,7 @@
                 <w:sz w:val="24"/>
                 <w:szCs w:val="24"/>
               </w:rPr>
-              <w:t xml:space="preserve">строит словарь плана {дата: [(событие, тема, часы)]} и возвращает темы, не поместившиеся в срок</w:t>
+              <w:t xml:space="preserve">задают лимит часов в день и часов одной темы в день, проверяя границы</w:t>
             </w:r>
           </w:p>
         </w:tc>
@@ -2780,7 +2886,7 @@
                 <w:sz w:val="24"/>
                 <w:szCs w:val="24"/>
               </w:rPr>
-              <w:t xml:space="preserve">Planner.replan</w:t>
+              <w:t xml:space="preserve">Planner.build_plan</w:t>
             </w:r>
           </w:p>
         </w:tc>
@@ -2809,7 +2915,7 @@
                 <w:sz w:val="24"/>
                 <w:szCs w:val="24"/>
               </w:rPr>
-              <w:t xml:space="preserve">находит пропущенные темы, строит план заново и возвращает (перенесённые, под угрозой)</w:t>
+              <w:t xml:space="preserve">строит словарь плана {дата: [(событие, тема, часы)]} и возвращает темы, которые не поместились</w:t>
             </w:r>
           </w:p>
         </w:tc>
@@ -2840,7 +2946,7 @@
                 <w:sz w:val="24"/>
                 <w:szCs w:val="24"/>
               </w:rPr>
-              <w:t xml:space="preserve">Planner.day_load</w:t>
+              <w:t xml:space="preserve">Planner.replan</w:t>
             </w:r>
           </w:p>
         </w:tc>
@@ -2869,7 +2975,7 @@
                 <w:sz w:val="24"/>
                 <w:szCs w:val="24"/>
               </w:rPr>
-              <w:t xml:space="preserve">считает сумму часов за день для цвета в календаре</w:t>
+              <w:t xml:space="preserve">находит пропущенные темы, строит план заново и возвращает (перенесённые, под угрозой)</w:t>
             </w:r>
           </w:p>
         </w:tc>
@@ -2900,7 +3006,7 @@
                 <w:sz w:val="24"/>
                 <w:szCs w:val="24"/>
               </w:rPr>
-              <w:t xml:space="preserve">estimate_difficulty (estimator.py)</w:t>
+              <w:t xml:space="preserve">Planner.day_load</w:t>
             </w:r>
           </w:p>
         </w:tc>
@@ -2929,7 +3035,7 @@
                 <w:sz w:val="24"/>
                 <w:szCs w:val="24"/>
               </w:rPr>
-              <w:t xml:space="preserve">оценивает сложность по названию предмета и темы с помощью словарей</w:t>
+              <w:t xml:space="preserve">считает сумму часов за день, от неё зависит цвет в календаре</w:t>
             </w:r>
           </w:p>
         </w:tc>
@@ -2960,7 +3066,7 @@
                 <w:sz w:val="24"/>
                 <w:szCs w:val="24"/>
               </w:rPr>
-              <w:t xml:space="preserve">subjects, topics_for (catalog.py)</w:t>
+              <w:t xml:space="preserve">estimate_difficulty</w:t>
             </w:r>
           </w:p>
         </w:tc>
@@ -2989,7 +3095,7 @@
                 <w:sz w:val="24"/>
                 <w:szCs w:val="24"/>
               </w:rPr>
-              <w:t xml:space="preserve">отдают списки предметов и типовых тем для выпадающих списков</w:t>
+              <w:t xml:space="preserve">оценивает сложность по названиям с помощью двух словарей</w:t>
             </w:r>
           </w:p>
         </w:tc>
@@ -3020,7 +3126,7 @@
                 <w:sz w:val="24"/>
                 <w:szCs w:val="24"/>
               </w:rPr>
-              <w:t xml:space="preserve">Storage.save, Storage.load</w:t>
+              <w:t xml:space="preserve">subjects, topics_for</w:t>
             </w:r>
           </w:p>
         </w:tc>
@@ -3049,7 +3155,7 @@
                 <w:sz w:val="24"/>
                 <w:szCs w:val="24"/>
               </w:rPr>
-              <w:t xml:space="preserve">пишут и читают CSV; если файлы повреждены, делают копию .bak и начинают с пустого плана</w:t>
+              <w:t xml:space="preserve">дают списки предметов и готовых тем для выпадающих списков</w:t>
             </w:r>
           </w:p>
         </w:tc>
@@ -3080,7 +3186,7 @@
                 <w:sz w:val="24"/>
                 <w:szCs w:val="24"/>
               </w:rPr>
-              <w:t xml:space="preserve">gantt_rows (ganttview.py)</w:t>
+              <w:t xml:space="preserve">Storage.save, Storage.load</w:t>
             </w:r>
           </w:p>
         </w:tc>
@@ -3109,7 +3215,7 @@
                 <w:sz w:val="24"/>
                 <w:szCs w:val="24"/>
               </w:rPr>
-              <w:t xml:space="preserve">готовит строки диаграммы: период каждой темы, выполненные и не поместившиеся темы</w:t>
+              <w:t xml:space="preserve">пишут и читают CSV, а если файлы повреждены, делают копию .bak и начинают с пустого плана</w:t>
             </w:r>
           </w:p>
         </w:tc>
@@ -3140,7 +3246,7 @@
                 <w:sz w:val="24"/>
                 <w:szCs w:val="24"/>
               </w:rPr>
-              <w:t xml:space="preserve">month_weeks, shift_month, load_color</w:t>
+              <w:t xml:space="preserve">gantt_rows</w:t>
             </w:r>
           </w:p>
         </w:tc>
@@ -3169,7 +3275,7 @@
                 <w:sz w:val="24"/>
                 <w:szCs w:val="24"/>
               </w:rPr>
-              <w:t xml:space="preserve">дают сетку месяца, переход между месяцами и цвет клетки по нагрузке</w:t>
+              <w:t xml:space="preserve">готовит строки диаграммы: период каждой темы, выполненные и не поместившиеся темы</w:t>
             </w:r>
           </w:p>
         </w:tc>
@@ -3200,7 +3306,7 @@
                 <w:sz w:val="24"/>
                 <w:szCs w:val="24"/>
               </w:rPr>
-              <w:t xml:space="preserve">App, GanttChart, MultiTopicDialog (ui)</w:t>
+              <w:t xml:space="preserve">month_weeks, shift_month, load_color</w:t>
             </w:r>
           </w:p>
         </w:tc>
@@ -3229,7 +3335,7 @@
                 <w:sz w:val="24"/>
                 <w:szCs w:val="24"/>
               </w:rPr>
-              <w:t xml:space="preserve">главное окно, диаграмма Ганта на Canvas и диалог выбора нескольких тем</w:t>
+              <w:t xml:space="preserve">дают сетку месяца, переход между месяцами и цвет клетки по нагрузке</w:t>
             </w:r>
           </w:p>
         </w:tc>
@@ -3260,6 +3366,126 @@
                 <w:sz w:val="24"/>
                 <w:szCs w:val="24"/>
               </w:rPr>
+              <w:t xml:space="preserve">App, GanttChart, DatePicker, MultiTopicDialog</w:t>
+            </w:r>
+          </w:p>
+        </w:tc>
+        <w:tc>
+          <w:tcPr>
+            <w:tcW w:type="dxa" w:w="5755"/>
+            <w:tcBorders>
+              <w:top w:val="single" w:color="999999" w:sz="4"/>
+              <w:left w:val="single" w:color="999999" w:sz="4"/>
+              <w:bottom w:val="single" w:color="999999" w:sz="4"/>
+              <w:right w:val="single" w:color="999999" w:sz="4"/>
+            </w:tcBorders>
+            <w:tcMar>
+              <w:top w:type="dxa" w:w="60"/>
+              <w:left w:type="dxa" w:w="100"/>
+              <w:bottom w:type="dxa" w:w="60"/>
+              <w:right w:type="dxa" w:w="100"/>
+            </w:tcMar>
+          </w:tcPr>
+          <w:p>
+            <w:r>
+              <w:rPr>
+                <w:rFonts w:ascii="Times New Roman" w:cs="Times New Roman" w:eastAsia="Times New Roman" w:hAnsi="Times New Roman"/>
+                <w:b w:val="false"/>
+                <w:bCs w:val="false"/>
+                <w:sz w:val="24"/>
+                <w:szCs w:val="24"/>
+              </w:rPr>
+              <w:t xml:space="preserve">главное окно, диаграмма на Canvas, календарь выбора даты и окно выбора нескольких тем</w:t>
+            </w:r>
+          </w:p>
+        </w:tc>
+      </w:tr>
+      <w:tr>
+        <w:tc>
+          <w:tcPr>
+            <w:tcW w:type="dxa" w:w="3600"/>
+            <w:tcBorders>
+              <w:top w:val="single" w:color="999999" w:sz="4"/>
+              <w:left w:val="single" w:color="999999" w:sz="4"/>
+              <w:bottom w:val="single" w:color="999999" w:sz="4"/>
+              <w:right w:val="single" w:color="999999" w:sz="4"/>
+            </w:tcBorders>
+            <w:tcMar>
+              <w:top w:type="dxa" w:w="60"/>
+              <w:left w:type="dxa" w:w="100"/>
+              <w:bottom w:type="dxa" w:w="60"/>
+              <w:right w:type="dxa" w:w="100"/>
+            </w:tcMar>
+          </w:tcPr>
+          <w:p>
+            <w:r>
+              <w:rPr>
+                <w:rFonts w:ascii="Times New Roman" w:cs="Times New Roman" w:eastAsia="Times New Roman" w:hAnsi="Times New Roman"/>
+                <w:b w:val="false"/>
+                <w:bCs w:val="false"/>
+                <w:sz w:val="24"/>
+                <w:szCs w:val="24"/>
+              </w:rPr>
+              <w:t xml:space="preserve">HintEntry, HintCombobox</w:t>
+            </w:r>
+          </w:p>
+        </w:tc>
+        <w:tc>
+          <w:tcPr>
+            <w:tcW w:type="dxa" w:w="5755"/>
+            <w:tcBorders>
+              <w:top w:val="single" w:color="999999" w:sz="4"/>
+              <w:left w:val="single" w:color="999999" w:sz="4"/>
+              <w:bottom w:val="single" w:color="999999" w:sz="4"/>
+              <w:right w:val="single" w:color="999999" w:sz="4"/>
+            </w:tcBorders>
+            <w:tcMar>
+              <w:top w:type="dxa" w:w="60"/>
+              <w:left w:type="dxa" w:w="100"/>
+              <w:bottom w:type="dxa" w:w="60"/>
+              <w:right w:type="dxa" w:w="100"/>
+            </w:tcMar>
+          </w:tcPr>
+          <w:p>
+            <w:r>
+              <w:rPr>
+                <w:rFonts w:ascii="Times New Roman" w:cs="Times New Roman" w:eastAsia="Times New Roman" w:hAnsi="Times New Roman"/>
+                <w:b w:val="false"/>
+                <w:bCs w:val="false"/>
+                <w:sz w:val="24"/>
+                <w:szCs w:val="24"/>
+              </w:rPr>
+              <w:t xml:space="preserve">поля с серой подсказкой внутри</w:t>
+            </w:r>
+          </w:p>
+        </w:tc>
+      </w:tr>
+      <w:tr>
+        <w:tc>
+          <w:tcPr>
+            <w:tcW w:type="dxa" w:w="3600"/>
+            <w:tcBorders>
+              <w:top w:val="single" w:color="999999" w:sz="4"/>
+              <w:left w:val="single" w:color="999999" w:sz="4"/>
+              <w:bottom w:val="single" w:color="999999" w:sz="4"/>
+              <w:right w:val="single" w:color="999999" w:sz="4"/>
+            </w:tcBorders>
+            <w:tcMar>
+              <w:top w:type="dxa" w:w="60"/>
+              <w:left w:type="dxa" w:w="100"/>
+              <w:bottom w:type="dxa" w:w="60"/>
+              <w:right w:type="dxa" w:w="100"/>
+            </w:tcMar>
+          </w:tcPr>
+          <w:p>
+            <w:r>
+              <w:rPr>
+                <w:rFonts w:ascii="Times New Roman" w:cs="Times New Roman" w:eastAsia="Times New Roman" w:hAnsi="Times New Roman"/>
+                <w:b w:val="false"/>
+                <w:bCs w:val="false"/>
+                <w:sz w:val="24"/>
+                <w:szCs w:val="24"/>
+              </w:rPr>
               <w:t xml:space="preserve">PlannerError, ValidationError, StorageError</w:t>
             </w:r>
           </w:p>
@@ -3289,7 +3515,7 @@
                 <w:sz w:val="24"/>
                 <w:szCs w:val="24"/>
               </w:rPr>
-              <w:t xml:space="preserve">наши исключения: ошибки ввода и ошибки работы с файлами</w:t>
+              <w:t xml:space="preserve">наши исключения, одно на ошибки ввода и одно на ошибки с файлами</w:t>
             </w:r>
           </w:p>
         </w:tc>
@@ -3315,7 +3541,7 @@
           <w:sz w:val="28"/>
           <w:szCs w:val="28"/>
         </w:rPr>
-        <w:t xml:space="preserve">5.2. Алгоритм построения плана</w:t>
+        <w:t xml:space="preserve">5.2. Как строится план</w:t>
       </w:r>
       <w:bookmarkEnd w:id="13"/>
     </w:p>
@@ -3331,7 +3557,7 @@
           <w:sz w:val="28"/>
           <w:szCs w:val="28"/>
         </w:rPr>
-        <w:t xml:space="preserve">Метод build_plan работает так. Сначала собираются закрытые для учёбы дни: дни событий и дни перед ними. На день перед каждым событием ставится повторение. Потом события обходятся по возрастанию даты. Для каждого события выбираются учебные дни от сегодняшнего до дня за два дня до события, в которых есть свободное время. Все часы события (сумма часов его тем) равномерно раскладываются на эти дни: k-й час попадает в день с номером floor((k + 0.5) · число дней / число часов). Так занятия растягиваются на весь срок, а не копятся в первых днях. Темы идут по убыванию сложности, часы каждого дня отдаются им по очереди, но не больше лимита на тему в день. Если из-за лимитов часть часов не встала, она ставится в самые свободные дни срока. Что не поместилось даже так, попадает в список «под угрозой».</w:t>
+        <w:t xml:space="preserve">Сначала метод build_plan собирает закрытые для учёбы дни, это дни событий и дни перед ними. На день перед каждым событием ставится повторение. Потом события обходятся по порядку, от ближайшего. Для каждого берутся учебные дни от сегодняшнего до дня за два дня до события, где ещё есть свободное время. Все часы события, то есть сумма часов его тем, раскладываются на эти дни поровну: k-й час попадает в день с номером floor((k + 0.5) · число дней / число часов). Из-за этого занятия растягиваются на весь срок и не собираются в первых днях. Темы идут от сложных к лёгким, часы каждого дня отдаются им по очереди, но не больше лимита на тему. Если из-за лимитов часть часов не встала, она ставится в самые свободные дни. А что не влезло и так, попадает в список «под угрозой».</w:t>
       </w:r>
     </w:p>
     <w:p>
@@ -3466,7 +3692,7 @@
           <w:sz w:val="22"/>
           <w:szCs w:val="22"/>
         </w:rPr>
-        <w:t xml:space="preserve">    остаток -&gt; в самые свободные дни; что не влезло -&gt; «под угрозой»</w:t>
+        <w:t xml:space="preserve">    остаток -&gt; в самые свободные дни, что не влезло -&gt; «под угрозой»</w:t>
       </w:r>
     </w:p>
     <w:p>
@@ -3481,7 +3707,7 @@
           <w:sz w:val="28"/>
           <w:szCs w:val="28"/>
         </w:rPr>
-        <w:t xml:space="preserve">План лежит в словаре: ключ — дата, значение — список кортежей (событие, тема, часы). Такая структура удобна и календарю (сумма часов по ключу), и диаграмме (первый и последний день темы).</w:t>
+        <w:t xml:space="preserve">Сам план лежит в словаре: ключ это дата, значение это список кортежей (событие, тема, часы). Такая форма удобна и календарю (сумма часов по ключу), и диаграмме (первый и последний день темы).</w:t>
       </w:r>
     </w:p>
     <w:p>
@@ -3499,7 +3725,7 @@
           <w:sz w:val="28"/>
           <w:szCs w:val="28"/>
         </w:rPr>
-        <w:t xml:space="preserve">5.3. Автоподбор сложности</w:t>
+        <w:t xml:space="preserve">5.3. Подбор сложности</w:t>
       </w:r>
       <w:bookmarkEnd w:id="14"/>
     </w:p>
@@ -3515,7 +3741,7 @@
           <w:sz w:val="28"/>
           <w:szCs w:val="28"/>
         </w:rPr>
-        <w:t xml:space="preserve">Функция estimate_difficulty использует два словаря. В первом лежит базовая сложность предмета по основе слова («математ» — 4, «литератур» — 2, «физкультур» — 1), для незнакомого предмета берётся 3. Во втором — поправки по словам в названии темы («введени» даёт минус 2, «основ» минус 1, «теорем» плюс 1). Итог ограничивается числами от 1 до 5.</w:t>
+        <w:t xml:space="preserve">Функция estimate_difficulty работает с двумя словарями. В первом лежит базовая сложность предмета по куску слова («математ» это 4, «литератур» это 2, «физкультур» это 1), а для незнакомого предмета берётся 3. Во втором лежат поправки по словам в названии темы («введени» даёт минус 2, «основ» минус 1, «теорем» плюс 1). Итог всегда держится между 1 и 5.</w:t>
       </w:r>
     </w:p>
     <w:p>
@@ -3549,7 +3775,7 @@
           <w:sz w:val="28"/>
           <w:szCs w:val="28"/>
         </w:rPr>
-        <w:t xml:space="preserve">Проверки ввода выбрасывают наши собственные исключения: ValidationError (неверная дата, пустое название, сложность вне диапазона, повтор) и StorageError (не удалось записать файл). Оба наследуются от PlannerError. В окне действия выполняются внутри try, а ошибка показывается сообщением в диалоге, так что программа не вылетает.</w:t>
+        <w:t xml:space="preserve">Проверки ввода выбрасывают наши исключения. ValidationError появляется при неверной дате, пустом названии, сложности вне границ или повторе, а StorageError, если файл не удалось записать. Оба наследуются от PlannerError. В окне действие пользователя выполняется внутри try, и если случилась наша ошибка, она показывается в диалоге, а программа продолжает работать.</w:t>
       </w:r>
     </w:p>
     <w:p>
@@ -3672,7 +3898,7 @@
           <w:sz w:val="32"/>
           <w:szCs w:val="32"/>
         </w:rPr>
-        <w:t xml:space="preserve">6. Соответствие требованиям задания</w:t>
+        <w:t xml:space="preserve">6. Что требовалось и что сделано</w:t>
       </w:r>
       <w:bookmarkEnd w:id="16"/>
     </w:p>
@@ -3752,7 +3978,7 @@
                 <w:sz w:val="24"/>
                 <w:szCs w:val="24"/>
               </w:rPr>
-              <w:t xml:space="preserve">Что сделано</w:t>
+              <w:t xml:space="preserve">Что у нас</w:t>
             </w:r>
           </w:p>
         </w:tc>
@@ -3812,7 +4038,7 @@
                 <w:sz w:val="24"/>
                 <w:szCs w:val="24"/>
               </w:rPr>
-              <w:t xml:space="preserve">собственные исключения, try/except в окне и при работе с файлами, битые файлы не ломают программу</w:t>
+              <w:t xml:space="preserve">свои исключения, try/except в окне и при работе с файлами, битые файлы программу не ломают</w:t>
             </w:r>
           </w:p>
         </w:tc>
@@ -3872,7 +4098,7 @@
                 <w:sz w:val="24"/>
                 <w:szCs w:val="24"/>
               </w:rPr>
-              <w:t xml:space="preserve">план {дата: [занятия]}, словари основ предметов и поправок сложности, каталог предметов и тем, события и темы в словарях класса Planner</w:t>
+              <w:t xml:space="preserve">план {дата: [занятия]}, два словаря для подбора сложности, каталог предметов и тем, события и темы в словарях Planner</w:t>
             </w:r>
           </w:p>
         </w:tc>
@@ -3932,7 +4158,7 @@
                 <w:sz w:val="24"/>
                 <w:szCs w:val="24"/>
               </w:rPr>
-              <w:t xml:space="preserve">классы Exam, Topic, Planner, Storage, App, GanttChart, MultiTopicDialog и иерархия исключений</w:t>
+              <w:t xml:space="preserve">классы Exam, Topic, Planner, Storage, App, GanttChart, DatePicker, MultiTopicDialog и свои исключения</w:t>
             </w:r>
           </w:p>
         </w:tc>
@@ -4052,7 +4278,7 @@
                 <w:sz w:val="24"/>
                 <w:szCs w:val="24"/>
               </w:rPr>
-              <w:t xml:space="preserve">файлы CSV (базу данных не использовали)</w:t>
+              <w:t xml:space="preserve">файлы CSV, базу данных не использовали</w:t>
             </w:r>
           </w:p>
         </w:tc>
@@ -4083,7 +4309,7 @@
                 <w:sz w:val="24"/>
                 <w:szCs w:val="24"/>
               </w:rPr>
-              <w:t xml:space="preserve">Сверх задания</w:t>
+              <w:t xml:space="preserve">Дополнительно</w:t>
             </w:r>
           </w:p>
         </w:tc>
@@ -4112,7 +4338,7 @@
                 <w:sz w:val="24"/>
                 <w:szCs w:val="24"/>
               </w:rPr>
-              <w:t xml:space="preserve">автоподбор сложности, контрольные работы, выпадающие списки</w:t>
+              <w:t xml:space="preserve">подбор сложности, контрольные работы, выпадающие списки, календарь для выбора даты</w:t>
             </w:r>
           </w:p>
         </w:tc>
@@ -4149,7 +4375,7 @@
           <w:sz w:val="28"/>
           <w:szCs w:val="28"/>
         </w:rPr>
-        <w:t xml:space="preserve">Ниже реальные примеры ввода и вывода программы (дата «сегодня» взята 01.10.2026).</w:t>
+        <w:t xml:space="preserve">Ниже настоящие примеры ввода и вывода (дата «сегодня» взята 01.10.2026).</w:t>
       </w:r>
     </w:p>
     <w:tbl>
@@ -4851,7 +5077,7 @@
           <w:sz w:val="28"/>
           <w:szCs w:val="28"/>
         </w:rPr>
-        <w:t xml:space="preserve">Построенный план для двух событий: экзамен по математике 11.10 и контрольная по физике 06.10 (лимит 4 часа в день, не больше 2 часов одной темы):</w:t>
+        <w:t xml:space="preserve">План для двух событий, экзамена по математике 11.10 и контрольной по физике 06.10 (лимит 4 часа в день, не больше 2 часов одной темы):</w:t>
       </w:r>
     </w:p>
     <w:p>
@@ -5016,7 +5242,7 @@
           <w:sz w:val="28"/>
           <w:szCs w:val="28"/>
         </w:rPr>
-        <w:t xml:space="preserve">Перепланирование через 3 дня, когда пользователь отстал:</w:t>
+        <w:t xml:space="preserve">Перепланирование через 3 дня, когда человек отстал:</w:t>
       </w:r>
     </w:p>
     <w:p>
@@ -5052,40 +5278,62 @@
     <w:p>
       <w:pPr>
         <w:keepNext/>
-        <w:pBdr>
-          <w:top w:val="single" w:color="999999" w:sz="4"/>
-          <w:left w:val="single" w:color="999999" w:sz="4"/>
-          <w:bottom w:val="single" w:color="999999" w:sz="4"/>
-          <w:right w:val="single" w:color="999999" w:sz="4"/>
-        </w:pBdr>
-        <w:shd w:fill="F3F4F6" w:val="clear"/>
         <w:spacing w:after="60" w:before="120"/>
         <w:jc w:val="center"/>
       </w:pPr>
       <w:r>
-        <w:rPr>
-          <w:rFonts w:ascii="Times New Roman" w:cs="Times New Roman" w:eastAsia="Times New Roman" w:hAnsi="Times New Roman"/>
-          <w:i/>
-          <w:iCs/>
-          <w:color w:val="666666"/>
+        <w:drawing>
+          <wp:inline distT="0" distB="0" distL="0" distR="0">
+            <wp:extent cx="2857500" cy="1800225"/>
+            <wp:effectExtent t="0" r="0" b="0" l="0"/>
+            <wp:docPr id="6" name="04_error.png" descr="Сообщение об ошибке при неверной дате" title="Сообщение об ошибке при неверной дате"/>
+            <wp:cNvGraphicFramePr>
+              <a:graphicFrameLocks xmlns:a="http://schemas.openxmlformats.org/drawingml/2006/main" noChangeAspect="1"/>
+            </wp:cNvGraphicFramePr>
+            <a:graphic xmlns:a="http://schemas.openxmlformats.org/drawingml/2006/main">
+              <a:graphicData uri="http://schemas.openxmlformats.org/drawingml/2006/picture">
+                <pic:pic xmlns:pic="http://schemas.openxmlformats.org/drawingml/2006/picture">
+                  <pic:nvPicPr>
+                    <pic:cNvPr id="0" name="" descr=""/>
+                    <pic:cNvPicPr>
+                      <a:picLocks noChangeAspect="1" noChangeArrowheads="1"/>
+                    </pic:cNvPicPr>
+                  </pic:nvPicPr>
+                  <pic:blipFill>
+                    <a:blip r:embed="rId13" cstate="none"/>
+                    <a:srcRect/>
+                    <a:stretch>
+                      <a:fillRect/>
+                    </a:stretch>
+                  </pic:blipFill>
+                  <pic:spPr bwMode="auto">
+                    <a:xfrm>
+                      <a:off x="0" y="0"/>
+                      <a:ext cx="2857500" cy="1800225"/>
+                    </a:xfrm>
+                    <a:prstGeom prst="rect">
+                      <a:avLst/>
+                    </a:prstGeom>
+                  </pic:spPr>
+                </pic:pic>
+              </a:graphicData>
+            </a:graphic>
+          </wp:inline>
+        </w:drawing>
+      </w:r>
+    </w:p>
+    <w:p>
+      <w:pPr>
+        <w:spacing w:after="240"/>
+        <w:jc w:val="center"/>
+      </w:pPr>
+      <w:r>
+        <w:rPr>
+          <w:rFonts w:ascii="Times New Roman" w:cs="Times New Roman" w:eastAsia="Times New Roman" w:hAnsi="Times New Roman"/>
           <w:sz w:val="24"/>
           <w:szCs w:val="24"/>
         </w:rPr>
-        <w:t xml:space="preserve">[Здесь будет скриншот: 04_error.png]</w:t>
-      </w:r>
-    </w:p>
-    <w:p>
-      <w:pPr>
-        <w:spacing w:after="240"/>
-        <w:jc w:val="center"/>
-      </w:pPr>
-      <w:r>
-        <w:rPr>
-          <w:rFonts w:ascii="Times New Roman" w:cs="Times New Roman" w:eastAsia="Times New Roman" w:hAnsi="Times New Roman"/>
-          <w:sz w:val="24"/>
-          <w:szCs w:val="24"/>
-        </w:rPr>
-        <w:t xml:space="preserve">Рисунок 5 — Сообщение об ошибке при вводе неверной даты</w:t>
+        <w:t xml:space="preserve">Рисунок 6 — Сообщение об ошибке при неверной дате</w:t>
       </w:r>
     </w:p>
     <w:p>
@@ -5119,7 +5367,7 @@
           <w:sz w:val="28"/>
           <w:szCs w:val="28"/>
         </w:rPr>
-        <w:t xml:space="preserve">Код проекта лежит в репозитории на GitHub: https://github.com/leywinkw/exam-planner (публичный репозиторий).</w:t>
+        <w:t xml:space="preserve">Код лежит в репозитории на GitHub: https://github.com/leywinkw/exam-planner.</w:t>
       </w:r>
     </w:p>
     <w:p>
@@ -5164,7 +5412,7 @@
           <w:sz w:val="28"/>
           <w:szCs w:val="28"/>
         </w:rPr>
-        <w:t xml:space="preserve">Нужен Python 3.9 или новее с tkinter (он есть в стандартной установке).</w:t>
+        <w:t xml:space="preserve">Нужен Python 3.9 или новее с tkinter, он есть в обычной установке.</w:t>
       </w:r>
     </w:p>
     <w:p>
@@ -5198,7 +5446,7 @@
           <w:sz w:val="28"/>
           <w:szCs w:val="28"/>
         </w:rPr>
-        <w:t xml:space="preserve">Мы сделали планировщик подготовки к экзаменам. Он принимает экзамены и контрольные с темами, сам подбирает сложность, раскладывает темы по дням с учётом лимитов, пересчитывает план, когда человек отстаёт, и показывает результат в календаре и на диаграмме Ганта. Требования курса (ошибки, словари, ООП) и четвёртый критерий (визуализация) выполнены, данные лежат в CSV. Что можно добавить дальше: редактирование записей, напоминания о занятиях и экспорт плана в календарь.</w:t>
+        <w:t xml:space="preserve">Мы сделали планировщик подготовки к экзаменам. Он принимает экзамены и контрольные с темами, сам подбирает сложность, раскладывает занятия по дням до самой даты, пересчитывает план, когда человек отстаёт, и показывает всё в календаре и на диаграмме Ганта. Обязательные пункты задания (ошибки, словари, ООП) и визуализация сделаны, данные лежат в CSV. Дальше можно добавить редактирование записей, напоминания о занятиях и экспорт плана в обычный календарь.</w:t>
       </w:r>
     </w:p>
     <w:p>

</xml_diff>

<commit_message>
Fix surname (Саладзе), remove project number, clearer title slide
Co-Authored-By: Claude Sonnet 5.5 <noreply@anthropic.com>
</commit_message>
<xml_diff>
--- a/docs/Отчёт_Планировщик_экзаменов.docx
+++ b/docs/Отчёт_Планировщик_экзаменов.docx
@@ -34,7 +34,7 @@
     </w:p>
     <w:p>
       <w:pPr>
-        <w:spacing w:after="100"/>
+        <w:spacing w:after="2000"/>
         <w:jc w:val="center"/>
       </w:pPr>
       <w:r>
@@ -50,8 +50,8 @@
     </w:p>
     <w:p>
       <w:pPr>
-        <w:spacing w:after="2000"/>
-        <w:jc w:val="center"/>
+        <w:spacing w:after="80"/>
+        <w:jc w:val="right"/>
       </w:pPr>
       <w:r>
         <w:rPr>
@@ -59,7 +59,7 @@
           <w:sz w:val="28"/>
           <w:szCs w:val="28"/>
         </w:rPr>
-        <w:t xml:space="preserve">(проект № 60)</w:t>
+        <w:t xml:space="preserve">Выполнили:</w:t>
       </w:r>
     </w:p>
     <w:p>
@@ -73,12 +73,12 @@
           <w:sz w:val="28"/>
           <w:szCs w:val="28"/>
         </w:rPr>
-        <w:t xml:space="preserve">Выполнили:</w:t>
-      </w:r>
-    </w:p>
-    <w:p>
-      <w:pPr>
-        <w:spacing w:after="80"/>
+        <w:t xml:space="preserve">Дибривный Павел, группа ИСТ04</w:t>
+      </w:r>
+    </w:p>
+    <w:p>
+      <w:pPr>
+        <w:spacing w:after="240"/>
         <w:jc w:val="right"/>
       </w:pPr>
       <w:r>
@@ -87,21 +87,7 @@
           <w:sz w:val="28"/>
           <w:szCs w:val="28"/>
         </w:rPr>
-        <w:t xml:space="preserve">Дибривный Павел, группа ИСТ04</w:t>
-      </w:r>
-    </w:p>
-    <w:p>
-      <w:pPr>
-        <w:spacing w:after="240"/>
-        <w:jc w:val="right"/>
-      </w:pPr>
-      <w:r>
-        <w:rPr>
-          <w:rFonts w:ascii="Times New Roman" w:cs="Times New Roman" w:eastAsia="Times New Roman" w:hAnsi="Times New Roman"/>
-          <w:sz w:val="28"/>
-          <w:szCs w:val="28"/>
-        </w:rPr>
-        <w:t xml:space="preserve">Салазде Георгий, группа ИСТ03</w:t>
+        <w:t xml:space="preserve">Саладзе Георгий, группа ИСТ03</w:t>
       </w:r>
     </w:p>
     <w:p>

</xml_diff>

<commit_message>
Add patronymics to the authors
Co-Authored-By: Claude Sonnet 5.5 <noreply@anthropic.com>
</commit_message>
<xml_diff>
--- a/docs/Отчёт_Планировщик_экзаменов.docx
+++ b/docs/Отчёт_Планировщик_экзаменов.docx
@@ -73,7 +73,7 @@
           <w:sz w:val="28"/>
           <w:szCs w:val="28"/>
         </w:rPr>
-        <w:t xml:space="preserve">Дибривный Павел, группа ИСТ04</w:t>
+        <w:t xml:space="preserve">Дибривный Павел Александрович, группа ИСТ04</w:t>
       </w:r>
     </w:p>
     <w:p>
@@ -87,7 +87,7 @@
           <w:sz w:val="28"/>
           <w:szCs w:val="28"/>
         </w:rPr>
-        <w:t xml:space="preserve">Саладзе Георгий, группа ИСТ03</w:t>
+        <w:t xml:space="preserve">Саладзе Георгий Давидович, группа ИСТ03</w:t>
       </w:r>
     </w:p>
     <w:p>

</xml_diff>